<commit_message>
Passwortregeln zeigen ihren Zustand, nicht nur ihren Text
Ein Satz "Mindestens acht Zeichen" sagt nicht, ob man sie schon hat. Jetzt
zwei Zeilen mit je einem Zeichen davor: offen (grauer Punkt), erfuellt
(gruener Haken), verletzt (rotes Kreuz). Beide Bedingungen wechseln
unabhaengig voneinander, geprueft ueber alle fuenf Zustaende.

Offen bleibt grau, auch wenn das Feld leer ist: wer noch nicht getippt hat,
hat nichts falsch gemacht, und ein rotes Kreuz auf einem leeren Feld
schimpft ohne Anlass.

Beide Zeilen sofort auch auf Englisch.

Co-Authored-By: Claude Opus 5 <noreply@anthropic.com>
</commit_message>
<xml_diff>
--- a/texte/SmartVoc-Texte-Deutsch_v3.docx
+++ b/texte/SmartVoc-Texte-Deutsch_v3.docx
@@ -31517,7 +31517,7 @@
         <w:spacing w:after="120" w:before="260"/>
       </w:pPr>
       <w:r>
-        <w:t xml:space="preserve">Konto  (34)</w:t>
+        <w:t xml:space="preserve">Konto  (33)</w:t>
       </w:r>
     </w:p>
     <w:tbl>
@@ -31845,6 +31845,57 @@
                 <w:sz w:val="21"/>
                 <w:szCs w:val="21"/>
               </w:rPr>
+              <w:t xml:space="preserve">Beide Eingaben stimmen überein</w:t>
+            </w:r>
+          </w:p>
+        </w:tc>
+      </w:tr>
+      <w:tr>
+        <w:tc>
+          <w:tcPr>
+            <w:tcW w:type="dxa" w:w="1120"/>
+            <w:tcMar>
+              <w:top w:type="dxa" w:w="60"/>
+              <w:left w:type="dxa" w:w="90"/>
+              <w:bottom w:type="dxa" w:w="60"/>
+              <w:right w:type="dxa" w:w="90"/>
+            </w:tcMar>
+          </w:tcPr>
+          <w:p>
+            <w:pPr>
+              <w:spacing w:after="0"/>
+            </w:pPr>
+            <w:r>
+              <w:rPr>
+                <w:rFonts w:ascii="Consolas" w:cs="Consolas" w:eastAsia="Consolas" w:hAnsi="Consolas"/>
+                <w:color w:val="9A958B"/>
+                <w:sz w:val="15"/>
+                <w:szCs w:val="15"/>
+              </w:rPr>
+              <w:t xml:space="preserve">B-484</w:t>
+            </w:r>
+          </w:p>
+        </w:tc>
+        <w:tc>
+          <w:tcPr>
+            <w:tcW w:type="dxa" w:w="7880"/>
+            <w:tcMar>
+              <w:top w:type="dxa" w:w="60"/>
+              <w:left w:type="dxa" w:w="90"/>
+              <w:bottom w:type="dxa" w:w="60"/>
+              <w:right w:type="dxa" w:w="90"/>
+            </w:tcMar>
+          </w:tcPr>
+          <w:p>
+            <w:pPr>
+              <w:spacing w:after="0" w:before="0"/>
+            </w:pPr>
+            <w:r>
+              <w:rPr>
+                <w:rFonts w:ascii="Calibri" w:cs="Calibri" w:eastAsia="Calibri" w:hAnsi="Calibri"/>
+                <w:sz w:val="21"/>
+                <w:szCs w:val="21"/>
+              </w:rPr>
               <w:t xml:space="preserve">dein Konto</w:t>
             </w:r>
           </w:p>
@@ -31872,7 +31923,7 @@
                 <w:sz w:val="15"/>
                 <w:szCs w:val="15"/>
               </w:rPr>
-              <w:t xml:space="preserve">B-484</w:t>
+              <w:t xml:space="preserve">B-485</w:t>
             </w:r>
           </w:p>
         </w:tc>
@@ -31923,57 +31974,6 @@
                 <w:sz w:val="15"/>
                 <w:szCs w:val="15"/>
               </w:rPr>
-              <w:t xml:space="preserve">B-485</w:t>
-            </w:r>
-          </w:p>
-        </w:tc>
-        <w:tc>
-          <w:tcPr>
-            <w:tcW w:type="dxa" w:w="7880"/>
-            <w:tcMar>
-              <w:top w:type="dxa" w:w="60"/>
-              <w:left w:type="dxa" w:w="90"/>
-              <w:bottom w:type="dxa" w:w="60"/>
-              <w:right w:type="dxa" w:w="90"/>
-            </w:tcMar>
-          </w:tcPr>
-          <w:p>
-            <w:pPr>
-              <w:spacing w:after="0" w:before="0"/>
-            </w:pPr>
-            <w:r>
-              <w:rPr>
-                <w:rFonts w:ascii="Calibri" w:cs="Calibri" w:eastAsia="Calibri" w:hAnsi="Calibri"/>
-                <w:sz w:val="21"/>
-                <w:szCs w:val="21"/>
-              </w:rPr>
-              <w:t xml:space="preserve">Die beiden Passwörter stimmen nicht überein.</w:t>
-            </w:r>
-          </w:p>
-        </w:tc>
-      </w:tr>
-      <w:tr>
-        <w:tc>
-          <w:tcPr>
-            <w:tcW w:type="dxa" w:w="1120"/>
-            <w:tcMar>
-              <w:top w:type="dxa" w:w="60"/>
-              <w:left w:type="dxa" w:w="90"/>
-              <w:bottom w:type="dxa" w:w="60"/>
-              <w:right w:type="dxa" w:w="90"/>
-            </w:tcMar>
-          </w:tcPr>
-          <w:p>
-            <w:pPr>
-              <w:spacing w:after="0"/>
-            </w:pPr>
-            <w:r>
-              <w:rPr>
-                <w:rFonts w:ascii="Consolas" w:cs="Consolas" w:eastAsia="Consolas" w:hAnsi="Consolas"/>
-                <w:color w:val="9A958B"/>
-                <w:sz w:val="15"/>
-                <w:szCs w:val="15"/>
-              </w:rPr>
               <w:t xml:space="preserve">B-486</w:t>
             </w:r>
           </w:p>
@@ -32202,6 +32202,57 @@
                 <w:sz w:val="21"/>
                 <w:szCs w:val="21"/>
               </w:rPr>
+              <w:t xml:space="preserve">Mindestens {n} Zeichen</w:t>
+            </w:r>
+          </w:p>
+        </w:tc>
+      </w:tr>
+      <w:tr>
+        <w:tc>
+          <w:tcPr>
+            <w:tcW w:type="dxa" w:w="1120"/>
+            <w:tcMar>
+              <w:top w:type="dxa" w:w="60"/>
+              <w:left w:type="dxa" w:w="90"/>
+              <w:bottom w:type="dxa" w:w="60"/>
+              <w:right w:type="dxa" w:w="90"/>
+            </w:tcMar>
+          </w:tcPr>
+          <w:p>
+            <w:pPr>
+              <w:spacing w:after="0"/>
+            </w:pPr>
+            <w:r>
+              <w:rPr>
+                <w:rFonts w:ascii="Consolas" w:cs="Consolas" w:eastAsia="Consolas" w:hAnsi="Consolas"/>
+                <w:color w:val="9A958B"/>
+                <w:sz w:val="15"/>
+                <w:szCs w:val="15"/>
+              </w:rPr>
+              <w:t xml:space="preserve">B-491</w:t>
+            </w:r>
+          </w:p>
+        </w:tc>
+        <w:tc>
+          <w:tcPr>
+            <w:tcW w:type="dxa" w:w="7880"/>
+            <w:tcMar>
+              <w:top w:type="dxa" w:w="60"/>
+              <w:left w:type="dxa" w:w="90"/>
+              <w:bottom w:type="dxa" w:w="60"/>
+              <w:right w:type="dxa" w:w="90"/>
+            </w:tcMar>
+          </w:tcPr>
+          <w:p>
+            <w:pPr>
+              <w:spacing w:after="0" w:before="0"/>
+            </w:pPr>
+            <w:r>
+              <w:rPr>
+                <w:rFonts w:ascii="Calibri" w:cs="Calibri" w:eastAsia="Calibri" w:hAnsi="Calibri"/>
+                <w:sz w:val="21"/>
+                <w:szCs w:val="21"/>
+              </w:rPr>
               <w:t xml:space="preserve">Mindestens {n} Zeichen.</w:t>
             </w:r>
           </w:p>
@@ -32229,57 +32280,6 @@
                 <w:sz w:val="15"/>
                 <w:szCs w:val="15"/>
               </w:rPr>
-              <w:t xml:space="preserve">B-491</w:t>
-            </w:r>
-          </w:p>
-        </w:tc>
-        <w:tc>
-          <w:tcPr>
-            <w:tcW w:type="dxa" w:w="7880"/>
-            <w:tcMar>
-              <w:top w:type="dxa" w:w="60"/>
-              <w:left w:type="dxa" w:w="90"/>
-              <w:bottom w:type="dxa" w:w="60"/>
-              <w:right w:type="dxa" w:w="90"/>
-            </w:tcMar>
-          </w:tcPr>
-          <w:p>
-            <w:pPr>
-              <w:spacing w:after="0" w:before="0"/>
-            </w:pPr>
-            <w:r>
-              <w:rPr>
-                <w:rFonts w:ascii="Calibri" w:cs="Calibri" w:eastAsia="Calibri" w:hAnsi="Calibri"/>
-                <w:sz w:val="21"/>
-                <w:szCs w:val="21"/>
-              </w:rPr>
-              <w:t xml:space="preserve">Mindestens {n} Zeichen. Länger ist besser als kompliziert.</w:t>
-            </w:r>
-          </w:p>
-        </w:tc>
-      </w:tr>
-      <w:tr>
-        <w:tc>
-          <w:tcPr>
-            <w:tcW w:type="dxa" w:w="1120"/>
-            <w:tcMar>
-              <w:top w:type="dxa" w:w="60"/>
-              <w:left w:type="dxa" w:w="90"/>
-              <w:bottom w:type="dxa" w:w="60"/>
-              <w:right w:type="dxa" w:w="90"/>
-            </w:tcMar>
-          </w:tcPr>
-          <w:p>
-            <w:pPr>
-              <w:spacing w:after="0"/>
-            </w:pPr>
-            <w:r>
-              <w:rPr>
-                <w:rFonts w:ascii="Consolas" w:cs="Consolas" w:eastAsia="Consolas" w:hAnsi="Consolas"/>
-                <w:color w:val="9A958B"/>
-                <w:sz w:val="15"/>
-                <w:szCs w:val="15"/>
-              </w:rPr>
               <w:t xml:space="preserve">B-492</w:t>
             </w:r>
           </w:p>
@@ -32559,7 +32559,7 @@
                 <w:sz w:val="21"/>
                 <w:szCs w:val="21"/>
               </w:rPr>
-              <w:t xml:space="preserve">Noch zu kurz: mindestens {n} Zeichen.</w:t>
+              <w:t xml:space="preserve">Nur auf diesem Gerät</w:t>
             </w:r>
           </w:p>
         </w:tc>
@@ -32610,7 +32610,7 @@
                 <w:sz w:val="21"/>
                 <w:szCs w:val="21"/>
               </w:rPr>
-              <w:t xml:space="preserve">Nur auf diesem Gerät</w:t>
+              <w:t xml:space="preserve">Ohne Netz, wird nachgeholt</w:t>
             </w:r>
           </w:p>
         </w:tc>
@@ -32661,7 +32661,7 @@
                 <w:sz w:val="21"/>
                 <w:szCs w:val="21"/>
               </w:rPr>
-              <w:t xml:space="preserve">Ohne Netz, wird nachgeholt</w:t>
+              <w:t xml:space="preserve">Passwort</w:t>
             </w:r>
           </w:p>
         </w:tc>
@@ -32712,7 +32712,7 @@
                 <w:sz w:val="21"/>
                 <w:szCs w:val="21"/>
               </w:rPr>
-              <w:t xml:space="preserve">Passwort</w:t>
+              <w:t xml:space="preserve">Passwort geändert</w:t>
             </w:r>
           </w:p>
         </w:tc>
@@ -32763,7 +32763,7 @@
                 <w:sz w:val="21"/>
                 <w:szCs w:val="21"/>
               </w:rPr>
-              <w:t xml:space="preserve">Passwort geändert</w:t>
+              <w:t xml:space="preserve">Passwort speichern</w:t>
             </w:r>
           </w:p>
         </w:tc>
@@ -32814,7 +32814,7 @@
                 <w:sz w:val="21"/>
                 <w:szCs w:val="21"/>
               </w:rPr>
-              <w:t xml:space="preserve">Passwort speichern</w:t>
+              <w:t xml:space="preserve">Passwort vergessen?</w:t>
             </w:r>
           </w:p>
         </w:tc>
@@ -32865,7 +32865,7 @@
                 <w:sz w:val="21"/>
                 <w:szCs w:val="21"/>
               </w:rPr>
-              <w:t xml:space="preserve">Passwort vergessen?</w:t>
+              <w:t xml:space="preserve">Passwort wiederholen</w:t>
             </w:r>
           </w:p>
         </w:tc>
@@ -32916,7 +32916,7 @@
                 <w:sz w:val="21"/>
                 <w:szCs w:val="21"/>
               </w:rPr>
-              <w:t xml:space="preserve">Passwort wiederholen</w:t>
+              <w:t xml:space="preserve">Passwort zurücksetzen</w:t>
             </w:r>
           </w:p>
         </w:tc>
@@ -32967,7 +32967,7 @@
                 <w:sz w:val="21"/>
                 <w:szCs w:val="21"/>
               </w:rPr>
-              <w:t xml:space="preserve">Passwort zurücksetzen</w:t>
+              <w:t xml:space="preserve">Passwörter stimmen nicht überein.</w:t>
             </w:r>
           </w:p>
         </w:tc>
@@ -33018,7 +33018,7 @@
                 <w:sz w:val="21"/>
                 <w:szCs w:val="21"/>
               </w:rPr>
-              <w:t xml:space="preserve">Passwörter stimmen nicht überein.</w:t>
+              <w:t xml:space="preserve">Registrieren</w:t>
             </w:r>
           </w:p>
         </w:tc>
@@ -33069,7 +33069,7 @@
                 <w:sz w:val="21"/>
                 <w:szCs w:val="21"/>
               </w:rPr>
-              <w:t xml:space="preserve">Registrieren</w:t>
+              <w:t xml:space="preserve">Schon registriert? Anmelden</w:t>
             </w:r>
           </w:p>
         </w:tc>
@@ -33120,7 +33120,7 @@
                 <w:sz w:val="21"/>
                 <w:szCs w:val="21"/>
               </w:rPr>
-              <w:t xml:space="preserve">Schon registriert? Anmelden</w:t>
+              <w:t xml:space="preserve">Setze ein neues Passwort für {wer}.</w:t>
             </w:r>
           </w:p>
         </w:tc>
@@ -33171,7 +33171,7 @@
                 <w:sz w:val="21"/>
                 <w:szCs w:val="21"/>
               </w:rPr>
-              <w:t xml:space="preserve">Setze ein neues Passwort für {wer}.</w:t>
+              <w:t xml:space="preserve">Wenn es zu dieser Adresse ein Konto gibt, ist ein Link zum Zurücksetzen unterwegs. Öffne ihn auf diesem Gerät.</w:t>
             </w:r>
           </w:p>
         </w:tc>
@@ -33222,7 +33222,7 @@
                 <w:sz w:val="21"/>
                 <w:szCs w:val="21"/>
               </w:rPr>
-              <w:t xml:space="preserve">Wenn es zu dieser Adresse ein Konto gibt, ist ein Link zum Zurücksetzen unterwegs. Öffne ihn auf diesem Gerät.</w:t>
+              <w:t xml:space="preserve">Wir schicken dir einen Link, mit dem du ein neues Passwort setzen kannst.</w:t>
             </w:r>
           </w:p>
         </w:tc>
@@ -33250,57 +33250,6 @@
                 <w:szCs w:val="15"/>
               </w:rPr>
               <w:t xml:space="preserve">B-511</w:t>
-            </w:r>
-          </w:p>
-        </w:tc>
-        <w:tc>
-          <w:tcPr>
-            <w:tcW w:type="dxa" w:w="7880"/>
-            <w:tcMar>
-              <w:top w:type="dxa" w:w="60"/>
-              <w:left w:type="dxa" w:w="90"/>
-              <w:bottom w:type="dxa" w:w="60"/>
-              <w:right w:type="dxa" w:w="90"/>
-            </w:tcMar>
-          </w:tcPr>
-          <w:p>
-            <w:pPr>
-              <w:spacing w:after="0" w:before="0"/>
-            </w:pPr>
-            <w:r>
-              <w:rPr>
-                <w:rFonts w:ascii="Calibri" w:cs="Calibri" w:eastAsia="Calibri" w:hAnsi="Calibri"/>
-                <w:sz w:val="21"/>
-                <w:szCs w:val="21"/>
-              </w:rPr>
-              <w:t xml:space="preserve">Wir schicken dir einen Link, mit dem du ein neues Passwort setzen kannst.</w:t>
-            </w:r>
-          </w:p>
-        </w:tc>
-      </w:tr>
-      <w:tr>
-        <w:tc>
-          <w:tcPr>
-            <w:tcW w:type="dxa" w:w="1120"/>
-            <w:tcMar>
-              <w:top w:type="dxa" w:w="60"/>
-              <w:left w:type="dxa" w:w="90"/>
-              <w:bottom w:type="dxa" w:w="60"/>
-              <w:right w:type="dxa" w:w="90"/>
-            </w:tcMar>
-          </w:tcPr>
-          <w:p>
-            <w:pPr>
-              <w:spacing w:after="0"/>
-            </w:pPr>
-            <w:r>
-              <w:rPr>
-                <w:rFonts w:ascii="Consolas" w:cs="Consolas" w:eastAsia="Consolas" w:hAnsi="Consolas"/>
-                <w:color w:val="9A958B"/>
-                <w:sz w:val="15"/>
-                <w:szCs w:val="15"/>
-              </w:rPr>
-              <w:t xml:space="preserve">B-512</w:t>
             </w:r>
           </w:p>
         </w:tc>
@@ -33449,6 +33398,57 @@
                 <w:sz w:val="15"/>
                 <w:szCs w:val="15"/>
               </w:rPr>
+              <w:t xml:space="preserve">B-512</w:t>
+            </w:r>
+          </w:p>
+        </w:tc>
+        <w:tc>
+          <w:tcPr>
+            <w:tcW w:type="dxa" w:w="7880"/>
+            <w:tcMar>
+              <w:top w:type="dxa" w:w="60"/>
+              <w:left w:type="dxa" w:w="90"/>
+              <w:bottom w:type="dxa" w:w="60"/>
+              <w:right w:type="dxa" w:w="90"/>
+            </w:tcMar>
+          </w:tcPr>
+          <w:p>
+            <w:pPr>
+              <w:spacing w:after="0" w:before="0"/>
+            </w:pPr>
+            <w:r>
+              <w:rPr>
+                <w:rFonts w:ascii="Calibri" w:cs="Calibri" w:eastAsia="Calibri" w:hAnsi="Calibri"/>
+                <w:sz w:val="21"/>
+                <w:szCs w:val="21"/>
+              </w:rPr>
+              <w:t xml:space="preserve">Anleitung</w:t>
+            </w:r>
+          </w:p>
+        </w:tc>
+      </w:tr>
+      <w:tr>
+        <w:tc>
+          <w:tcPr>
+            <w:tcW w:type="dxa" w:w="1120"/>
+            <w:tcMar>
+              <w:top w:type="dxa" w:w="60"/>
+              <w:left w:type="dxa" w:w="90"/>
+              <w:bottom w:type="dxa" w:w="60"/>
+              <w:right w:type="dxa" w:w="90"/>
+            </w:tcMar>
+          </w:tcPr>
+          <w:p>
+            <w:pPr>
+              <w:spacing w:after="0"/>
+            </w:pPr>
+            <w:r>
+              <w:rPr>
+                <w:rFonts w:ascii="Consolas" w:cs="Consolas" w:eastAsia="Consolas" w:hAnsi="Consolas"/>
+                <w:color w:val="9A958B"/>
+                <w:sz w:val="15"/>
+                <w:szCs w:val="15"/>
+              </w:rPr>
               <w:t xml:space="preserve">B-513</w:t>
             </w:r>
           </w:p>
@@ -33473,7 +33473,7 @@
                 <w:sz w:val="21"/>
                 <w:szCs w:val="21"/>
               </w:rPr>
-              <w:t xml:space="preserve">Anleitung</w:t>
+              <w:t xml:space="preserve">Dahinter</w:t>
             </w:r>
           </w:p>
         </w:tc>
@@ -33524,7 +33524,7 @@
                 <w:sz w:val="21"/>
                 <w:szCs w:val="21"/>
               </w:rPr>
-              <w:t xml:space="preserve">Dahinter</w:t>
+              <w:t xml:space="preserve">Hilfe</w:t>
             </w:r>
           </w:p>
         </w:tc>
@@ -33552,57 +33552,6 @@
                 <w:szCs w:val="15"/>
               </w:rPr>
               <w:t xml:space="preserve">B-515</w:t>
-            </w:r>
-          </w:p>
-        </w:tc>
-        <w:tc>
-          <w:tcPr>
-            <w:tcW w:type="dxa" w:w="7880"/>
-            <w:tcMar>
-              <w:top w:type="dxa" w:w="60"/>
-              <w:left w:type="dxa" w:w="90"/>
-              <w:bottom w:type="dxa" w:w="60"/>
-              <w:right w:type="dxa" w:w="90"/>
-            </w:tcMar>
-          </w:tcPr>
-          <w:p>
-            <w:pPr>
-              <w:spacing w:after="0" w:before="0"/>
-            </w:pPr>
-            <w:r>
-              <w:rPr>
-                <w:rFonts w:ascii="Calibri" w:cs="Calibri" w:eastAsia="Calibri" w:hAnsi="Calibri"/>
-                <w:sz w:val="21"/>
-                <w:szCs w:val="21"/>
-              </w:rPr>
-              <w:t xml:space="preserve">Hilfe</w:t>
-            </w:r>
-          </w:p>
-        </w:tc>
-      </w:tr>
-      <w:tr>
-        <w:tc>
-          <w:tcPr>
-            <w:tcW w:type="dxa" w:w="1120"/>
-            <w:tcMar>
-              <w:top w:type="dxa" w:w="60"/>
-              <w:left w:type="dxa" w:w="90"/>
-              <w:bottom w:type="dxa" w:w="60"/>
-              <w:right w:type="dxa" w:w="90"/>
-            </w:tcMar>
-          </w:tcPr>
-          <w:p>
-            <w:pPr>
-              <w:spacing w:after="0"/>
-            </w:pPr>
-            <w:r>
-              <w:rPr>
-                <w:rFonts w:ascii="Consolas" w:cs="Consolas" w:eastAsia="Consolas" w:hAnsi="Consolas"/>
-                <w:color w:val="9A958B"/>
-                <w:sz w:val="15"/>
-                <w:szCs w:val="15"/>
-              </w:rPr>
-              <w:t xml:space="preserve">B-516</w:t>
             </w:r>
           </w:p>
         </w:tc>
@@ -33751,6 +33700,57 @@
                 <w:sz w:val="15"/>
                 <w:szCs w:val="15"/>
               </w:rPr>
+              <w:t xml:space="preserve">B-516</w:t>
+            </w:r>
+          </w:p>
+        </w:tc>
+        <w:tc>
+          <w:tcPr>
+            <w:tcW w:type="dxa" w:w="7880"/>
+            <w:tcMar>
+              <w:top w:type="dxa" w:w="60"/>
+              <w:left w:type="dxa" w:w="90"/>
+              <w:bottom w:type="dxa" w:w="60"/>
+              <w:right w:type="dxa" w:w="90"/>
+            </w:tcMar>
+          </w:tcPr>
+          <w:p>
+            <w:pPr>
+              <w:spacing w:after="0" w:before="0"/>
+            </w:pPr>
+            <w:r>
+              <w:rPr>
+                <w:rFonts w:ascii="Calibri" w:cs="Calibri" w:eastAsia="Calibri" w:hAnsi="Calibri"/>
+                <w:sz w:val="21"/>
+                <w:szCs w:val="21"/>
+              </w:rPr>
+              <w:t xml:space="preserve">Datenschutz</w:t>
+            </w:r>
+          </w:p>
+        </w:tc>
+      </w:tr>
+      <w:tr>
+        <w:tc>
+          <w:tcPr>
+            <w:tcW w:type="dxa" w:w="1120"/>
+            <w:tcMar>
+              <w:top w:type="dxa" w:w="60"/>
+              <w:left w:type="dxa" w:w="90"/>
+              <w:bottom w:type="dxa" w:w="60"/>
+              <w:right w:type="dxa" w:w="90"/>
+            </w:tcMar>
+          </w:tcPr>
+          <w:p>
+            <w:pPr>
+              <w:spacing w:after="0"/>
+            </w:pPr>
+            <w:r>
+              <w:rPr>
+                <w:rFonts w:ascii="Consolas" w:cs="Consolas" w:eastAsia="Consolas" w:hAnsi="Consolas"/>
+                <w:color w:val="9A958B"/>
+                <w:sz w:val="15"/>
+                <w:szCs w:val="15"/>
+              </w:rPr>
               <w:t xml:space="preserve">B-517</w:t>
             </w:r>
           </w:p>
@@ -33775,7 +33775,7 @@
                 <w:sz w:val="21"/>
                 <w:szCs w:val="21"/>
               </w:rPr>
-              <w:t xml:space="preserve">Datenschutz</w:t>
+              <w:t xml:space="preserve">Dieselbe Erklärung im Web:</w:t>
             </w:r>
           </w:p>
         </w:tc>
@@ -33803,57 +33803,6 @@
                 <w:szCs w:val="15"/>
               </w:rPr>
               <w:t xml:space="preserve">B-518</w:t>
-            </w:r>
-          </w:p>
-        </w:tc>
-        <w:tc>
-          <w:tcPr>
-            <w:tcW w:type="dxa" w:w="7880"/>
-            <w:tcMar>
-              <w:top w:type="dxa" w:w="60"/>
-              <w:left w:type="dxa" w:w="90"/>
-              <w:bottom w:type="dxa" w:w="60"/>
-              <w:right w:type="dxa" w:w="90"/>
-            </w:tcMar>
-          </w:tcPr>
-          <w:p>
-            <w:pPr>
-              <w:spacing w:after="0" w:before="0"/>
-            </w:pPr>
-            <w:r>
-              <w:rPr>
-                <w:rFonts w:ascii="Calibri" w:cs="Calibri" w:eastAsia="Calibri" w:hAnsi="Calibri"/>
-                <w:sz w:val="21"/>
-                <w:szCs w:val="21"/>
-              </w:rPr>
-              <w:t xml:space="preserve">Dieselbe Erklärung im Web:</w:t>
-            </w:r>
-          </w:p>
-        </w:tc>
-      </w:tr>
-      <w:tr>
-        <w:tc>
-          <w:tcPr>
-            <w:tcW w:type="dxa" w:w="1120"/>
-            <w:tcMar>
-              <w:top w:type="dxa" w:w="60"/>
-              <w:left w:type="dxa" w:w="90"/>
-              <w:bottom w:type="dxa" w:w="60"/>
-              <w:right w:type="dxa" w:w="90"/>
-            </w:tcMar>
-          </w:tcPr>
-          <w:p>
-            <w:pPr>
-              <w:spacing w:after="0"/>
-            </w:pPr>
-            <w:r>
-              <w:rPr>
-                <w:rFonts w:ascii="Consolas" w:cs="Consolas" w:eastAsia="Consolas" w:hAnsi="Consolas"/>
-                <w:color w:val="9A958B"/>
-                <w:sz w:val="15"/>
-                <w:szCs w:val="15"/>
-              </w:rPr>
-              <w:t xml:space="preserve">B-519</w:t>
             </w:r>
           </w:p>
         </w:tc>
@@ -34002,6 +33951,57 @@
                 <w:sz w:val="15"/>
                 <w:szCs w:val="15"/>
               </w:rPr>
+              <w:t xml:space="preserve">B-519</w:t>
+            </w:r>
+          </w:p>
+        </w:tc>
+        <w:tc>
+          <w:tcPr>
+            <w:tcW w:type="dxa" w:w="7880"/>
+            <w:tcMar>
+              <w:top w:type="dxa" w:w="60"/>
+              <w:left w:type="dxa" w:w="90"/>
+              <w:bottom w:type="dxa" w:w="60"/>
+              <w:right w:type="dxa" w:w="90"/>
+            </w:tcMar>
+          </w:tcPr>
+          <w:p>
+            <w:pPr>
+              <w:spacing w:after="0" w:before="0"/>
+            </w:pPr>
+            <w:r>
+              <w:rPr>
+                <w:rFonts w:ascii="Calibri" w:cs="Calibri" w:eastAsia="Calibri" w:hAnsi="Calibri"/>
+                <w:sz w:val="21"/>
+                <w:szCs w:val="21"/>
+              </w:rPr>
+              <w:t xml:space="preserve">(Latein ohne Artikel, dafür mit Stammformen)</w:t>
+            </w:r>
+          </w:p>
+        </w:tc>
+      </w:tr>
+      <w:tr>
+        <w:tc>
+          <w:tcPr>
+            <w:tcW w:type="dxa" w:w="1120"/>
+            <w:tcMar>
+              <w:top w:type="dxa" w:w="60"/>
+              <w:left w:type="dxa" w:w="90"/>
+              <w:bottom w:type="dxa" w:w="60"/>
+              <w:right w:type="dxa" w:w="90"/>
+            </w:tcMar>
+          </w:tcPr>
+          <w:p>
+            <w:pPr>
+              <w:spacing w:after="0"/>
+            </w:pPr>
+            <w:r>
+              <w:rPr>
+                <w:rFonts w:ascii="Consolas" w:cs="Consolas" w:eastAsia="Consolas" w:hAnsi="Consolas"/>
+                <w:color w:val="9A958B"/>
+                <w:sz w:val="15"/>
+                <w:szCs w:val="15"/>
+              </w:rPr>
               <w:t xml:space="preserve">B-520</w:t>
             </w:r>
           </w:p>
@@ -34026,7 +34026,7 @@
                 <w:sz w:val="21"/>
                 <w:szCs w:val="21"/>
               </w:rPr>
-              <w:t xml:space="preserve">(Latein ohne Artikel, dafür mit Stammformen)</w:t>
+              <w:t xml:space="preserve">Aus Zwischenablage</w:t>
             </w:r>
           </w:p>
         </w:tc>
@@ -34077,7 +34077,7 @@
                 <w:sz w:val="21"/>
                 <w:szCs w:val="21"/>
               </w:rPr>
-              <w:t xml:space="preserve">Aus Zwischenablage</w:t>
+              <w:t xml:space="preserve">canis | canis, canis, m. | Nomen | der Hund liber | liber, librī, m. | Nomen | das Buch</w:t>
             </w:r>
           </w:p>
         </w:tc>
@@ -34128,7 +34128,7 @@
                 <w:sz w:val="21"/>
                 <w:szCs w:val="21"/>
               </w:rPr>
-              <w:t xml:space="preserve">canis | canis, canis, m. | Nomen | der Hund liber | liber, librī, m. | Nomen | das Buch</w:t>
+              <w:t xml:space="preserve">das Stichwort noch einmal, mit Längenzeichen über den langen Vokalen (amicus → amīcus). Keine Lautschrift.</w:t>
             </w:r>
           </w:p>
         </w:tc>
@@ -34179,7 +34179,7 @@
                 <w:sz w:val="21"/>
                 <w:szCs w:val="21"/>
               </w:rPr>
-              <w:t xml:space="preserve">das Stichwort noch einmal, mit Längenzeichen über den langen Vokalen (amicus → amīcus). Keine Lautschrift.</w:t>
+              <w:t xml:space="preserve">Die App kommt nicht an die Zwischenablage. Füg den Text von Hand ein.</w:t>
             </w:r>
           </w:p>
         </w:tc>
@@ -34230,7 +34230,7 @@
                 <w:sz w:val="21"/>
                 <w:szCs w:val="21"/>
               </w:rPr>
-              <w:t xml:space="preserve">Die App kommt nicht an die Zwischenablage. Füg den Text von Hand ein.</w:t>
+              <w:t xml:space="preserve">dog | der Hund cat | die Katze</w:t>
             </w:r>
           </w:p>
         </w:tc>
@@ -34281,7 +34281,7 @@
                 <w:sz w:val="21"/>
                 <w:szCs w:val="21"/>
               </w:rPr>
-              <w:t xml:space="preserve">dog | der Hund cat | die Katze</w:t>
+              <w:t xml:space="preserve">Einfügen</w:t>
             </w:r>
           </w:p>
         </w:tc>
@@ -34332,7 +34332,7 @@
                 <w:sz w:val="21"/>
                 <w:szCs w:val="21"/>
               </w:rPr>
-              <w:t xml:space="preserve">Einfügen</w:t>
+              <w:t xml:space="preserve">el perro | der Hund la casa | das Haus</w:t>
             </w:r>
           </w:p>
         </w:tc>
@@ -34383,7 +34383,7 @@
                 <w:sz w:val="21"/>
                 <w:szCs w:val="21"/>
               </w:rPr>
-              <w:t xml:space="preserve">el perro | der Hund la casa | das Haus</w:t>
+              <w:t xml:space="preserve">Formen = die Stammformen (Nomen: Nominativ, Genitiv, Genus; Verb: die vier Stammformen; Deponens: drei; Adjektiv: die drei Genusformen). Bei unveränderlichen Wörtern leer.</w:t>
             </w:r>
           </w:p>
         </w:tc>
@@ -34434,7 +34434,7 @@
                 <w:sz w:val="21"/>
                 <w:szCs w:val="21"/>
               </w:rPr>
-              <w:t xml:space="preserve">Formen = die Stammformen (Nomen: Nominativ, Genitiv, Genus; Verb: die vier Stammformen; Deponens: drei; Adjektiv: die drei Genusformen). Bei unveränderlichen Wörtern leer.</w:t>
+              <w:t xml:space="preserve">il cane | der Hund la casa | das Haus</w:t>
             </w:r>
           </w:p>
         </w:tc>
@@ -34485,7 +34485,7 @@
                 <w:sz w:val="21"/>
                 <w:szCs w:val="21"/>
               </w:rPr>
-              <w:t xml:space="preserve">il cane | der Hund la casa | das Haus</w:t>
+              <w:t xml:space="preserve">Im Englischen leer, außer bei Wörtern, die es nur im Plural gibt (pl).</w:t>
             </w:r>
           </w:p>
         </w:tc>
@@ -34536,7 +34536,7 @@
                 <w:sz w:val="21"/>
                 <w:szCs w:val="21"/>
               </w:rPr>
-              <w:t xml:space="preserve">Im Englischen leer, außer bei Wörtern, die es nur im Plural gibt (pl).</w:t>
+              <w:t xml:space="preserve">IPA-Lautschrift des Fremdworts, ohne Klammern, mit Betonungszeichen; beim Nomen ohne den Artikel.</w:t>
             </w:r>
           </w:p>
         </w:tc>
@@ -34587,7 +34587,7 @@
                 <w:sz w:val="21"/>
                 <w:szCs w:val="21"/>
               </w:rPr>
-              <w:t xml:space="preserve">IPA-Lautschrift des Fremdworts, ohne Klammern, mit Betonungszeichen; beim Nomen ohne den Artikel.</w:t>
+              <w:t xml:space="preserve">le chien | der Hund le chat | die Katze</w:t>
             </w:r>
           </w:p>
         </w:tc>
@@ -34638,7 +34638,7 @@
                 <w:sz w:val="21"/>
                 <w:szCs w:val="21"/>
               </w:rPr>
-              <w:t xml:space="preserve">le chien | der Hund le chat | die Katze</w:t>
+              <w:t xml:space="preserve">Nichts zum Kopieren? Mit dem Auftrag unten macht dir deine KI-App aus einem Foto deiner Heftseite eine fertige Liste.</w:t>
             </w:r>
           </w:p>
         </w:tc>
@@ -34689,7 +34689,7 @@
                 <w:sz w:val="21"/>
                 <w:szCs w:val="21"/>
               </w:rPr>
-              <w:t xml:space="preserve">Nichts zum Kopieren? Mit dem Auftrag unten macht dir deine KI-App aus einem Foto deiner Heftseite eine fertige Liste.</w:t>
+              <w:t xml:space="preserve">o cão | der Hund a casa | das Haus</w:t>
             </w:r>
           </w:p>
         </w:tc>
@@ -34740,7 +34740,7 @@
                 <w:sz w:val="21"/>
                 <w:szCs w:val="21"/>
               </w:rPr>
-              <w:t xml:space="preserve">o cão | der Hund a casa | das Haus</w:t>
+              <w:t xml:space="preserve">Weiter zum Prüfen</w:t>
             </w:r>
           </w:p>
         </w:tc>
@@ -34768,57 +34768,6 @@
                 <w:szCs w:val="15"/>
               </w:rPr>
               <w:t xml:space="preserve">B-535</w:t>
-            </w:r>
-          </w:p>
-        </w:tc>
-        <w:tc>
-          <w:tcPr>
-            <w:tcW w:type="dxa" w:w="7880"/>
-            <w:tcMar>
-              <w:top w:type="dxa" w:w="60"/>
-              <w:left w:type="dxa" w:w="90"/>
-              <w:bottom w:type="dxa" w:w="60"/>
-              <w:right w:type="dxa" w:w="90"/>
-            </w:tcMar>
-          </w:tcPr>
-          <w:p>
-            <w:pPr>
-              <w:spacing w:after="0" w:before="0"/>
-            </w:pPr>
-            <w:r>
-              <w:rPr>
-                <w:rFonts w:ascii="Calibri" w:cs="Calibri" w:eastAsia="Calibri" w:hAnsi="Calibri"/>
-                <w:sz w:val="21"/>
-                <w:szCs w:val="21"/>
-              </w:rPr>
-              <w:t xml:space="preserve">Weiter zum Prüfen</w:t>
-            </w:r>
-          </w:p>
-        </w:tc>
-      </w:tr>
-      <w:tr>
-        <w:tc>
-          <w:tcPr>
-            <w:tcW w:type="dxa" w:w="1120"/>
-            <w:tcMar>
-              <w:top w:type="dxa" w:w="60"/>
-              <w:left w:type="dxa" w:w="90"/>
-              <w:bottom w:type="dxa" w:w="60"/>
-              <w:right w:type="dxa" w:w="90"/>
-            </w:tcMar>
-          </w:tcPr>
-          <w:p>
-            <w:pPr>
-              <w:spacing w:after="0"/>
-            </w:pPr>
-            <w:r>
-              <w:rPr>
-                <w:rFonts w:ascii="Consolas" w:cs="Consolas" w:eastAsia="Consolas" w:hAnsi="Consolas"/>
-                <w:color w:val="9A958B"/>
-                <w:sz w:val="15"/>
-                <w:szCs w:val="15"/>
-              </w:rPr>
-              <w:t xml:space="preserve">B-536</w:t>
             </w:r>
           </w:p>
         </w:tc>
@@ -34967,6 +34916,57 @@
                 <w:sz w:val="15"/>
                 <w:szCs w:val="15"/>
               </w:rPr>
+              <w:t xml:space="preserve">B-536</w:t>
+            </w:r>
+          </w:p>
+        </w:tc>
+        <w:tc>
+          <w:tcPr>
+            <w:tcW w:type="dxa" w:w="7880"/>
+            <w:tcMar>
+              <w:top w:type="dxa" w:w="60"/>
+              <w:left w:type="dxa" w:w="90"/>
+              <w:bottom w:type="dxa" w:w="60"/>
+              <w:right w:type="dxa" w:w="90"/>
+            </w:tcMar>
+          </w:tcPr>
+          <w:p>
+            <w:pPr>
+              <w:spacing w:after="0" w:before="0"/>
+            </w:pPr>
+            <w:r>
+              <w:rPr>
+                <w:rFonts w:ascii="Calibri" w:cs="Calibri" w:eastAsia="Calibri" w:hAnsi="Calibri"/>
+                <w:sz w:val="21"/>
+                <w:szCs w:val="21"/>
+              </w:rPr>
+              <w:t xml:space="preserve">… auf {sprache}</w:t>
+            </w:r>
+          </w:p>
+        </w:tc>
+      </w:tr>
+      <w:tr>
+        <w:tc>
+          <w:tcPr>
+            <w:tcW w:type="dxa" w:w="1120"/>
+            <w:tcMar>
+              <w:top w:type="dxa" w:w="60"/>
+              <w:left w:type="dxa" w:w="90"/>
+              <w:bottom w:type="dxa" w:w="60"/>
+              <w:right w:type="dxa" w:w="90"/>
+            </w:tcMar>
+          </w:tcPr>
+          <w:p>
+            <w:pPr>
+              <w:spacing w:after="0"/>
+            </w:pPr>
+            <w:r>
+              <w:rPr>
+                <w:rFonts w:ascii="Consolas" w:cs="Consolas" w:eastAsia="Consolas" w:hAnsi="Consolas"/>
+                <w:color w:val="9A958B"/>
+                <w:sz w:val="15"/>
+                <w:szCs w:val="15"/>
+              </w:rPr>
               <w:t xml:space="preserve">B-537</w:t>
             </w:r>
           </w:p>
@@ -34991,7 +34991,7 @@
                 <w:sz w:val="21"/>
                 <w:szCs w:val="21"/>
               </w:rPr>
-              <w:t xml:space="preserve">… auf {sprache}</w:t>
+              <w:t xml:space="preserve">{n} Wort verwenden</w:t>
             </w:r>
           </w:p>
         </w:tc>
@@ -35042,7 +35042,7 @@
                 <w:sz w:val="21"/>
                 <w:szCs w:val="21"/>
               </w:rPr>
-              <w:t xml:space="preserve">{n} Wort verwenden</w:t>
+              <w:t xml:space="preserve">{n} Wörter verwenden</w:t>
             </w:r>
           </w:p>
         </w:tc>
@@ -35093,7 +35093,7 @@
                 <w:sz w:val="21"/>
                 <w:szCs w:val="21"/>
               </w:rPr>
-              <w:t xml:space="preserve">{n} Wörter verwenden</w:t>
+              <w:t xml:space="preserve">Aussprache</w:t>
             </w:r>
           </w:p>
         </w:tc>
@@ -35144,7 +35144,7 @@
                 <w:sz w:val="21"/>
                 <w:szCs w:val="21"/>
               </w:rPr>
-              <w:t xml:space="preserve">Aussprache</w:t>
+              <w:t xml:space="preserve">Geschlecht</w:t>
             </w:r>
           </w:p>
         </w:tc>
@@ -35195,7 +35195,7 @@
                 <w:sz w:val="21"/>
                 <w:szCs w:val="21"/>
               </w:rPr>
-              <w:t xml:space="preserve">Geschlecht</w:t>
+              <w:t xml:space="preserve">Grundform</w:t>
             </w:r>
           </w:p>
         </w:tc>
@@ -35246,7 +35246,7 @@
                 <w:sz w:val="21"/>
                 <w:szCs w:val="21"/>
               </w:rPr>
-              <w:t xml:space="preserve">Grundform</w:t>
+              <w:t xml:space="preserve">keine Angabe</w:t>
             </w:r>
           </w:p>
         </w:tc>
@@ -35297,7 +35297,7 @@
                 <w:sz w:val="21"/>
                 <w:szCs w:val="21"/>
               </w:rPr>
-              <w:t xml:space="preserve">keine Angabe</w:t>
+              <w:t xml:space="preserve">Mehrere Sätze mit / trennen</w:t>
             </w:r>
           </w:p>
         </w:tc>
@@ -35348,7 +35348,7 @@
                 <w:sz w:val="21"/>
                 <w:szCs w:val="21"/>
               </w:rPr>
-              <w:t xml:space="preserve">Mehrere Sätze mit / trennen</w:t>
+              <w:t xml:space="preserve">Übersetzungen, gleiche Reihenfolge, mit / trennen</w:t>
             </w:r>
           </w:p>
         </w:tc>
@@ -35399,7 +35399,7 @@
                 <w:sz w:val="21"/>
                 <w:szCs w:val="21"/>
               </w:rPr>
-              <w:t xml:space="preserve">Übersetzungen, gleiche Reihenfolge, mit / trennen</w:t>
+              <w:t xml:space="preserve">Wortart</w:t>
             </w:r>
           </w:p>
         </w:tc>
@@ -35450,7 +35450,7 @@
                 <w:sz w:val="21"/>
                 <w:szCs w:val="21"/>
               </w:rPr>
-              <w:t xml:space="preserve">Wortart</w:t>
+              <w:t xml:space="preserve">Wörter prüfen</w:t>
             </w:r>
           </w:p>
         </w:tc>
@@ -35478,57 +35478,6 @@
                 <w:szCs w:val="15"/>
               </w:rPr>
               <w:t xml:space="preserve">B-547</w:t>
-            </w:r>
-          </w:p>
-        </w:tc>
-        <w:tc>
-          <w:tcPr>
-            <w:tcW w:type="dxa" w:w="7880"/>
-            <w:tcMar>
-              <w:top w:type="dxa" w:w="60"/>
-              <w:left w:type="dxa" w:w="90"/>
-              <w:bottom w:type="dxa" w:w="60"/>
-              <w:right w:type="dxa" w:w="90"/>
-            </w:tcMar>
-          </w:tcPr>
-          <w:p>
-            <w:pPr>
-              <w:spacing w:after="0" w:before="0"/>
-            </w:pPr>
-            <w:r>
-              <w:rPr>
-                <w:rFonts w:ascii="Calibri" w:cs="Calibri" w:eastAsia="Calibri" w:hAnsi="Calibri"/>
-                <w:sz w:val="21"/>
-                <w:szCs w:val="21"/>
-              </w:rPr>
-              <w:t xml:space="preserve">Wörter prüfen</w:t>
-            </w:r>
-          </w:p>
-        </w:tc>
-      </w:tr>
-      <w:tr>
-        <w:tc>
-          <w:tcPr>
-            <w:tcW w:type="dxa" w:w="1120"/>
-            <w:tcMar>
-              <w:top w:type="dxa" w:w="60"/>
-              <w:left w:type="dxa" w:w="90"/>
-              <w:bottom w:type="dxa" w:w="60"/>
-              <w:right w:type="dxa" w:w="90"/>
-            </w:tcMar>
-          </w:tcPr>
-          <w:p>
-            <w:pPr>
-              <w:spacing w:after="0"/>
-            </w:pPr>
-            <w:r>
-              <w:rPr>
-                <w:rFonts w:ascii="Consolas" w:cs="Consolas" w:eastAsia="Consolas" w:hAnsi="Consolas"/>
-                <w:color w:val="9A958B"/>
-                <w:sz w:val="15"/>
-                <w:szCs w:val="15"/>
-              </w:rPr>
-              <w:t xml:space="preserve">B-548</w:t>
             </w:r>
           </w:p>
         </w:tc>
@@ -35677,6 +35626,57 @@
                 <w:sz w:val="15"/>
                 <w:szCs w:val="15"/>
               </w:rPr>
+              <w:t xml:space="preserve">B-548</w:t>
+            </w:r>
+          </w:p>
+        </w:tc>
+        <w:tc>
+          <w:tcPr>
+            <w:tcW w:type="dxa" w:w="7880"/>
+            <w:tcMar>
+              <w:top w:type="dxa" w:w="60"/>
+              <w:left w:type="dxa" w:w="90"/>
+              <w:bottom w:type="dxa" w:w="60"/>
+              <w:right w:type="dxa" w:w="90"/>
+            </w:tcMar>
+          </w:tcPr>
+          <w:p>
+            <w:pPr>
+              <w:spacing w:after="0" w:before="0"/>
+            </w:pPr>
+            <w:r>
+              <w:rPr>
+                <w:rFonts w:ascii="Calibri" w:cs="Calibri" w:eastAsia="Calibri" w:hAnsi="Calibri"/>
+                <w:sz w:val="21"/>
+                <w:szCs w:val="21"/>
+              </w:rPr>
+              <w:t xml:space="preserve">Abbrechen</w:t>
+            </w:r>
+          </w:p>
+        </w:tc>
+      </w:tr>
+      <w:tr>
+        <w:tc>
+          <w:tcPr>
+            <w:tcW w:type="dxa" w:w="1120"/>
+            <w:tcMar>
+              <w:top w:type="dxa" w:w="60"/>
+              <w:left w:type="dxa" w:w="90"/>
+              <w:bottom w:type="dxa" w:w="60"/>
+              <w:right w:type="dxa" w:w="90"/>
+            </w:tcMar>
+          </w:tcPr>
+          <w:p>
+            <w:pPr>
+              <w:spacing w:after="0"/>
+            </w:pPr>
+            <w:r>
+              <w:rPr>
+                <w:rFonts w:ascii="Consolas" w:cs="Consolas" w:eastAsia="Consolas" w:hAnsi="Consolas"/>
+                <w:color w:val="9A958B"/>
+                <w:sz w:val="15"/>
+                <w:szCs w:val="15"/>
+              </w:rPr>
               <w:t xml:space="preserve">B-549</w:t>
             </w:r>
           </w:p>
@@ -35701,7 +35701,7 @@
                 <w:sz w:val="21"/>
                 <w:szCs w:val="21"/>
               </w:rPr>
-              <w:t xml:space="preserve">Abbrechen</w:t>
+              <w:t xml:space="preserve">Code (VT-…) oder Link einfügen</w:t>
             </w:r>
           </w:p>
         </w:tc>
@@ -35752,7 +35752,7 @@
                 <w:sz w:val="21"/>
                 <w:szCs w:val="21"/>
               </w:rPr>
-              <w:t xml:space="preserve">Code (VT-…) oder Link einfügen</w:t>
+              <w:t xml:space="preserve">Du bekommst eine eigene Kopie; bereits vorhandene Wörter werden übersprungen.</w:t>
             </w:r>
           </w:p>
         </w:tc>
@@ -35803,7 +35803,7 @@
                 <w:sz w:val="21"/>
                 <w:szCs w:val="21"/>
               </w:rPr>
-              <w:t xml:space="preserve">Du bekommst eine eigene Kopie; bereits vorhandene Wörter werden übersprungen.</w:t>
+              <w:t xml:space="preserve">Geteilte Liste</w:t>
             </w:r>
           </w:p>
         </w:tc>
@@ -35854,7 +35854,7 @@
                 <w:sz w:val="21"/>
                 <w:szCs w:val="21"/>
               </w:rPr>
-              <w:t xml:space="preserve">Geteilte Liste</w:t>
+              <w:t xml:space="preserve">Konnte die Liste nicht laden.</w:t>
             </w:r>
           </w:p>
         </w:tc>
@@ -35905,7 +35905,7 @@
                 <w:sz w:val="21"/>
                 <w:szCs w:val="21"/>
               </w:rPr>
-              <w:t xml:space="preserve">Konnte die Liste nicht laden.</w:t>
+              <w:t xml:space="preserve">Liste importieren</w:t>
             </w:r>
           </w:p>
         </w:tc>
@@ -35956,7 +35956,7 @@
                 <w:sz w:val="21"/>
                 <w:szCs w:val="21"/>
               </w:rPr>
-              <w:t xml:space="preserve">Liste importieren</w:t>
+              <w:t xml:space="preserve">Liste nicht gefunden. Bitte den Code prüfen.</w:t>
             </w:r>
           </w:p>
         </w:tc>
@@ -35984,57 +35984,6 @@
                 <w:szCs w:val="15"/>
               </w:rPr>
               <w:t xml:space="preserve">B-555</w:t>
-            </w:r>
-          </w:p>
-        </w:tc>
-        <w:tc>
-          <w:tcPr>
-            <w:tcW w:type="dxa" w:w="7880"/>
-            <w:tcMar>
-              <w:top w:type="dxa" w:w="60"/>
-              <w:left w:type="dxa" w:w="90"/>
-              <w:bottom w:type="dxa" w:w="60"/>
-              <w:right w:type="dxa" w:w="90"/>
-            </w:tcMar>
-          </w:tcPr>
-          <w:p>
-            <w:pPr>
-              <w:spacing w:after="0" w:before="0"/>
-            </w:pPr>
-            <w:r>
-              <w:rPr>
-                <w:rFonts w:ascii="Calibri" w:cs="Calibri" w:eastAsia="Calibri" w:hAnsi="Calibri"/>
-                <w:sz w:val="21"/>
-                <w:szCs w:val="21"/>
-              </w:rPr>
-              <w:t xml:space="preserve">Liste nicht gefunden. Bitte den Code prüfen.</w:t>
-            </w:r>
-          </w:p>
-        </w:tc>
-      </w:tr>
-      <w:tr>
-        <w:tc>
-          <w:tcPr>
-            <w:tcW w:type="dxa" w:w="1120"/>
-            <w:tcMar>
-              <w:top w:type="dxa" w:w="60"/>
-              <w:left w:type="dxa" w:w="90"/>
-              <w:bottom w:type="dxa" w:w="60"/>
-              <w:right w:type="dxa" w:w="90"/>
-            </w:tcMar>
-          </w:tcPr>
-          <w:p>
-            <w:pPr>
-              <w:spacing w:after="0"/>
-            </w:pPr>
-            <w:r>
-              <w:rPr>
-                <w:rFonts w:ascii="Consolas" w:cs="Consolas" w:eastAsia="Consolas" w:hAnsi="Consolas"/>
-                <w:color w:val="9A958B"/>
-                <w:sz w:val="15"/>
-                <w:szCs w:val="15"/>
-              </w:rPr>
-              <w:t xml:space="preserve">B-556</w:t>
             </w:r>
           </w:p>
         </w:tc>
@@ -36183,6 +36132,57 @@
                 <w:sz w:val="15"/>
                 <w:szCs w:val="15"/>
               </w:rPr>
+              <w:t xml:space="preserve">B-556</w:t>
+            </w:r>
+          </w:p>
+        </w:tc>
+        <w:tc>
+          <w:tcPr>
+            <w:tcW w:type="dxa" w:w="7880"/>
+            <w:tcMar>
+              <w:top w:type="dxa" w:w="60"/>
+              <w:left w:type="dxa" w:w="90"/>
+              <w:bottom w:type="dxa" w:w="60"/>
+              <w:right w:type="dxa" w:w="90"/>
+            </w:tcMar>
+          </w:tcPr>
+          <w:p>
+            <w:pPr>
+              <w:spacing w:after="0" w:before="0"/>
+            </w:pPr>
+            <w:r>
+              <w:rPr>
+                <w:rFonts w:ascii="Calibri" w:cs="Calibri" w:eastAsia="Calibri" w:hAnsi="Calibri"/>
+                <w:sz w:val="21"/>
+                <w:szCs w:val="21"/>
+              </w:rPr>
+              <w:t xml:space="preserve">„{liste}“ teilen</w:t>
+            </w:r>
+          </w:p>
+        </w:tc>
+      </w:tr>
+      <w:tr>
+        <w:tc>
+          <w:tcPr>
+            <w:tcW w:type="dxa" w:w="1120"/>
+            <w:tcMar>
+              <w:top w:type="dxa" w:w="60"/>
+              <w:left w:type="dxa" w:w="90"/>
+              <w:bottom w:type="dxa" w:w="60"/>
+              <w:right w:type="dxa" w:w="90"/>
+            </w:tcMar>
+          </w:tcPr>
+          <w:p>
+            <w:pPr>
+              <w:spacing w:after="0"/>
+            </w:pPr>
+            <w:r>
+              <w:rPr>
+                <w:rFonts w:ascii="Consolas" w:cs="Consolas" w:eastAsia="Consolas" w:hAnsi="Consolas"/>
+                <w:color w:val="9A958B"/>
+                <w:sz w:val="15"/>
+                <w:szCs w:val="15"/>
+              </w:rPr>
               <w:t xml:space="preserve">B-557</w:t>
             </w:r>
           </w:p>
@@ -36207,7 +36207,7 @@
                 <w:sz w:val="21"/>
                 <w:szCs w:val="21"/>
               </w:rPr>
-              <w:t xml:space="preserve">„{liste}“ teilen</w:t>
+              <w:t xml:space="preserve">Code</w:t>
             </w:r>
           </w:p>
         </w:tc>
@@ -36258,7 +36258,7 @@
                 <w:sz w:val="21"/>
                 <w:szCs w:val="21"/>
               </w:rPr>
-              <w:t xml:space="preserve">Code</w:t>
+              <w:t xml:space="preserve">Link</w:t>
             </w:r>
           </w:p>
         </w:tc>
@@ -36309,7 +36309,7 @@
                 <w:sz w:val="21"/>
                 <w:szCs w:val="21"/>
               </w:rPr>
-              <w:t xml:space="preserve">Link</w:t>
+              <w:t xml:space="preserve">Teilen …</w:t>
             </w:r>
           </w:p>
         </w:tc>
@@ -36360,7 +36360,7 @@
                 <w:sz w:val="21"/>
                 <w:szCs w:val="21"/>
               </w:rPr>
-              <w:t xml:space="preserve">Teilen …</w:t>
+              <w:t xml:space="preserve">Übernimm meine Wortliste „{liste}“ in SmartVoc:</w:t>
             </w:r>
           </w:p>
         </w:tc>
@@ -36388,57 +36388,6 @@
                 <w:szCs w:val="15"/>
               </w:rPr>
               <w:t xml:space="preserve">B-561</w:t>
-            </w:r>
-          </w:p>
-        </w:tc>
-        <w:tc>
-          <w:tcPr>
-            <w:tcW w:type="dxa" w:w="7880"/>
-            <w:tcMar>
-              <w:top w:type="dxa" w:w="60"/>
-              <w:left w:type="dxa" w:w="90"/>
-              <w:bottom w:type="dxa" w:w="60"/>
-              <w:right w:type="dxa" w:w="90"/>
-            </w:tcMar>
-          </w:tcPr>
-          <w:p>
-            <w:pPr>
-              <w:spacing w:after="0" w:before="0"/>
-            </w:pPr>
-            <w:r>
-              <w:rPr>
-                <w:rFonts w:ascii="Calibri" w:cs="Calibri" w:eastAsia="Calibri" w:hAnsi="Calibri"/>
-                <w:sz w:val="21"/>
-                <w:szCs w:val="21"/>
-              </w:rPr>
-              <w:t xml:space="preserve">Übernimm meine Wortliste „{liste}“ in SmartVoc:</w:t>
-            </w:r>
-          </w:p>
-        </w:tc>
-      </w:tr>
-      <w:tr>
-        <w:tc>
-          <w:tcPr>
-            <w:tcW w:type="dxa" w:w="1120"/>
-            <w:tcMar>
-              <w:top w:type="dxa" w:w="60"/>
-              <w:left w:type="dxa" w:w="90"/>
-              <w:bottom w:type="dxa" w:w="60"/>
-              <w:right w:type="dxa" w:w="90"/>
-            </w:tcMar>
-          </w:tcPr>
-          <w:p>
-            <w:pPr>
-              <w:spacing w:after="0"/>
-            </w:pPr>
-            <w:r>
-              <w:rPr>
-                <w:rFonts w:ascii="Consolas" w:cs="Consolas" w:eastAsia="Consolas" w:hAnsi="Consolas"/>
-                <w:color w:val="9A958B"/>
-                <w:sz w:val="15"/>
-                <w:szCs w:val="15"/>
-              </w:rPr>
-              <w:t xml:space="preserve">B-562</w:t>
             </w:r>
           </w:p>
         </w:tc>
@@ -36587,6 +36536,57 @@
                 <w:sz w:val="15"/>
                 <w:szCs w:val="15"/>
               </w:rPr>
+              <w:t xml:space="preserve">B-562</w:t>
+            </w:r>
+          </w:p>
+        </w:tc>
+        <w:tc>
+          <w:tcPr>
+            <w:tcW w:type="dxa" w:w="7880"/>
+            <w:tcMar>
+              <w:top w:type="dxa" w:w="60"/>
+              <w:left w:type="dxa" w:w="90"/>
+              <w:bottom w:type="dxa" w:w="60"/>
+              <w:right w:type="dxa" w:w="90"/>
+            </w:tcMar>
+          </w:tcPr>
+          <w:p>
+            <w:pPr>
+              <w:spacing w:after="0" w:before="0"/>
+            </w:pPr>
+            <w:r>
+              <w:rPr>
+                <w:rFonts w:ascii="Calibri" w:cs="Calibri" w:eastAsia="Calibri" w:hAnsi="Calibri"/>
+                <w:sz w:val="21"/>
+                <w:szCs w:val="21"/>
+              </w:rPr>
+              <w:t xml:space="preserve">{n} Wörter</w:t>
+            </w:r>
+          </w:p>
+        </w:tc>
+      </w:tr>
+      <w:tr>
+        <w:tc>
+          <w:tcPr>
+            <w:tcW w:type="dxa" w:w="1120"/>
+            <w:tcMar>
+              <w:top w:type="dxa" w:w="60"/>
+              <w:left w:type="dxa" w:w="90"/>
+              <w:bottom w:type="dxa" w:w="60"/>
+              <w:right w:type="dxa" w:w="90"/>
+            </w:tcMar>
+          </w:tcPr>
+          <w:p>
+            <w:pPr>
+              <w:spacing w:after="0"/>
+            </w:pPr>
+            <w:r>
+              <w:rPr>
+                <w:rFonts w:ascii="Consolas" w:cs="Consolas" w:eastAsia="Consolas" w:hAnsi="Consolas"/>
+                <w:color w:val="9A958B"/>
+                <w:sz w:val="15"/>
+                <w:szCs w:val="15"/>
+              </w:rPr>
               <w:t xml:space="preserve">B-563</w:t>
             </w:r>
           </w:p>
@@ -36611,7 +36611,7 @@
                 <w:sz w:val="21"/>
                 <w:szCs w:val="21"/>
               </w:rPr>
-              <w:t xml:space="preserve">{n} Wörter</w:t>
+              <w:t xml:space="preserve">{p} % sitzen</w:t>
             </w:r>
           </w:p>
         </w:tc>
@@ -36662,7 +36662,7 @@
                 <w:sz w:val="21"/>
                 <w:szCs w:val="21"/>
               </w:rPr>
-              <w:t xml:space="preserve">{p} % sitzen</w:t>
+              <w:t xml:space="preserve">Hier hinzufügen</w:t>
             </w:r>
           </w:p>
         </w:tc>
@@ -36690,57 +36690,6 @@
                 <w:szCs w:val="15"/>
               </w:rPr>
               <w:t xml:space="preserve">B-565</w:t>
-            </w:r>
-          </w:p>
-        </w:tc>
-        <w:tc>
-          <w:tcPr>
-            <w:tcW w:type="dxa" w:w="7880"/>
-            <w:tcMar>
-              <w:top w:type="dxa" w:w="60"/>
-              <w:left w:type="dxa" w:w="90"/>
-              <w:bottom w:type="dxa" w:w="60"/>
-              <w:right w:type="dxa" w:w="90"/>
-            </w:tcMar>
-          </w:tcPr>
-          <w:p>
-            <w:pPr>
-              <w:spacing w:after="0" w:before="0"/>
-            </w:pPr>
-            <w:r>
-              <w:rPr>
-                <w:rFonts w:ascii="Calibri" w:cs="Calibri" w:eastAsia="Calibri" w:hAnsi="Calibri"/>
-                <w:sz w:val="21"/>
-                <w:szCs w:val="21"/>
-              </w:rPr>
-              <w:t xml:space="preserve">Hier hinzufügen</w:t>
-            </w:r>
-          </w:p>
-        </w:tc>
-      </w:tr>
-      <w:tr>
-        <w:tc>
-          <w:tcPr>
-            <w:tcW w:type="dxa" w:w="1120"/>
-            <w:tcMar>
-              <w:top w:type="dxa" w:w="60"/>
-              <w:left w:type="dxa" w:w="90"/>
-              <w:bottom w:type="dxa" w:w="60"/>
-              <w:right w:type="dxa" w:w="90"/>
-            </w:tcMar>
-          </w:tcPr>
-          <w:p>
-            <w:pPr>
-              <w:spacing w:after="0"/>
-            </w:pPr>
-            <w:r>
-              <w:rPr>
-                <w:rFonts w:ascii="Consolas" w:cs="Consolas" w:eastAsia="Consolas" w:hAnsi="Consolas"/>
-                <w:color w:val="9A958B"/>
-                <w:sz w:val="15"/>
-                <w:szCs w:val="15"/>
-              </w:rPr>
-              <w:t xml:space="preserve">B-566</w:t>
             </w:r>
           </w:p>
         </w:tc>
@@ -36889,6 +36838,57 @@
                 <w:sz w:val="15"/>
                 <w:szCs w:val="15"/>
               </w:rPr>
+              <w:t xml:space="preserve">B-566</w:t>
+            </w:r>
+          </w:p>
+        </w:tc>
+        <w:tc>
+          <w:tcPr>
+            <w:tcW w:type="dxa" w:w="7880"/>
+            <w:tcMar>
+              <w:top w:type="dxa" w:w="60"/>
+              <w:left w:type="dxa" w:w="90"/>
+              <w:bottom w:type="dxa" w:w="60"/>
+              <w:right w:type="dxa" w:w="90"/>
+            </w:tcMar>
+          </w:tcPr>
+          <w:p>
+            <w:pPr>
+              <w:spacing w:after="0" w:before="0"/>
+            </w:pPr>
+            <w:r>
+              <w:rPr>
+                <w:rFonts w:ascii="Calibri" w:cs="Calibri" w:eastAsia="Calibri" w:hAnsi="Calibri"/>
+                <w:sz w:val="21"/>
+                <w:szCs w:val="21"/>
+              </w:rPr>
+              <w:t xml:space="preserve">Bearbeiten</w:t>
+            </w:r>
+          </w:p>
+        </w:tc>
+      </w:tr>
+      <w:tr>
+        <w:tc>
+          <w:tcPr>
+            <w:tcW w:type="dxa" w:w="1120"/>
+            <w:tcMar>
+              <w:top w:type="dxa" w:w="60"/>
+              <w:left w:type="dxa" w:w="90"/>
+              <w:bottom w:type="dxa" w:w="60"/>
+              <w:right w:type="dxa" w:w="90"/>
+            </w:tcMar>
+          </w:tcPr>
+          <w:p>
+            <w:pPr>
+              <w:spacing w:after="0"/>
+            </w:pPr>
+            <w:r>
+              <w:rPr>
+                <w:rFonts w:ascii="Consolas" w:cs="Consolas" w:eastAsia="Consolas" w:hAnsi="Consolas"/>
+                <w:color w:val="9A958B"/>
+                <w:sz w:val="15"/>
+                <w:szCs w:val="15"/>
+              </w:rPr>
               <w:t xml:space="preserve">B-567</w:t>
             </w:r>
           </w:p>
@@ -36913,7 +36913,7 @@
                 <w:sz w:val="21"/>
                 <w:szCs w:val="21"/>
               </w:rPr>
-              <w:t xml:space="preserve">Bearbeiten</w:t>
+              <w:t xml:space="preserve">Beispielsatz 1</w:t>
             </w:r>
           </w:p>
         </w:tc>
@@ -36964,7 +36964,7 @@
                 <w:sz w:val="21"/>
                 <w:szCs w:val="21"/>
               </w:rPr>
-              <w:t xml:space="preserve">Beispielsatz 1</w:t>
+              <w:t xml:space="preserve">Beispielsatz 2</w:t>
             </w:r>
           </w:p>
         </w:tc>
@@ -37015,7 +37015,7 @@
                 <w:sz w:val="21"/>
                 <w:szCs w:val="21"/>
               </w:rPr>
-              <w:t xml:space="preserve">Beispielsatz 2</w:t>
+              <w:t xml:space="preserve">noch nie geübt</w:t>
             </w:r>
           </w:p>
         </w:tc>
@@ -37066,7 +37066,7 @@
                 <w:sz w:val="21"/>
                 <w:szCs w:val="21"/>
               </w:rPr>
-              <w:t xml:space="preserve">noch nie geübt</w:t>
+              <w:t xml:space="preserve">noch offen</w:t>
             </w:r>
           </w:p>
         </w:tc>
@@ -37117,7 +37117,7 @@
                 <w:sz w:val="21"/>
                 <w:szCs w:val="21"/>
               </w:rPr>
-              <w:t xml:space="preserve">noch offen</w:t>
+              <w:t xml:space="preserve">nur bei Nomen</w:t>
             </w:r>
           </w:p>
         </w:tc>
@@ -37145,57 +37145,6 @@
                 <w:szCs w:val="15"/>
               </w:rPr>
               <w:t xml:space="preserve">B-572</w:t>
-            </w:r>
-          </w:p>
-        </w:tc>
-        <w:tc>
-          <w:tcPr>
-            <w:tcW w:type="dxa" w:w="7880"/>
-            <w:tcMar>
-              <w:top w:type="dxa" w:w="60"/>
-              <w:left w:type="dxa" w:w="90"/>
-              <w:bottom w:type="dxa" w:w="60"/>
-              <w:right w:type="dxa" w:w="90"/>
-            </w:tcMar>
-          </w:tcPr>
-          <w:p>
-            <w:pPr>
-              <w:spacing w:after="0" w:before="0"/>
-            </w:pPr>
-            <w:r>
-              <w:rPr>
-                <w:rFonts w:ascii="Calibri" w:cs="Calibri" w:eastAsia="Calibri" w:hAnsi="Calibri"/>
-                <w:sz w:val="21"/>
-                <w:szCs w:val="21"/>
-              </w:rPr>
-              <w:t xml:space="preserve">nur bei Nomen</w:t>
-            </w:r>
-          </w:p>
-        </w:tc>
-      </w:tr>
-      <w:tr>
-        <w:tc>
-          <w:tcPr>
-            <w:tcW w:type="dxa" w:w="1120"/>
-            <w:tcMar>
-              <w:top w:type="dxa" w:w="60"/>
-              <w:left w:type="dxa" w:w="90"/>
-              <w:bottom w:type="dxa" w:w="60"/>
-              <w:right w:type="dxa" w:w="90"/>
-            </w:tcMar>
-          </w:tcPr>
-          <w:p>
-            <w:pPr>
-              <w:spacing w:after="0"/>
-            </w:pPr>
-            <w:r>
-              <w:rPr>
-                <w:rFonts w:ascii="Consolas" w:cs="Consolas" w:eastAsia="Consolas" w:hAnsi="Consolas"/>
-                <w:color w:val="9A958B"/>
-                <w:sz w:val="15"/>
-                <w:szCs w:val="15"/>
-              </w:rPr>
-              <w:t xml:space="preserve">B-573</w:t>
             </w:r>
           </w:p>
         </w:tc>
@@ -37344,6 +37293,57 @@
                 <w:sz w:val="15"/>
                 <w:szCs w:val="15"/>
               </w:rPr>
+              <w:t xml:space="preserve">B-573</w:t>
+            </w:r>
+          </w:p>
+        </w:tc>
+        <w:tc>
+          <w:tcPr>
+            <w:tcW w:type="dxa" w:w="7880"/>
+            <w:tcMar>
+              <w:top w:type="dxa" w:w="60"/>
+              <w:left w:type="dxa" w:w="90"/>
+              <w:bottom w:type="dxa" w:w="60"/>
+              <w:right w:type="dxa" w:w="90"/>
+            </w:tcMar>
+          </w:tcPr>
+          <w:p>
+            <w:pPr>
+              <w:spacing w:after="0" w:before="0"/>
+            </w:pPr>
+            <w:r>
+              <w:rPr>
+                <w:rFonts w:ascii="Calibri" w:cs="Calibri" w:eastAsia="Calibri" w:hAnsi="Calibri"/>
+                <w:sz w:val="21"/>
+                <w:szCs w:val="21"/>
+              </w:rPr>
+              <w:t xml:space="preserve">{n} ×</w:t>
+            </w:r>
+          </w:p>
+        </w:tc>
+      </w:tr>
+      <w:tr>
+        <w:tc>
+          <w:tcPr>
+            <w:tcW w:type="dxa" w:w="1120"/>
+            <w:tcMar>
+              <w:top w:type="dxa" w:w="60"/>
+              <w:left w:type="dxa" w:w="90"/>
+              <w:bottom w:type="dxa" w:w="60"/>
+              <w:right w:type="dxa" w:w="90"/>
+            </w:tcMar>
+          </w:tcPr>
+          <w:p>
+            <w:pPr>
+              <w:spacing w:after="0"/>
+            </w:pPr>
+            <w:r>
+              <w:rPr>
+                <w:rFonts w:ascii="Consolas" w:cs="Consolas" w:eastAsia="Consolas" w:hAnsi="Consolas"/>
+                <w:color w:val="9A958B"/>
+                <w:sz w:val="15"/>
+                <w:szCs w:val="15"/>
+              </w:rPr>
               <w:t xml:space="preserve">B-574</w:t>
             </w:r>
           </w:p>
@@ -37368,7 +37368,7 @@
                 <w:sz w:val="21"/>
                 <w:szCs w:val="21"/>
               </w:rPr>
-              <w:t xml:space="preserve">{n} ×</w:t>
+              <w:t xml:space="preserve">Falsch beantwortet</w:t>
             </w:r>
           </w:p>
         </w:tc>
@@ -37419,7 +37419,7 @@
                 <w:sz w:val="21"/>
                 <w:szCs w:val="21"/>
               </w:rPr>
-              <w:t xml:space="preserve">Falsch beantwortet</w:t>
+              <w:t xml:space="preserve">In der Liste</w:t>
             </w:r>
           </w:p>
         </w:tc>
@@ -37470,7 +37470,7 @@
                 <w:sz w:val="21"/>
                 <w:szCs w:val="21"/>
               </w:rPr>
-              <w:t xml:space="preserve">In der Liste</w:t>
+              <w:t xml:space="preserve">Lernstand</w:t>
             </w:r>
           </w:p>
         </w:tc>
@@ -37521,7 +37521,7 @@
                 <w:sz w:val="21"/>
                 <w:szCs w:val="21"/>
               </w:rPr>
-              <w:t xml:space="preserve">Lernstand</w:t>
+              <w:t xml:space="preserve">Nächste Übung</w:t>
             </w:r>
           </w:p>
         </w:tc>
@@ -37572,7 +37572,7 @@
                 <w:sz w:val="21"/>
                 <w:szCs w:val="21"/>
               </w:rPr>
-              <w:t xml:space="preserve">Nächste Übung</w:t>
+              <w:t xml:space="preserve">nur zur Ansicht</w:t>
             </w:r>
           </w:p>
         </w:tc>
@@ -37623,7 +37623,7 @@
                 <w:sz w:val="21"/>
                 <w:szCs w:val="21"/>
               </w:rPr>
-              <w:t xml:space="preserve">nur zur Ansicht</w:t>
+              <w:t xml:space="preserve">Richtig beantwortet</w:t>
             </w:r>
           </w:p>
         </w:tc>
@@ -37651,57 +37651,6 @@
                 <w:szCs w:val="15"/>
               </w:rPr>
               <w:t xml:space="preserve">B-580</w:t>
-            </w:r>
-          </w:p>
-        </w:tc>
-        <w:tc>
-          <w:tcPr>
-            <w:tcW w:type="dxa" w:w="7880"/>
-            <w:tcMar>
-              <w:top w:type="dxa" w:w="60"/>
-              <w:left w:type="dxa" w:w="90"/>
-              <w:bottom w:type="dxa" w:w="60"/>
-              <w:right w:type="dxa" w:w="90"/>
-            </w:tcMar>
-          </w:tcPr>
-          <w:p>
-            <w:pPr>
-              <w:spacing w:after="0" w:before="0"/>
-            </w:pPr>
-            <w:r>
-              <w:rPr>
-                <w:rFonts w:ascii="Calibri" w:cs="Calibri" w:eastAsia="Calibri" w:hAnsi="Calibri"/>
-                <w:sz w:val="21"/>
-                <w:szCs w:val="21"/>
-              </w:rPr>
-              <w:t xml:space="preserve">Richtig beantwortet</w:t>
-            </w:r>
-          </w:p>
-        </w:tc>
-      </w:tr>
-      <w:tr>
-        <w:tc>
-          <w:tcPr>
-            <w:tcW w:type="dxa" w:w="1120"/>
-            <w:tcMar>
-              <w:top w:type="dxa" w:w="60"/>
-              <w:left w:type="dxa" w:w="90"/>
-              <w:bottom w:type="dxa" w:w="60"/>
-              <w:right w:type="dxa" w:w="90"/>
-            </w:tcMar>
-          </w:tcPr>
-          <w:p>
-            <w:pPr>
-              <w:spacing w:after="0"/>
-            </w:pPr>
-            <w:r>
-              <w:rPr>
-                <w:rFonts w:ascii="Consolas" w:cs="Consolas" w:eastAsia="Consolas" w:hAnsi="Consolas"/>
-                <w:color w:val="9A958B"/>
-                <w:sz w:val="15"/>
-                <w:szCs w:val="15"/>
-              </w:rPr>
-              <w:t xml:space="preserve">B-581</w:t>
             </w:r>
           </w:p>
         </w:tc>
@@ -37850,6 +37799,57 @@
                 <w:sz w:val="15"/>
                 <w:szCs w:val="15"/>
               </w:rPr>
+              <w:t xml:space="preserve">B-581</w:t>
+            </w:r>
+          </w:p>
+        </w:tc>
+        <w:tc>
+          <w:tcPr>
+            <w:tcW w:type="dxa" w:w="7880"/>
+            <w:tcMar>
+              <w:top w:type="dxa" w:w="60"/>
+              <w:left w:type="dxa" w:w="90"/>
+              <w:bottom w:type="dxa" w:w="60"/>
+              <w:right w:type="dxa" w:w="90"/>
+            </w:tcMar>
+          </w:tcPr>
+          <w:p>
+            <w:pPr>
+              <w:spacing w:after="0" w:before="0"/>
+            </w:pPr>
+            <w:r>
+              <w:rPr>
+                <w:rFonts w:ascii="Calibri" w:cs="Calibri" w:eastAsia="Calibri" w:hAnsi="Calibri"/>
+                <w:sz w:val="21"/>
+                <w:szCs w:val="21"/>
+              </w:rPr>
+              <w:t xml:space="preserve">{n} Wort insgesamt</w:t>
+            </w:r>
+          </w:p>
+        </w:tc>
+      </w:tr>
+      <w:tr>
+        <w:tc>
+          <w:tcPr>
+            <w:tcW w:type="dxa" w:w="1120"/>
+            <w:tcMar>
+              <w:top w:type="dxa" w:w="60"/>
+              <w:left w:type="dxa" w:w="90"/>
+              <w:bottom w:type="dxa" w:w="60"/>
+              <w:right w:type="dxa" w:w="90"/>
+            </w:tcMar>
+          </w:tcPr>
+          <w:p>
+            <w:pPr>
+              <w:spacing w:after="0"/>
+            </w:pPr>
+            <w:r>
+              <w:rPr>
+                <w:rFonts w:ascii="Consolas" w:cs="Consolas" w:eastAsia="Consolas" w:hAnsi="Consolas"/>
+                <w:color w:val="9A958B"/>
+                <w:sz w:val="15"/>
+                <w:szCs w:val="15"/>
+              </w:rPr>
               <w:t xml:space="preserve">B-582</w:t>
             </w:r>
           </w:p>
@@ -37874,7 +37874,7 @@
                 <w:sz w:val="21"/>
                 <w:szCs w:val="21"/>
               </w:rPr>
-              <w:t xml:space="preserve">{n} Wort insgesamt</w:t>
+              <w:t xml:space="preserve">{n} Wörter insgesamt</w:t>
             </w:r>
           </w:p>
         </w:tc>
@@ -37925,7 +37925,7 @@
                 <w:sz w:val="21"/>
                 <w:szCs w:val="21"/>
               </w:rPr>
-              <w:t xml:space="preserve">{n} Wörter insgesamt</w:t>
+              <w:t xml:space="preserve">baut sich auf, ab heute füllt sich diese Linie</w:t>
             </w:r>
           </w:p>
         </w:tc>
@@ -37976,7 +37976,7 @@
                 <w:sz w:val="21"/>
                 <w:szCs w:val="21"/>
               </w:rPr>
-              <w:t xml:space="preserve">baut sich auf, ab heute füllt sich diese Linie</w:t>
+              <w:t xml:space="preserve">Noch kein Verlauf. Ab heute merkt sich die App jeden Tag deinen Stand.</w:t>
             </w:r>
           </w:p>
         </w:tc>
@@ -38004,57 +38004,6 @@
                 <w:szCs w:val="15"/>
               </w:rPr>
               <w:t xml:space="preserve">B-585</w:t>
-            </w:r>
-          </w:p>
-        </w:tc>
-        <w:tc>
-          <w:tcPr>
-            <w:tcW w:type="dxa" w:w="7880"/>
-            <w:tcMar>
-              <w:top w:type="dxa" w:w="60"/>
-              <w:left w:type="dxa" w:w="90"/>
-              <w:bottom w:type="dxa" w:w="60"/>
-              <w:right w:type="dxa" w:w="90"/>
-            </w:tcMar>
-          </w:tcPr>
-          <w:p>
-            <w:pPr>
-              <w:spacing w:after="0" w:before="0"/>
-            </w:pPr>
-            <w:r>
-              <w:rPr>
-                <w:rFonts w:ascii="Calibri" w:cs="Calibri" w:eastAsia="Calibri" w:hAnsi="Calibri"/>
-                <w:sz w:val="21"/>
-                <w:szCs w:val="21"/>
-              </w:rPr>
-              <w:t xml:space="preserve">Noch kein Verlauf. Ab heute merkt sich die App jeden Tag deinen Stand.</w:t>
-            </w:r>
-          </w:p>
-        </w:tc>
-      </w:tr>
-      <w:tr>
-        <w:tc>
-          <w:tcPr>
-            <w:tcW w:type="dxa" w:w="1120"/>
-            <w:tcMar>
-              <w:top w:type="dxa" w:w="60"/>
-              <w:left w:type="dxa" w:w="90"/>
-              <w:bottom w:type="dxa" w:w="60"/>
-              <w:right w:type="dxa" w:w="90"/>
-            </w:tcMar>
-          </w:tcPr>
-          <w:p>
-            <w:pPr>
-              <w:spacing w:after="0"/>
-            </w:pPr>
-            <w:r>
-              <w:rPr>
-                <w:rFonts w:ascii="Consolas" w:cs="Consolas" w:eastAsia="Consolas" w:hAnsi="Consolas"/>
-                <w:color w:val="9A958B"/>
-                <w:sz w:val="15"/>
-                <w:szCs w:val="15"/>
-              </w:rPr>
-              <w:t xml:space="preserve">B-586</w:t>
             </w:r>
           </w:p>
         </w:tc>
@@ -38203,6 +38152,57 @@
                 <w:sz w:val="15"/>
                 <w:szCs w:val="15"/>
               </w:rPr>
+              <w:t xml:space="preserve">B-586</w:t>
+            </w:r>
+          </w:p>
+        </w:tc>
+        <w:tc>
+          <w:tcPr>
+            <w:tcW w:type="dxa" w:w="7880"/>
+            <w:tcMar>
+              <w:top w:type="dxa" w:w="60"/>
+              <w:left w:type="dxa" w:w="90"/>
+              <w:bottom w:type="dxa" w:w="60"/>
+              <w:right w:type="dxa" w:w="90"/>
+            </w:tcMar>
+          </w:tcPr>
+          <w:p>
+            <w:pPr>
+              <w:spacing w:after="0" w:before="0"/>
+            </w:pPr>
+            <w:r>
+              <w:rPr>
+                <w:rFonts w:ascii="Calibri" w:cs="Calibri" w:eastAsia="Calibri" w:hAnsi="Calibri"/>
+                <w:sz w:val="21"/>
+                <w:szCs w:val="21"/>
+              </w:rPr>
+              <w:t xml:space="preserve">Fälliges und Neues sinnvoll gemischt</w:t>
+            </w:r>
+          </w:p>
+        </w:tc>
+      </w:tr>
+      <w:tr>
+        <w:tc>
+          <w:tcPr>
+            <w:tcW w:type="dxa" w:w="1120"/>
+            <w:tcMar>
+              <w:top w:type="dxa" w:w="60"/>
+              <w:left w:type="dxa" w:w="90"/>
+              <w:bottom w:type="dxa" w:w="60"/>
+              <w:right w:type="dxa" w:w="90"/>
+            </w:tcMar>
+          </w:tcPr>
+          <w:p>
+            <w:pPr>
+              <w:spacing w:after="0"/>
+            </w:pPr>
+            <w:r>
+              <w:rPr>
+                <w:rFonts w:ascii="Consolas" w:cs="Consolas" w:eastAsia="Consolas" w:hAnsi="Consolas"/>
+                <w:color w:val="9A958B"/>
+                <w:sz w:val="15"/>
+                <w:szCs w:val="15"/>
+              </w:rPr>
               <w:t xml:space="preserve">B-587</w:t>
             </w:r>
           </w:p>
@@ -38227,7 +38227,7 @@
                 <w:sz w:val="21"/>
                 <w:szCs w:val="21"/>
               </w:rPr>
-              <w:t xml:space="preserve">Fälliges und Neues sinnvoll gemischt</w:t>
+              <w:t xml:space="preserve">Jetzt fällig, der beste Moment zum Auffrischen</w:t>
             </w:r>
           </w:p>
         </w:tc>
@@ -38278,7 +38278,7 @@
                 <w:sz w:val="21"/>
                 <w:szCs w:val="21"/>
               </w:rPr>
-              <w:t xml:space="preserve">Jetzt fällig, der beste Moment zum Auffrischen</w:t>
+              <w:t xml:space="preserve">Schon geübt, sitzt aber noch nicht sicher</w:t>
             </w:r>
           </w:p>
         </w:tc>
@@ -38306,57 +38306,6 @@
                 <w:szCs w:val="15"/>
               </w:rPr>
               <w:t xml:space="preserve">B-589</w:t>
-            </w:r>
-          </w:p>
-        </w:tc>
-        <w:tc>
-          <w:tcPr>
-            <w:tcW w:type="dxa" w:w="7880"/>
-            <w:tcMar>
-              <w:top w:type="dxa" w:w="60"/>
-              <w:left w:type="dxa" w:w="90"/>
-              <w:bottom w:type="dxa" w:w="60"/>
-              <w:right w:type="dxa" w:w="90"/>
-            </w:tcMar>
-          </w:tcPr>
-          <w:p>
-            <w:pPr>
-              <w:spacing w:after="0" w:before="0"/>
-            </w:pPr>
-            <w:r>
-              <w:rPr>
-                <w:rFonts w:ascii="Calibri" w:cs="Calibri" w:eastAsia="Calibri" w:hAnsi="Calibri"/>
-                <w:sz w:val="21"/>
-                <w:szCs w:val="21"/>
-              </w:rPr>
-              <w:t xml:space="preserve">Schon geübt, sitzt aber noch nicht sicher</w:t>
-            </w:r>
-          </w:p>
-        </w:tc>
-      </w:tr>
-      <w:tr>
-        <w:tc>
-          <w:tcPr>
-            <w:tcW w:type="dxa" w:w="1120"/>
-            <w:tcMar>
-              <w:top w:type="dxa" w:w="60"/>
-              <w:left w:type="dxa" w:w="90"/>
-              <w:bottom w:type="dxa" w:w="60"/>
-              <w:right w:type="dxa" w:w="90"/>
-            </w:tcMar>
-          </w:tcPr>
-          <w:p>
-            <w:pPr>
-              <w:spacing w:after="0"/>
-            </w:pPr>
-            <w:r>
-              <w:rPr>
-                <w:rFonts w:ascii="Consolas" w:cs="Consolas" w:eastAsia="Consolas" w:hAnsi="Consolas"/>
-                <w:color w:val="9A958B"/>
-                <w:sz w:val="15"/>
-                <w:szCs w:val="15"/>
-              </w:rPr>
-              <w:t xml:space="preserve">B-590</w:t>
             </w:r>
           </w:p>
         </w:tc>
@@ -38505,6 +38454,57 @@
                 <w:sz w:val="15"/>
                 <w:szCs w:val="15"/>
               </w:rPr>
+              <w:t xml:space="preserve">B-590</w:t>
+            </w:r>
+          </w:p>
+        </w:tc>
+        <w:tc>
+          <w:tcPr>
+            <w:tcW w:type="dxa" w:w="7880"/>
+            <w:tcMar>
+              <w:top w:type="dxa" w:w="60"/>
+              <w:left w:type="dxa" w:w="90"/>
+              <w:bottom w:type="dxa" w:w="60"/>
+              <w:right w:type="dxa" w:w="90"/>
+            </w:tcMar>
+          </w:tcPr>
+          <w:p>
+            <w:pPr>
+              <w:spacing w:after="0" w:before="0"/>
+            </w:pPr>
+            <w:r>
+              <w:rPr>
+                <w:rFonts w:ascii="Calibri" w:cs="Calibri" w:eastAsia="Calibri" w:hAnsi="Calibri"/>
+                <w:sz w:val="21"/>
+                <w:szCs w:val="21"/>
+              </w:rPr>
+              <w:t xml:space="preserve">fast</w:t>
+            </w:r>
+          </w:p>
+        </w:tc>
+      </w:tr>
+      <w:tr>
+        <w:tc>
+          <w:tcPr>
+            <w:tcW w:type="dxa" w:w="1120"/>
+            <w:tcMar>
+              <w:top w:type="dxa" w:w="60"/>
+              <w:left w:type="dxa" w:w="90"/>
+              <w:bottom w:type="dxa" w:w="60"/>
+              <w:right w:type="dxa" w:w="90"/>
+            </w:tcMar>
+          </w:tcPr>
+          <w:p>
+            <w:pPr>
+              <w:spacing w:after="0"/>
+            </w:pPr>
+            <w:r>
+              <w:rPr>
+                <w:rFonts w:ascii="Consolas" w:cs="Consolas" w:eastAsia="Consolas" w:hAnsi="Consolas"/>
+                <w:color w:val="9A958B"/>
+                <w:sz w:val="15"/>
+                <w:szCs w:val="15"/>
+              </w:rPr>
               <w:t xml:space="preserve">B-591</w:t>
             </w:r>
           </w:p>
@@ -38529,7 +38529,7 @@
                 <w:sz w:val="21"/>
                 <w:szCs w:val="21"/>
               </w:rPr>
-              <w:t xml:space="preserve">fast</w:t>
+              <w:t xml:space="preserve">neu</w:t>
             </w:r>
           </w:p>
         </w:tc>
@@ -38580,7 +38580,7 @@
                 <w:sz w:val="21"/>
                 <w:szCs w:val="21"/>
               </w:rPr>
-              <w:t xml:space="preserve">neu</w:t>
+              <w:t xml:space="preserve">sitzt</w:t>
             </w:r>
           </w:p>
         </w:tc>
@@ -38631,7 +38631,7 @@
                 <w:sz w:val="21"/>
                 <w:szCs w:val="21"/>
               </w:rPr>
-              <w:t xml:space="preserve">sitzt</w:t>
+              <w:t xml:space="preserve">sitzt fast</w:t>
             </w:r>
           </w:p>
         </w:tc>
@@ -38682,7 +38682,7 @@
                 <w:sz w:val="21"/>
                 <w:szCs w:val="21"/>
               </w:rPr>
-              <w:t xml:space="preserve">sitzt fast</w:t>
+              <w:t xml:space="preserve">ungeübt</w:t>
             </w:r>
           </w:p>
         </w:tc>
@@ -38710,57 +38710,6 @@
                 <w:szCs w:val="15"/>
               </w:rPr>
               <w:t xml:space="preserve">B-595</w:t>
-            </w:r>
-          </w:p>
-        </w:tc>
-        <w:tc>
-          <w:tcPr>
-            <w:tcW w:type="dxa" w:w="7880"/>
-            <w:tcMar>
-              <w:top w:type="dxa" w:w="60"/>
-              <w:left w:type="dxa" w:w="90"/>
-              <w:bottom w:type="dxa" w:w="60"/>
-              <w:right w:type="dxa" w:w="90"/>
-            </w:tcMar>
-          </w:tcPr>
-          <w:p>
-            <w:pPr>
-              <w:spacing w:after="0" w:before="0"/>
-            </w:pPr>
-            <w:r>
-              <w:rPr>
-                <w:rFonts w:ascii="Calibri" w:cs="Calibri" w:eastAsia="Calibri" w:hAnsi="Calibri"/>
-                <w:sz w:val="21"/>
-                <w:szCs w:val="21"/>
-              </w:rPr>
-              <w:t xml:space="preserve">ungeübt</w:t>
-            </w:r>
-          </w:p>
-        </w:tc>
-      </w:tr>
-      <w:tr>
-        <w:tc>
-          <w:tcPr>
-            <w:tcW w:type="dxa" w:w="1120"/>
-            <w:tcMar>
-              <w:top w:type="dxa" w:w="60"/>
-              <w:left w:type="dxa" w:w="90"/>
-              <w:bottom w:type="dxa" w:w="60"/>
-              <w:right w:type="dxa" w:w="90"/>
-            </w:tcMar>
-          </w:tcPr>
-          <w:p>
-            <w:pPr>
-              <w:spacing w:after="0"/>
-            </w:pPr>
-            <w:r>
-              <w:rPr>
-                <w:rFonts w:ascii="Consolas" w:cs="Consolas" w:eastAsia="Consolas" w:hAnsi="Consolas"/>
-                <w:color w:val="9A958B"/>
-                <w:sz w:val="15"/>
-                <w:szCs w:val="15"/>
-              </w:rPr>
-              <w:t xml:space="preserve">B-596</w:t>
             </w:r>
           </w:p>
         </w:tc>
@@ -38909,6 +38858,57 @@
                 <w:sz w:val="15"/>
                 <w:szCs w:val="15"/>
               </w:rPr>
+              <w:t xml:space="preserve">B-596</w:t>
+            </w:r>
+          </w:p>
+        </w:tc>
+        <w:tc>
+          <w:tcPr>
+            <w:tcW w:type="dxa" w:w="7880"/>
+            <w:tcMar>
+              <w:top w:type="dxa" w:w="60"/>
+              <w:left w:type="dxa" w:w="90"/>
+              <w:bottom w:type="dxa" w:w="60"/>
+              <w:right w:type="dxa" w:w="90"/>
+            </w:tcMar>
+          </w:tcPr>
+          <w:p>
+            <w:pPr>
+              <w:spacing w:after="0" w:before="0"/>
+            </w:pPr>
+            <w:r>
+              <w:rPr>
+                <w:rFonts w:ascii="Calibri" w:cs="Calibri" w:eastAsia="Calibri" w:hAnsi="Calibri"/>
+                <w:sz w:val="21"/>
+                <w:szCs w:val="21"/>
+              </w:rPr>
+              <w:t xml:space="preserve">Auf Kurs</w:t>
+            </w:r>
+          </w:p>
+        </w:tc>
+      </w:tr>
+      <w:tr>
+        <w:tc>
+          <w:tcPr>
+            <w:tcW w:type="dxa" w:w="1120"/>
+            <w:tcMar>
+              <w:top w:type="dxa" w:w="60"/>
+              <w:left w:type="dxa" w:w="90"/>
+              <w:bottom w:type="dxa" w:w="60"/>
+              <w:right w:type="dxa" w:w="90"/>
+            </w:tcMar>
+          </w:tcPr>
+          <w:p>
+            <w:pPr>
+              <w:spacing w:after="0"/>
+            </w:pPr>
+            <w:r>
+              <w:rPr>
+                <w:rFonts w:ascii="Consolas" w:cs="Consolas" w:eastAsia="Consolas" w:hAnsi="Consolas"/>
+                <w:color w:val="9A958B"/>
+                <w:sz w:val="15"/>
+                <w:szCs w:val="15"/>
+              </w:rPr>
               <w:t xml:space="preserve">B-597</w:t>
             </w:r>
           </w:p>
@@ -38933,7 +38933,7 @@
                 <w:sz w:val="21"/>
                 <w:szCs w:val="21"/>
               </w:rPr>
-              <w:t xml:space="preserve">Auf Kurs</w:t>
+              <w:t xml:space="preserve">Im Rückstand</w:t>
             </w:r>
           </w:p>
         </w:tc>
@@ -38961,57 +38961,6 @@
                 <w:szCs w:val="15"/>
               </w:rPr>
               <w:t xml:space="preserve">B-598</w:t>
-            </w:r>
-          </w:p>
-        </w:tc>
-        <w:tc>
-          <w:tcPr>
-            <w:tcW w:type="dxa" w:w="7880"/>
-            <w:tcMar>
-              <w:top w:type="dxa" w:w="60"/>
-              <w:left w:type="dxa" w:w="90"/>
-              <w:bottom w:type="dxa" w:w="60"/>
-              <w:right w:type="dxa" w:w="90"/>
-            </w:tcMar>
-          </w:tcPr>
-          <w:p>
-            <w:pPr>
-              <w:spacing w:after="0" w:before="0"/>
-            </w:pPr>
-            <w:r>
-              <w:rPr>
-                <w:rFonts w:ascii="Calibri" w:cs="Calibri" w:eastAsia="Calibri" w:hAnsi="Calibri"/>
-                <w:sz w:val="21"/>
-                <w:szCs w:val="21"/>
-              </w:rPr>
-              <w:t xml:space="preserve">Im Rückstand</w:t>
-            </w:r>
-          </w:p>
-        </w:tc>
-      </w:tr>
-      <w:tr>
-        <w:tc>
-          <w:tcPr>
-            <w:tcW w:type="dxa" w:w="1120"/>
-            <w:tcMar>
-              <w:top w:type="dxa" w:w="60"/>
-              <w:left w:type="dxa" w:w="90"/>
-              <w:bottom w:type="dxa" w:w="60"/>
-              <w:right w:type="dxa" w:w="90"/>
-            </w:tcMar>
-          </w:tcPr>
-          <w:p>
-            <w:pPr>
-              <w:spacing w:after="0"/>
-            </w:pPr>
-            <w:r>
-              <w:rPr>
-                <w:rFonts w:ascii="Consolas" w:cs="Consolas" w:eastAsia="Consolas" w:hAnsi="Consolas"/>
-                <w:color w:val="9A958B"/>
-                <w:sz w:val="15"/>
-                <w:szCs w:val="15"/>
-              </w:rPr>
-              <w:t xml:space="preserve">B-599</w:t>
             </w:r>
           </w:p>
         </w:tc>
@@ -39160,6 +39109,57 @@
                 <w:sz w:val="15"/>
                 <w:szCs w:val="15"/>
               </w:rPr>
+              <w:t xml:space="preserve">B-599</w:t>
+            </w:r>
+          </w:p>
+        </w:tc>
+        <w:tc>
+          <w:tcPr>
+            <w:tcW w:type="dxa" w:w="7880"/>
+            <w:tcMar>
+              <w:top w:type="dxa" w:w="60"/>
+              <w:left w:type="dxa" w:w="90"/>
+              <w:bottom w:type="dxa" w:w="60"/>
+              <w:right w:type="dxa" w:w="90"/>
+            </w:tcMar>
+          </w:tcPr>
+          <w:p>
+            <w:pPr>
+              <w:spacing w:after="0" w:before="0"/>
+            </w:pPr>
+            <w:r>
+              <w:rPr>
+                <w:rFonts w:ascii="Calibri" w:cs="Calibri" w:eastAsia="Calibri" w:hAnsi="Calibri"/>
+                <w:sz w:val="21"/>
+                <w:szCs w:val="21"/>
+              </w:rPr>
+              <w:t xml:space="preserve">Adjektiv</w:t>
+            </w:r>
+          </w:p>
+        </w:tc>
+      </w:tr>
+      <w:tr>
+        <w:tc>
+          <w:tcPr>
+            <w:tcW w:type="dxa" w:w="1120"/>
+            <w:tcMar>
+              <w:top w:type="dxa" w:w="60"/>
+              <w:left w:type="dxa" w:w="90"/>
+              <w:bottom w:type="dxa" w:w="60"/>
+              <w:right w:type="dxa" w:w="90"/>
+            </w:tcMar>
+          </w:tcPr>
+          <w:p>
+            <w:pPr>
+              <w:spacing w:after="0"/>
+            </w:pPr>
+            <w:r>
+              <w:rPr>
+                <w:rFonts w:ascii="Consolas" w:cs="Consolas" w:eastAsia="Consolas" w:hAnsi="Consolas"/>
+                <w:color w:val="9A958B"/>
+                <w:sz w:val="15"/>
+                <w:szCs w:val="15"/>
+              </w:rPr>
               <w:t xml:space="preserve">B-600</w:t>
             </w:r>
           </w:p>
@@ -39184,7 +39184,7 @@
                 <w:sz w:val="21"/>
                 <w:szCs w:val="21"/>
               </w:rPr>
-              <w:t xml:space="preserve">Adjektiv</w:t>
+              <w:t xml:space="preserve">Adverb</w:t>
             </w:r>
           </w:p>
         </w:tc>
@@ -39235,7 +39235,7 @@
                 <w:sz w:val="21"/>
                 <w:szCs w:val="21"/>
               </w:rPr>
-              <w:t xml:space="preserve">Adverb</w:t>
+              <w:t xml:space="preserve">Beispielsatz 1 deutsch</w:t>
             </w:r>
           </w:p>
         </w:tc>
@@ -39286,7 +39286,7 @@
                 <w:sz w:val="21"/>
                 <w:szCs w:val="21"/>
               </w:rPr>
-              <w:t xml:space="preserve">Beispielsatz 1 deutsch</w:t>
+              <w:t xml:space="preserve">Beispielsatz 2 deutsch</w:t>
             </w:r>
           </w:p>
         </w:tc>
@@ -39337,7 +39337,7 @@
                 <w:sz w:val="21"/>
                 <w:szCs w:val="21"/>
               </w:rPr>
-              <w:t xml:space="preserve">Beispielsatz 2 deutsch</w:t>
+              <w:t xml:space="preserve">Deutsch</w:t>
             </w:r>
           </w:p>
         </w:tc>
@@ -39388,7 +39388,7 @@
                 <w:sz w:val="21"/>
                 <w:szCs w:val="21"/>
               </w:rPr>
-              <w:t xml:space="preserve">Deutsch</w:t>
+              <w:t xml:space="preserve">f pl</w:t>
             </w:r>
           </w:p>
         </w:tc>
@@ -39439,7 +39439,7 @@
                 <w:sz w:val="21"/>
                 <w:szCs w:val="21"/>
               </w:rPr>
-              <w:t xml:space="preserve">f pl</w:t>
+              <w:t xml:space="preserve">Genus</w:t>
             </w:r>
           </w:p>
         </w:tc>
@@ -39490,7 +39490,7 @@
                 <w:sz w:val="21"/>
                 <w:szCs w:val="21"/>
               </w:rPr>
-              <w:t xml:space="preserve">Genus</w:t>
+              <w:t xml:space="preserve">Konjunktion</w:t>
             </w:r>
           </w:p>
         </w:tc>
@@ -39541,7 +39541,7 @@
                 <w:sz w:val="21"/>
                 <w:szCs w:val="21"/>
               </w:rPr>
-              <w:t xml:space="preserve">Konjunktion</w:t>
+              <w:t xml:space="preserve">m pl</w:t>
             </w:r>
           </w:p>
         </w:tc>
@@ -39592,7 +39592,7 @@
                 <w:sz w:val="21"/>
                 <w:szCs w:val="21"/>
               </w:rPr>
-              <w:t xml:space="preserve">m pl</w:t>
+              <w:t xml:space="preserve">männlich</w:t>
             </w:r>
           </w:p>
         </w:tc>
@@ -39643,7 +39643,7 @@
                 <w:sz w:val="21"/>
                 <w:szCs w:val="21"/>
               </w:rPr>
-              <w:t xml:space="preserve">männlich</w:t>
+              <w:t xml:space="preserve">männlich, nur Plural</w:t>
             </w:r>
           </w:p>
         </w:tc>
@@ -39694,7 +39694,7 @@
                 <w:sz w:val="21"/>
                 <w:szCs w:val="21"/>
               </w:rPr>
-              <w:t xml:space="preserve">männlich, nur Plural</w:t>
+              <w:t xml:space="preserve">n pl</w:t>
             </w:r>
           </w:p>
         </w:tc>
@@ -39745,7 +39745,7 @@
                 <w:sz w:val="21"/>
                 <w:szCs w:val="21"/>
               </w:rPr>
-              <w:t xml:space="preserve">n pl</w:t>
+              <w:t xml:space="preserve">Nomen</w:t>
             </w:r>
           </w:p>
         </w:tc>
@@ -39796,7 +39796,7 @@
                 <w:sz w:val="21"/>
                 <w:szCs w:val="21"/>
               </w:rPr>
-              <w:t xml:space="preserve">Nomen</w:t>
+              <w:t xml:space="preserve">nur Plural</w:t>
             </w:r>
           </w:p>
         </w:tc>
@@ -39847,7 +39847,7 @@
                 <w:sz w:val="21"/>
                 <w:szCs w:val="21"/>
               </w:rPr>
-              <w:t xml:space="preserve">nur Plural</w:t>
+              <w:t xml:space="preserve">Präposition</w:t>
             </w:r>
           </w:p>
         </w:tc>
@@ -39898,7 +39898,7 @@
                 <w:sz w:val="21"/>
                 <w:szCs w:val="21"/>
               </w:rPr>
-              <w:t xml:space="preserve">Präposition</w:t>
+              <w:t xml:space="preserve">Pronomen</w:t>
             </w:r>
           </w:p>
         </w:tc>
@@ -39949,7 +39949,7 @@
                 <w:sz w:val="21"/>
                 <w:szCs w:val="21"/>
               </w:rPr>
-              <w:t xml:space="preserve">Pronomen</w:t>
+              <w:t xml:space="preserve">sächlich</w:t>
             </w:r>
           </w:p>
         </w:tc>
@@ -40000,7 +40000,7 @@
                 <w:sz w:val="21"/>
                 <w:szCs w:val="21"/>
               </w:rPr>
-              <w:t xml:space="preserve">sächlich</w:t>
+              <w:t xml:space="preserve">sächlich, nur Plural</w:t>
             </w:r>
           </w:p>
         </w:tc>
@@ -40051,7 +40051,7 @@
                 <w:sz w:val="21"/>
                 <w:szCs w:val="21"/>
               </w:rPr>
-              <w:t xml:space="preserve">sächlich, nur Plural</w:t>
+              <w:t xml:space="preserve">Verb</w:t>
             </w:r>
           </w:p>
         </w:tc>
@@ -40102,7 +40102,7 @@
                 <w:sz w:val="21"/>
                 <w:szCs w:val="21"/>
               </w:rPr>
-              <w:t xml:space="preserve">Verb</w:t>
+              <w:t xml:space="preserve">weiblich, nur Plural</w:t>
             </w:r>
           </w:p>
         </w:tc>
@@ -40153,7 +40153,7 @@
                 <w:sz w:val="21"/>
                 <w:szCs w:val="21"/>
               </w:rPr>
-              <w:t xml:space="preserve">weiblich, nur Plural</w:t>
+              <w:t xml:space="preserve">Wendung</w:t>
             </w:r>
           </w:p>
         </w:tc>
@@ -40181,57 +40181,6 @@
                 <w:szCs w:val="15"/>
               </w:rPr>
               <w:t xml:space="preserve">B-620</w:t>
-            </w:r>
-          </w:p>
-        </w:tc>
-        <w:tc>
-          <w:tcPr>
-            <w:tcW w:type="dxa" w:w="7880"/>
-            <w:tcMar>
-              <w:top w:type="dxa" w:w="60"/>
-              <w:left w:type="dxa" w:w="90"/>
-              <w:bottom w:type="dxa" w:w="60"/>
-              <w:right w:type="dxa" w:w="90"/>
-            </w:tcMar>
-          </w:tcPr>
-          <w:p>
-            <w:pPr>
-              <w:spacing w:after="0" w:before="0"/>
-            </w:pPr>
-            <w:r>
-              <w:rPr>
-                <w:rFonts w:ascii="Calibri" w:cs="Calibri" w:eastAsia="Calibri" w:hAnsi="Calibri"/>
-                <w:sz w:val="21"/>
-                <w:szCs w:val="21"/>
-              </w:rPr>
-              <w:t xml:space="preserve">Wendung</w:t>
-            </w:r>
-          </w:p>
-        </w:tc>
-      </w:tr>
-      <w:tr>
-        <w:tc>
-          <w:tcPr>
-            <w:tcW w:type="dxa" w:w="1120"/>
-            <w:tcMar>
-              <w:top w:type="dxa" w:w="60"/>
-              <w:left w:type="dxa" w:w="90"/>
-              <w:bottom w:type="dxa" w:w="60"/>
-              <w:right w:type="dxa" w:w="90"/>
-            </w:tcMar>
-          </w:tcPr>
-          <w:p>
-            <w:pPr>
-              <w:spacing w:after="0"/>
-            </w:pPr>
-            <w:r>
-              <w:rPr>
-                <w:rFonts w:ascii="Consolas" w:cs="Consolas" w:eastAsia="Consolas" w:hAnsi="Consolas"/>
-                <w:color w:val="9A958B"/>
-                <w:sz w:val="15"/>
-                <w:szCs w:val="15"/>
-              </w:rPr>
-              <w:t xml:space="preserve">B-621</w:t>
             </w:r>
           </w:p>
         </w:tc>
@@ -40380,6 +40329,57 @@
                 <w:sz w:val="15"/>
                 <w:szCs w:val="15"/>
               </w:rPr>
+              <w:t xml:space="preserve">B-621</w:t>
+            </w:r>
+          </w:p>
+        </w:tc>
+        <w:tc>
+          <w:tcPr>
+            <w:tcW w:type="dxa" w:w="7880"/>
+            <w:tcMar>
+              <w:top w:type="dxa" w:w="60"/>
+              <w:left w:type="dxa" w:w="90"/>
+              <w:bottom w:type="dxa" w:w="60"/>
+              <w:right w:type="dxa" w:w="90"/>
+            </w:tcMar>
+          </w:tcPr>
+          <w:p>
+            <w:pPr>
+              <w:spacing w:after="0" w:before="0"/>
+            </w:pPr>
+            <w:r>
+              <w:rPr>
+                <w:rFonts w:ascii="Calibri" w:cs="Calibri" w:eastAsia="Calibri" w:hAnsi="Calibri"/>
+                <w:sz w:val="21"/>
+                <w:szCs w:val="21"/>
+              </w:rPr>
+              <w:t xml:space="preserve">Englisch</w:t>
+            </w:r>
+          </w:p>
+        </w:tc>
+      </w:tr>
+      <w:tr>
+        <w:tc>
+          <w:tcPr>
+            <w:tcW w:type="dxa" w:w="1120"/>
+            <w:tcMar>
+              <w:top w:type="dxa" w:w="60"/>
+              <w:left w:type="dxa" w:w="90"/>
+              <w:bottom w:type="dxa" w:w="60"/>
+              <w:right w:type="dxa" w:w="90"/>
+            </w:tcMar>
+          </w:tcPr>
+          <w:p>
+            <w:pPr>
+              <w:spacing w:after="0"/>
+            </w:pPr>
+            <w:r>
+              <w:rPr>
+                <w:rFonts w:ascii="Consolas" w:cs="Consolas" w:eastAsia="Consolas" w:hAnsi="Consolas"/>
+                <w:color w:val="9A958B"/>
+                <w:sz w:val="15"/>
+                <w:szCs w:val="15"/>
+              </w:rPr>
               <w:t xml:space="preserve">B-622</w:t>
             </w:r>
           </w:p>
@@ -40404,7 +40404,7 @@
                 <w:sz w:val="21"/>
                 <w:szCs w:val="21"/>
               </w:rPr>
-              <w:t xml:space="preserve">Englisch</w:t>
+              <w:t xml:space="preserve">Französisch</w:t>
             </w:r>
           </w:p>
         </w:tc>
@@ -40455,7 +40455,7 @@
                 <w:sz w:val="21"/>
                 <w:szCs w:val="21"/>
               </w:rPr>
-              <w:t xml:space="preserve">Französisch</w:t>
+              <w:t xml:space="preserve">Italienisch</w:t>
             </w:r>
           </w:p>
         </w:tc>
@@ -40506,7 +40506,7 @@
                 <w:sz w:val="21"/>
                 <w:szCs w:val="21"/>
               </w:rPr>
-              <w:t xml:space="preserve">Italienisch</w:t>
+              <w:t xml:space="preserve">Portugiesisch</w:t>
             </w:r>
           </w:p>
         </w:tc>
@@ -40534,57 +40534,6 @@
                 <w:szCs w:val="15"/>
               </w:rPr>
               <w:t xml:space="preserve">B-625</w:t>
-            </w:r>
-          </w:p>
-        </w:tc>
-        <w:tc>
-          <w:tcPr>
-            <w:tcW w:type="dxa" w:w="7880"/>
-            <w:tcMar>
-              <w:top w:type="dxa" w:w="60"/>
-              <w:left w:type="dxa" w:w="90"/>
-              <w:bottom w:type="dxa" w:w="60"/>
-              <w:right w:type="dxa" w:w="90"/>
-            </w:tcMar>
-          </w:tcPr>
-          <w:p>
-            <w:pPr>
-              <w:spacing w:after="0" w:before="0"/>
-            </w:pPr>
-            <w:r>
-              <w:rPr>
-                <w:rFonts w:ascii="Calibri" w:cs="Calibri" w:eastAsia="Calibri" w:hAnsi="Calibri"/>
-                <w:sz w:val="21"/>
-                <w:szCs w:val="21"/>
-              </w:rPr>
-              <w:t xml:space="preserve">Portugiesisch</w:t>
-            </w:r>
-          </w:p>
-        </w:tc>
-      </w:tr>
-      <w:tr>
-        <w:tc>
-          <w:tcPr>
-            <w:tcW w:type="dxa" w:w="1120"/>
-            <w:tcMar>
-              <w:top w:type="dxa" w:w="60"/>
-              <w:left w:type="dxa" w:w="90"/>
-              <w:bottom w:type="dxa" w:w="60"/>
-              <w:right w:type="dxa" w:w="90"/>
-            </w:tcMar>
-          </w:tcPr>
-          <w:p>
-            <w:pPr>
-              <w:spacing w:after="0"/>
-            </w:pPr>
-            <w:r>
-              <w:rPr>
-                <w:rFonts w:ascii="Consolas" w:cs="Consolas" w:eastAsia="Consolas" w:hAnsi="Consolas"/>
-                <w:color w:val="9A958B"/>
-                <w:sz w:val="15"/>
-                <w:szCs w:val="15"/>
-              </w:rPr>
-              <w:t xml:space="preserve">B-626</w:t>
             </w:r>
           </w:p>
         </w:tc>
@@ -40733,6 +40682,57 @@
                 <w:sz w:val="15"/>
                 <w:szCs w:val="15"/>
               </w:rPr>
+              <w:t xml:space="preserve">B-626</w:t>
+            </w:r>
+          </w:p>
+        </w:tc>
+        <w:tc>
+          <w:tcPr>
+            <w:tcW w:type="dxa" w:w="7880"/>
+            <w:tcMar>
+              <w:top w:type="dxa" w:w="60"/>
+              <w:left w:type="dxa" w:w="90"/>
+              <w:bottom w:type="dxa" w:w="60"/>
+              <w:right w:type="dxa" w:w="90"/>
+            </w:tcMar>
+          </w:tcPr>
+          <w:p>
+            <w:pPr>
+              <w:spacing w:after="0" w:before="0"/>
+            </w:pPr>
+            <w:r>
+              <w:rPr>
+                <w:rFonts w:ascii="Calibri" w:cs="Calibri" w:eastAsia="Calibri" w:hAnsi="Calibri"/>
+                <w:sz w:val="21"/>
+                <w:szCs w:val="21"/>
+              </w:rPr>
+              <w:t xml:space="preserve">Anmelden</w:t>
+            </w:r>
+          </w:p>
+        </w:tc>
+      </w:tr>
+      <w:tr>
+        <w:tc>
+          <w:tcPr>
+            <w:tcW w:type="dxa" w:w="1120"/>
+            <w:tcMar>
+              <w:top w:type="dxa" w:w="60"/>
+              <w:left w:type="dxa" w:w="90"/>
+              <w:bottom w:type="dxa" w:w="60"/>
+              <w:right w:type="dxa" w:w="90"/>
+            </w:tcMar>
+          </w:tcPr>
+          <w:p>
+            <w:pPr>
+              <w:spacing w:after="0"/>
+            </w:pPr>
+            <w:r>
+              <w:rPr>
+                <w:rFonts w:ascii="Consolas" w:cs="Consolas" w:eastAsia="Consolas" w:hAnsi="Consolas"/>
+                <w:color w:val="9A958B"/>
+                <w:sz w:val="15"/>
+                <w:szCs w:val="15"/>
+              </w:rPr>
               <w:t xml:space="preserve">B-627</w:t>
             </w:r>
           </w:p>
@@ -40757,7 +40757,7 @@
                 <w:sz w:val="21"/>
                 <w:szCs w:val="21"/>
               </w:rPr>
-              <w:t xml:space="preserve">Anmelden</w:t>
+              <w:t xml:space="preserve">Einstellungen</w:t>
             </w:r>
           </w:p>
         </w:tc>
@@ -40808,7 +40808,7 @@
                 <w:sz w:val="21"/>
                 <w:szCs w:val="21"/>
               </w:rPr>
-              <w:t xml:space="preserve">Einstellungen</w:t>
+              <w:t xml:space="preserve">Konto</w:t>
             </w:r>
           </w:p>
         </w:tc>
@@ -40859,7 +40859,7 @@
                 <w:sz w:val="21"/>
                 <w:szCs w:val="21"/>
               </w:rPr>
-              <w:t xml:space="preserve">Konto</w:t>
+              <w:t xml:space="preserve">Konto &amp; Abgleich</w:t>
             </w:r>
           </w:p>
         </w:tc>
@@ -40910,7 +40910,7 @@
                 <w:sz w:val="21"/>
                 <w:szCs w:val="21"/>
               </w:rPr>
-              <w:t xml:space="preserve">Konto &amp; Abgleich</w:t>
+              <w:t xml:space="preserve">SmartVoc</w:t>
             </w:r>
           </w:p>
         </w:tc>
@@ -40961,7 +40961,7 @@
                 <w:sz w:val="21"/>
                 <w:szCs w:val="21"/>
               </w:rPr>
-              <w:t xml:space="preserve">SmartVoc</w:t>
+              <w:t xml:space="preserve">Üben</w:t>
             </w:r>
           </w:p>
         </w:tc>
@@ -41012,7 +41012,7 @@
                 <w:sz w:val="21"/>
                 <w:szCs w:val="21"/>
               </w:rPr>
-              <w:t xml:space="preserve">Üben</w:t>
+              <w:t xml:space="preserve">Übungsplan</w:t>
             </w:r>
           </w:p>
         </w:tc>
@@ -41040,57 +41040,6 @@
                 <w:szCs w:val="15"/>
               </w:rPr>
               <w:t xml:space="preserve">B-633</w:t>
-            </w:r>
-          </w:p>
-        </w:tc>
-        <w:tc>
-          <w:tcPr>
-            <w:tcW w:type="dxa" w:w="7880"/>
-            <w:tcMar>
-              <w:top w:type="dxa" w:w="60"/>
-              <w:left w:type="dxa" w:w="90"/>
-              <w:bottom w:type="dxa" w:w="60"/>
-              <w:right w:type="dxa" w:w="90"/>
-            </w:tcMar>
-          </w:tcPr>
-          <w:p>
-            <w:pPr>
-              <w:spacing w:after="0" w:before="0"/>
-            </w:pPr>
-            <w:r>
-              <w:rPr>
-                <w:rFonts w:ascii="Calibri" w:cs="Calibri" w:eastAsia="Calibri" w:hAnsi="Calibri"/>
-                <w:sz w:val="21"/>
-                <w:szCs w:val="21"/>
-              </w:rPr>
-              <w:t xml:space="preserve">Übungsplan</w:t>
-            </w:r>
-          </w:p>
-        </w:tc>
-      </w:tr>
-      <w:tr>
-        <w:tc>
-          <w:tcPr>
-            <w:tcW w:type="dxa" w:w="1120"/>
-            <w:tcMar>
-              <w:top w:type="dxa" w:w="60"/>
-              <w:left w:type="dxa" w:w="90"/>
-              <w:bottom w:type="dxa" w:w="60"/>
-              <w:right w:type="dxa" w:w="90"/>
-            </w:tcMar>
-          </w:tcPr>
-          <w:p>
-            <w:pPr>
-              <w:spacing w:after="0"/>
-            </w:pPr>
-            <w:r>
-              <w:rPr>
-                <w:rFonts w:ascii="Consolas" w:cs="Consolas" w:eastAsia="Consolas" w:hAnsi="Consolas"/>
-                <w:color w:val="9A958B"/>
-                <w:sz w:val="15"/>
-                <w:szCs w:val="15"/>
-              </w:rPr>
-              <w:t xml:space="preserve">B-634</w:t>
             </w:r>
           </w:p>
         </w:tc>
@@ -41239,6 +41188,57 @@
                 <w:sz w:val="15"/>
                 <w:szCs w:val="15"/>
               </w:rPr>
+              <w:t xml:space="preserve">B-634</w:t>
+            </w:r>
+          </w:p>
+        </w:tc>
+        <w:tc>
+          <w:tcPr>
+            <w:tcW w:type="dxa" w:w="7880"/>
+            <w:tcMar>
+              <w:top w:type="dxa" w:w="60"/>
+              <w:left w:type="dxa" w:w="90"/>
+              <w:bottom w:type="dxa" w:w="60"/>
+              <w:right w:type="dxa" w:w="90"/>
+            </w:tcMar>
+          </w:tcPr>
+          <w:p>
+            <w:pPr>
+              <w:spacing w:after="0" w:before="0"/>
+            </w:pPr>
+            <w:r>
+              <w:rPr>
+                <w:rFonts w:ascii="Calibri" w:cs="Calibri" w:eastAsia="Calibri" w:hAnsi="Calibri"/>
+                <w:sz w:val="21"/>
+                <w:szCs w:val="21"/>
+              </w:rPr>
+              <w:t xml:space="preserve">1 Liste</w:t>
+            </w:r>
+          </w:p>
+        </w:tc>
+      </w:tr>
+      <w:tr>
+        <w:tc>
+          <w:tcPr>
+            <w:tcW w:type="dxa" w:w="1120"/>
+            <w:tcMar>
+              <w:top w:type="dxa" w:w="60"/>
+              <w:left w:type="dxa" w:w="90"/>
+              <w:bottom w:type="dxa" w:w="60"/>
+              <w:right w:type="dxa" w:w="90"/>
+            </w:tcMar>
+          </w:tcPr>
+          <w:p>
+            <w:pPr>
+              <w:spacing w:after="0"/>
+            </w:pPr>
+            <w:r>
+              <w:rPr>
+                <w:rFonts w:ascii="Consolas" w:cs="Consolas" w:eastAsia="Consolas" w:hAnsi="Consolas"/>
+                <w:color w:val="9A958B"/>
+                <w:sz w:val="15"/>
+                <w:szCs w:val="15"/>
+              </w:rPr>
               <w:t xml:space="preserve">B-635</w:t>
             </w:r>
           </w:p>
@@ -41263,7 +41263,7 @@
                 <w:sz w:val="21"/>
                 <w:szCs w:val="21"/>
               </w:rPr>
-              <w:t xml:space="preserve">1 Liste</w:t>
+              <w:t xml:space="preserve">1× lesen, 4× abfragen</w:t>
             </w:r>
           </w:p>
         </w:tc>
@@ -41314,7 +41314,7 @@
                 <w:sz w:val="21"/>
                 <w:szCs w:val="21"/>
               </w:rPr>
-              <w:t xml:space="preserve">1× lesen, 4× abfragen</w:t>
+              <w:t xml:space="preserve">2 Listen</w:t>
             </w:r>
           </w:p>
         </w:tc>
@@ -41365,7 +41365,7 @@
                 <w:sz w:val="21"/>
                 <w:szCs w:val="21"/>
               </w:rPr>
-              <w:t xml:space="preserve">2 Listen</w:t>
+              <w:t xml:space="preserve">5× durchlesen</w:t>
             </w:r>
           </w:p>
         </w:tc>
@@ -41416,7 +41416,7 @@
                 <w:sz w:val="21"/>
                 <w:szCs w:val="21"/>
               </w:rPr>
-              <w:t xml:space="preserve">5× durchlesen</w:t>
+              <w:t xml:space="preserve">auf Kurs</w:t>
             </w:r>
           </w:p>
         </w:tc>
@@ -41467,7 +41467,7 @@
                 <w:sz w:val="21"/>
                 <w:szCs w:val="21"/>
               </w:rPr>
-              <w:t xml:space="preserve">auf Kurs</w:t>
+              <w:t xml:space="preserve">blättern</w:t>
             </w:r>
           </w:p>
         </w:tc>
@@ -41518,7 +41518,7 @@
                 <w:sz w:val="21"/>
                 <w:szCs w:val="21"/>
               </w:rPr>
-              <w:t xml:space="preserve">blättern</w:t>
+              <w:t xml:space="preserve">bleibt hängen</w:t>
             </w:r>
           </w:p>
         </w:tc>
@@ -41569,7 +41569,7 @@
                 <w:sz w:val="21"/>
                 <w:szCs w:val="21"/>
               </w:rPr>
-              <w:t xml:space="preserve">bleibt hängen</w:t>
+              <w:t xml:space="preserve">der Baum</w:t>
             </w:r>
           </w:p>
         </w:tc>
@@ -41620,7 +41620,7 @@
                 <w:sz w:val="21"/>
                 <w:szCs w:val="21"/>
               </w:rPr>
-              <w:t xml:space="preserve">der Baum</w:t>
+              <w:t xml:space="preserve">Der Baum ist hoch.</w:t>
             </w:r>
           </w:p>
         </w:tc>
@@ -41671,7 +41671,7 @@
                 <w:sz w:val="21"/>
                 <w:szCs w:val="21"/>
               </w:rPr>
-              <w:t xml:space="preserve">Der Baum ist hoch.</w:t>
+              <w:t xml:space="preserve">der Schlüssel</w:t>
             </w:r>
           </w:p>
         </w:tc>
@@ -41722,7 +41722,7 @@
                 <w:sz w:val="21"/>
                 <w:szCs w:val="21"/>
               </w:rPr>
-              <w:t xml:space="preserve">der Schlüssel</w:t>
+              <w:t xml:space="preserve">Endspurt</w:t>
             </w:r>
           </w:p>
         </w:tc>
@@ -41773,7 +41773,7 @@
                 <w:sz w:val="21"/>
                 <w:szCs w:val="21"/>
               </w:rPr>
-              <w:t xml:space="preserve">Endspurt</w:t>
+              <w:t xml:space="preserve">Fehler</w:t>
             </w:r>
           </w:p>
         </w:tc>
@@ -41824,7 +41824,7 @@
                 <w:sz w:val="21"/>
                 <w:szCs w:val="21"/>
               </w:rPr>
-              <w:t xml:space="preserve">Fehler</w:t>
+              <w:t xml:space="preserve">Foto</w:t>
             </w:r>
           </w:p>
         </w:tc>
@@ -41875,7 +41875,7 @@
                 <w:sz w:val="21"/>
                 <w:szCs w:val="21"/>
               </w:rPr>
-              <w:t xml:space="preserve">Foto</w:t>
+              <w:t xml:space="preserve">Frage</w:t>
             </w:r>
           </w:p>
         </w:tc>
@@ -41926,7 +41926,7 @@
                 <w:sz w:val="21"/>
                 <w:szCs w:val="21"/>
               </w:rPr>
-              <w:t xml:space="preserve">Frage</w:t>
+              <w:t xml:space="preserve">fühlt sich sicher an</w:t>
             </w:r>
           </w:p>
         </w:tc>
@@ -41977,7 +41977,7 @@
                 <w:sz w:val="21"/>
                 <w:szCs w:val="21"/>
               </w:rPr>
-              <w:t xml:space="preserve">fühlt sich sicher an</w:t>
+              <w:t xml:space="preserve">im Rückstand</w:t>
             </w:r>
           </w:p>
         </w:tc>
@@ -42028,7 +42028,7 @@
                 <w:sz w:val="21"/>
                 <w:szCs w:val="21"/>
               </w:rPr>
-              <w:t xml:space="preserve">im Rückstand</w:t>
+              <w:t xml:space="preserve">immer richtig</w:t>
             </w:r>
           </w:p>
         </w:tc>
@@ -42079,7 +42079,7 @@
                 <w:sz w:val="21"/>
                 <w:szCs w:val="21"/>
               </w:rPr>
-              <w:t xml:space="preserve">immer richtig</w:t>
+              <w:t xml:space="preserve">ist weg</w:t>
             </w:r>
           </w:p>
         </w:tc>
@@ -42130,7 +42130,7 @@
                 <w:sz w:val="21"/>
                 <w:szCs w:val="21"/>
               </w:rPr>
-              <w:t xml:space="preserve">ist weg</w:t>
+              <w:t xml:space="preserve">Lösung</w:t>
             </w:r>
           </w:p>
         </w:tc>
@@ -42181,7 +42181,7 @@
                 <w:sz w:val="21"/>
                 <w:szCs w:val="21"/>
               </w:rPr>
-              <w:t xml:space="preserve">Lösung</w:t>
+              <w:t xml:space="preserve">mit Fehler</w:t>
             </w:r>
           </w:p>
         </w:tc>
@@ -42232,7 +42232,7 @@
                 <w:sz w:val="21"/>
                 <w:szCs w:val="21"/>
               </w:rPr>
-              <w:t xml:space="preserve">mit Fehler</w:t>
+              <w:t xml:space="preserve">mit Zieldatum</w:t>
             </w:r>
           </w:p>
         </w:tc>
@@ -42283,7 +42283,7 @@
                 <w:sz w:val="21"/>
                 <w:szCs w:val="21"/>
               </w:rPr>
-              <w:t xml:space="preserve">mit Zieldatum</w:t>
+              <w:t xml:space="preserve">ohne Wiederholen</w:t>
             </w:r>
           </w:p>
         </w:tc>
@@ -42334,7 +42334,7 @@
                 <w:sz w:val="21"/>
                 <w:szCs w:val="21"/>
               </w:rPr>
-              <w:t xml:space="preserve">ohne Wiederholen</w:t>
+              <w:t xml:space="preserve">ohne Zieldatum</w:t>
             </w:r>
           </w:p>
         </w:tc>
@@ -42385,7 +42385,7 @@
                 <w:sz w:val="21"/>
                 <w:szCs w:val="21"/>
               </w:rPr>
-              <w:t xml:space="preserve">ohne Zieldatum</w:t>
+              <w:t xml:space="preserve">prüfen</w:t>
             </w:r>
           </w:p>
         </w:tc>
@@ -42436,7 +42436,7 @@
                 <w:sz w:val="21"/>
                 <w:szCs w:val="21"/>
               </w:rPr>
-              <w:t xml:space="preserve">prüfen</w:t>
+              <w:t xml:space="preserve">Prüfung</w:t>
             </w:r>
           </w:p>
         </w:tc>
@@ -42487,7 +42487,7 @@
                 <w:sz w:val="21"/>
                 <w:szCs w:val="21"/>
               </w:rPr>
-              <w:t xml:space="preserve">Prüfung</w:t>
+              <w:t xml:space="preserve">üben</w:t>
             </w:r>
           </w:p>
         </w:tc>
@@ -42538,7 +42538,7 @@
                 <w:sz w:val="21"/>
                 <w:szCs w:val="21"/>
               </w:rPr>
-              <w:t xml:space="preserve">üben</w:t>
+              <w:t xml:space="preserve">weißt du noch</w:t>
             </w:r>
           </w:p>
         </w:tc>
@@ -42589,7 +42589,7 @@
                 <w:sz w:val="21"/>
                 <w:szCs w:val="21"/>
               </w:rPr>
-              <w:t xml:space="preserve">weißt du noch</w:t>
+              <w:t xml:space="preserve">wieder von vorn</w:t>
             </w:r>
           </w:p>
         </w:tc>
@@ -42640,7 +42640,7 @@
                 <w:sz w:val="21"/>
                 <w:szCs w:val="21"/>
               </w:rPr>
-              <w:t xml:space="preserve">wieder von vorn</w:t>
+              <w:t xml:space="preserve">Wörter ansehen</w:t>
             </w:r>
           </w:p>
         </w:tc>
@@ -42691,7 +42691,7 @@
                 <w:sz w:val="21"/>
                 <w:szCs w:val="21"/>
               </w:rPr>
-              <w:t xml:space="preserve">Wörter ansehen</w:t>
+              <w:t xml:space="preserve">zählen für deinen Lernstand</w:t>
             </w:r>
           </w:p>
         </w:tc>
@@ -42742,7 +42742,7 @@
                 <w:sz w:val="21"/>
                 <w:szCs w:val="21"/>
               </w:rPr>
-              <w:t xml:space="preserve">zählen für deinen Lernstand</w:t>
+              <w:t xml:space="preserve">zählt nicht</w:t>
             </w:r>
           </w:p>
         </w:tc>
@@ -42793,7 +42793,7 @@
                 <w:sz w:val="21"/>
                 <w:szCs w:val="21"/>
               </w:rPr>
-              <w:t xml:space="preserve">zählt nicht</w:t>
+              <w:t xml:space="preserve">Zeit →</w:t>
             </w:r>
           </w:p>
         </w:tc>
@@ -42844,7 +42844,7 @@
                 <w:sz w:val="21"/>
                 <w:szCs w:val="21"/>
               </w:rPr>
-              <w:t xml:space="preserve">Zeit →</w:t>
+              <w:t xml:space="preserve">zu früh</w:t>
             </w:r>
           </w:p>
         </w:tc>
@@ -42895,7 +42895,7 @@
                 <w:sz w:val="21"/>
                 <w:szCs w:val="21"/>
               </w:rPr>
-              <w:t xml:space="preserve">zu früh</w:t>
+              <w:t xml:space="preserve">zu spät</w:t>
             </w:r>
           </w:p>
         </w:tc>
@@ -42923,57 +42923,6 @@
                 <w:szCs w:val="15"/>
               </w:rPr>
               <w:t xml:space="preserve">B-668</w:t>
-            </w:r>
-          </w:p>
-        </w:tc>
-        <w:tc>
-          <w:tcPr>
-            <w:tcW w:type="dxa" w:w="7880"/>
-            <w:tcMar>
-              <w:top w:type="dxa" w:w="60"/>
-              <w:left w:type="dxa" w:w="90"/>
-              <w:bottom w:type="dxa" w:w="60"/>
-              <w:right w:type="dxa" w:w="90"/>
-            </w:tcMar>
-          </w:tcPr>
-          <w:p>
-            <w:pPr>
-              <w:spacing w:after="0" w:before="0"/>
-            </w:pPr>
-            <w:r>
-              <w:rPr>
-                <w:rFonts w:ascii="Calibri" w:cs="Calibri" w:eastAsia="Calibri" w:hAnsi="Calibri"/>
-                <w:sz w:val="21"/>
-                <w:szCs w:val="21"/>
-              </w:rPr>
-              <w:t xml:space="preserve">zu spät</w:t>
-            </w:r>
-          </w:p>
-        </w:tc>
-      </w:tr>
-      <w:tr>
-        <w:tc>
-          <w:tcPr>
-            <w:tcW w:type="dxa" w:w="1120"/>
-            <w:tcMar>
-              <w:top w:type="dxa" w:w="60"/>
-              <w:left w:type="dxa" w:w="90"/>
-              <w:bottom w:type="dxa" w:w="60"/>
-              <w:right w:type="dxa" w:w="90"/>
-            </w:tcMar>
-          </w:tcPr>
-          <w:p>
-            <w:pPr>
-              <w:spacing w:after="0"/>
-            </w:pPr>
-            <w:r>
-              <w:rPr>
-                <w:rFonts w:ascii="Consolas" w:cs="Consolas" w:eastAsia="Consolas" w:hAnsi="Consolas"/>
-                <w:color w:val="9A958B"/>
-                <w:sz w:val="15"/>
-                <w:szCs w:val="15"/>
-              </w:rPr>
-              <w:t xml:space="preserve">B-669</w:t>
             </w:r>
           </w:p>
         </w:tc>
@@ -43122,7 +43071,7 @@
                 <w:sz w:val="15"/>
                 <w:szCs w:val="15"/>
               </w:rPr>
-              <w:t xml:space="preserve">B-670</w:t>
+              <w:t xml:space="preserve">B-669</w:t>
             </w:r>
           </w:p>
         </w:tc>
@@ -43271,6 +43220,57 @@
                 <w:sz w:val="15"/>
                 <w:szCs w:val="15"/>
               </w:rPr>
+              <w:t xml:space="preserve">B-670</w:t>
+            </w:r>
+          </w:p>
+        </w:tc>
+        <w:tc>
+          <w:tcPr>
+            <w:tcW w:type="dxa" w:w="7880"/>
+            <w:tcMar>
+              <w:top w:type="dxa" w:w="60"/>
+              <w:left w:type="dxa" w:w="90"/>
+              <w:bottom w:type="dxa" w:w="60"/>
+              <w:right w:type="dxa" w:w="90"/>
+            </w:tcMar>
+          </w:tcPr>
+          <w:p>
+            <w:pPr>
+              <w:spacing w:after="0" w:before="0"/>
+            </w:pPr>
+            <w:r>
+              <w:rPr>
+                <w:rFonts w:ascii="Calibri" w:cs="Calibri" w:eastAsia="Calibri" w:hAnsi="Calibri"/>
+                <w:sz w:val="21"/>
+                <w:szCs w:val="21"/>
+              </w:rPr>
+              <w:t xml:space="preserve">Auf diesem Gerät liegen bereits Wörter und Listen.</w:t>
+            </w:r>
+          </w:p>
+        </w:tc>
+      </w:tr>
+      <w:tr>
+        <w:tc>
+          <w:tcPr>
+            <w:tcW w:type="dxa" w:w="1120"/>
+            <w:tcMar>
+              <w:top w:type="dxa" w:w="60"/>
+              <w:left w:type="dxa" w:w="90"/>
+              <w:bottom w:type="dxa" w:w="60"/>
+              <w:right w:type="dxa" w:w="90"/>
+            </w:tcMar>
+          </w:tcPr>
+          <w:p>
+            <w:pPr>
+              <w:spacing w:after="0"/>
+            </w:pPr>
+            <w:r>
+              <w:rPr>
+                <w:rFonts w:ascii="Consolas" w:cs="Consolas" w:eastAsia="Consolas" w:hAnsi="Consolas"/>
+                <w:color w:val="9A958B"/>
+                <w:sz w:val="15"/>
+                <w:szCs w:val="15"/>
+              </w:rPr>
               <w:t xml:space="preserve">B-671</w:t>
             </w:r>
           </w:p>
@@ -43295,7 +43295,7 @@
                 <w:sz w:val="21"/>
                 <w:szCs w:val="21"/>
               </w:rPr>
-              <w:t xml:space="preserve">Auf diesem Gerät liegen bereits Wörter und Listen.</w:t>
+              <w:t xml:space="preserve">Gerät auf dieses Konto umgestellt. Die vorherigen Daten liegen als Sicherung auf dem Gerät.</w:t>
             </w:r>
           </w:p>
         </w:tc>
@@ -43346,7 +43346,7 @@
                 <w:sz w:val="21"/>
                 <w:szCs w:val="21"/>
               </w:rPr>
-              <w:t xml:space="preserve">Gerät auf dieses Konto umgestellt. Die vorherigen Daten liegen als Sicherung auf dem Gerät.</w:t>
+              <w:t xml:space="preserve">In dieses Konto übernehmen</w:t>
             </w:r>
           </w:p>
         </w:tc>
@@ -43397,7 +43397,7 @@
                 <w:sz w:val="21"/>
                 <w:szCs w:val="21"/>
               </w:rPr>
-              <w:t xml:space="preserve">In dieses Konto übernehmen</w:t>
+              <w:t xml:space="preserve">Lokale Daten als Sicherung gespeichert</w:t>
             </w:r>
           </w:p>
         </w:tc>
@@ -43425,57 +43425,6 @@
                 <w:szCs w:val="15"/>
               </w:rPr>
               <w:t xml:space="preserve">B-674</w:t>
-            </w:r>
-          </w:p>
-        </w:tc>
-        <w:tc>
-          <w:tcPr>
-            <w:tcW w:type="dxa" w:w="7880"/>
-            <w:tcMar>
-              <w:top w:type="dxa" w:w="60"/>
-              <w:left w:type="dxa" w:w="90"/>
-              <w:bottom w:type="dxa" w:w="60"/>
-              <w:right w:type="dxa" w:w="90"/>
-            </w:tcMar>
-          </w:tcPr>
-          <w:p>
-            <w:pPr>
-              <w:spacing w:after="0" w:before="0"/>
-            </w:pPr>
-            <w:r>
-              <w:rPr>
-                <w:rFonts w:ascii="Calibri" w:cs="Calibri" w:eastAsia="Calibri" w:hAnsi="Calibri"/>
-                <w:sz w:val="21"/>
-                <w:szCs w:val="21"/>
-              </w:rPr>
-              <w:t xml:space="preserve">Lokale Daten als Sicherung gespeichert</w:t>
-            </w:r>
-          </w:p>
-        </w:tc>
-      </w:tr>
-      <w:tr>
-        <w:tc>
-          <w:tcPr>
-            <w:tcW w:type="dxa" w:w="1120"/>
-            <w:tcMar>
-              <w:top w:type="dxa" w:w="60"/>
-              <w:left w:type="dxa" w:w="90"/>
-              <w:bottom w:type="dxa" w:w="60"/>
-              <w:right w:type="dxa" w:w="90"/>
-            </w:tcMar>
-          </w:tcPr>
-          <w:p>
-            <w:pPr>
-              <w:spacing w:after="0"/>
-            </w:pPr>
-            <w:r>
-              <w:rPr>
-                <w:rFonts w:ascii="Consolas" w:cs="Consolas" w:eastAsia="Consolas" w:hAnsi="Consolas"/>
-                <w:color w:val="9A958B"/>
-                <w:sz w:val="15"/>
-                <w:szCs w:val="15"/>
-              </w:rPr>
-              <w:t xml:space="preserve">B-675</w:t>
             </w:r>
           </w:p>
         </w:tc>
@@ -43624,6 +43573,57 @@
                 <w:sz w:val="15"/>
                 <w:szCs w:val="15"/>
               </w:rPr>
+              <w:t xml:space="preserve">B-675</w:t>
+            </w:r>
+          </w:p>
+        </w:tc>
+        <w:tc>
+          <w:tcPr>
+            <w:tcW w:type="dxa" w:w="7880"/>
+            <w:tcMar>
+              <w:top w:type="dxa" w:w="60"/>
+              <w:left w:type="dxa" w:w="90"/>
+              <w:bottom w:type="dxa" w:w="60"/>
+              <w:right w:type="dxa" w:w="90"/>
+            </w:tcMar>
+          </w:tcPr>
+          <w:p>
+            <w:pPr>
+              <w:spacing w:after="0" w:before="0"/>
+            </w:pPr>
+            <w:r>
+              <w:rPr>
+                <w:rFonts w:ascii="Calibri" w:cs="Calibri" w:eastAsia="Calibri" w:hAnsi="Calibri"/>
+                <w:sz w:val="21"/>
+                <w:szCs w:val="21"/>
+              </w:rPr>
+              <w:t xml:space="preserve">Akzente und Längenstriche</w:t>
+            </w:r>
+          </w:p>
+        </w:tc>
+      </w:tr>
+      <w:tr>
+        <w:tc>
+          <w:tcPr>
+            <w:tcW w:type="dxa" w:w="1120"/>
+            <w:tcMar>
+              <w:top w:type="dxa" w:w="60"/>
+              <w:left w:type="dxa" w:w="90"/>
+              <w:bottom w:type="dxa" w:w="60"/>
+              <w:right w:type="dxa" w:w="90"/>
+            </w:tcMar>
+          </w:tcPr>
+          <w:p>
+            <w:pPr>
+              <w:spacing w:after="0"/>
+            </w:pPr>
+            <w:r>
+              <w:rPr>
+                <w:rFonts w:ascii="Consolas" w:cs="Consolas" w:eastAsia="Consolas" w:hAnsi="Consolas"/>
+                <w:color w:val="9A958B"/>
+                <w:sz w:val="15"/>
+                <w:szCs w:val="15"/>
+              </w:rPr>
               <w:t xml:space="preserve">B-676</w:t>
             </w:r>
           </w:p>
@@ -43648,7 +43648,7 @@
                 <w:sz w:val="21"/>
                 <w:szCs w:val="21"/>
               </w:rPr>
-              <w:t xml:space="preserve">Akzente und Längenstriche</w:t>
+              <w:t xml:space="preserve">der / die / das</w:t>
             </w:r>
           </w:p>
         </w:tc>
@@ -43699,7 +43699,7 @@
                 <w:sz w:val="21"/>
                 <w:szCs w:val="21"/>
               </w:rPr>
-              <w:t xml:space="preserve">der / die / das</w:t>
+              <w:t xml:space="preserve">ein anderes Wort</w:t>
             </w:r>
           </w:p>
         </w:tc>
@@ -43750,7 +43750,7 @@
                 <w:sz w:val="21"/>
                 <w:szCs w:val="21"/>
               </w:rPr>
-              <w:t xml:space="preserve">ein anderes Wort</w:t>
+              <w:t xml:space="preserve">länger</w:t>
             </w:r>
           </w:p>
         </w:tc>
@@ -43778,57 +43778,6 @@
                 <w:szCs w:val="15"/>
               </w:rPr>
               <w:t xml:space="preserve">B-679</w:t>
-            </w:r>
-          </w:p>
-        </w:tc>
-        <w:tc>
-          <w:tcPr>
-            <w:tcW w:type="dxa" w:w="7880"/>
-            <w:tcMar>
-              <w:top w:type="dxa" w:w="60"/>
-              <w:left w:type="dxa" w:w="90"/>
-              <w:bottom w:type="dxa" w:w="60"/>
-              <w:right w:type="dxa" w:w="90"/>
-            </w:tcMar>
-          </w:tcPr>
-          <w:p>
-            <w:pPr>
-              <w:spacing w:after="0" w:before="0"/>
-            </w:pPr>
-            <w:r>
-              <w:rPr>
-                <w:rFonts w:ascii="Calibri" w:cs="Calibri" w:eastAsia="Calibri" w:hAnsi="Calibri"/>
-                <w:sz w:val="21"/>
-                <w:szCs w:val="21"/>
-              </w:rPr>
-              <w:t xml:space="preserve">länger</w:t>
-            </w:r>
-          </w:p>
-        </w:tc>
-      </w:tr>
-      <w:tr>
-        <w:tc>
-          <w:tcPr>
-            <w:tcW w:type="dxa" w:w="1120"/>
-            <w:tcMar>
-              <w:top w:type="dxa" w:w="60"/>
-              <w:left w:type="dxa" w:w="90"/>
-              <w:bottom w:type="dxa" w:w="60"/>
-              <w:right w:type="dxa" w:w="90"/>
-            </w:tcMar>
-          </w:tcPr>
-          <w:p>
-            <w:pPr>
-              <w:spacing w:after="0"/>
-            </w:pPr>
-            <w:r>
-              <w:rPr>
-                <w:rFonts w:ascii="Consolas" w:cs="Consolas" w:eastAsia="Consolas" w:hAnsi="Consolas"/>
-                <w:color w:val="9A958B"/>
-                <w:sz w:val="15"/>
-                <w:szCs w:val="15"/>
-              </w:rPr>
-              <w:t xml:space="preserve">B-680</w:t>
             </w:r>
           </w:p>
         </w:tc>
@@ -43977,58 +43926,58 @@
                 <w:sz w:val="15"/>
                 <w:szCs w:val="15"/>
               </w:rPr>
+              <w:t xml:space="preserve">B-680</w:t>
+            </w:r>
+          </w:p>
+        </w:tc>
+        <w:tc>
+          <w:tcPr>
+            <w:tcW w:type="dxa" w:w="7880"/>
+            <w:tcMar>
+              <w:top w:type="dxa" w:w="60"/>
+              <w:left w:type="dxa" w:w="90"/>
+              <w:bottom w:type="dxa" w:w="60"/>
+              <w:right w:type="dxa" w:w="90"/>
+            </w:tcMar>
+          </w:tcPr>
+          <w:p>
+            <w:pPr>
+              <w:spacing w:after="0" w:before="0"/>
+            </w:pPr>
+            <w:r>
+              <w:rPr>
+                <w:rFonts w:ascii="Calibri" w:cs="Calibri" w:eastAsia="Calibri" w:hAnsi="Calibri"/>
+                <w:sz w:val="21"/>
+                <w:szCs w:val="21"/>
+              </w:rPr>
+              <w:t xml:space="preserve">Fast: Schreibweise der Stammformen prüfen</w:t>
+            </w:r>
+          </w:p>
+        </w:tc>
+      </w:tr>
+      <w:tr>
+        <w:tc>
+          <w:tcPr>
+            <w:tcW w:type="dxa" w:w="1120"/>
+            <w:tcMar>
+              <w:top w:type="dxa" w:w="60"/>
+              <w:left w:type="dxa" w:w="90"/>
+              <w:bottom w:type="dxa" w:w="60"/>
+              <w:right w:type="dxa" w:w="90"/>
+            </w:tcMar>
+          </w:tcPr>
+          <w:p>
+            <w:pPr>
+              <w:spacing w:after="0"/>
+            </w:pPr>
+            <w:r>
+              <w:rPr>
+                <w:rFonts w:ascii="Consolas" w:cs="Consolas" w:eastAsia="Consolas" w:hAnsi="Consolas"/>
+                <w:color w:val="9A958B"/>
+                <w:sz w:val="15"/>
+                <w:szCs w:val="15"/>
+              </w:rPr>
               <w:t xml:space="preserve">B-681</w:t>
-            </w:r>
-          </w:p>
-        </w:tc>
-        <w:tc>
-          <w:tcPr>
-            <w:tcW w:type="dxa" w:w="7880"/>
-            <w:tcMar>
-              <w:top w:type="dxa" w:w="60"/>
-              <w:left w:type="dxa" w:w="90"/>
-              <w:bottom w:type="dxa" w:w="60"/>
-              <w:right w:type="dxa" w:w="90"/>
-            </w:tcMar>
-          </w:tcPr>
-          <w:p>
-            <w:pPr>
-              <w:spacing w:after="0" w:before="0"/>
-            </w:pPr>
-            <w:r>
-              <w:rPr>
-                <w:rFonts w:ascii="Calibri" w:cs="Calibri" w:eastAsia="Calibri" w:hAnsi="Calibri"/>
-                <w:sz w:val="21"/>
-                <w:szCs w:val="21"/>
-              </w:rPr>
-              <w:t xml:space="preserve">Fast: Schreibweise der Stammformen prüfen</w:t>
-            </w:r>
-          </w:p>
-        </w:tc>
-      </w:tr>
-      <w:tr>
-        <w:tc>
-          <w:tcPr>
-            <w:tcW w:type="dxa" w:w="1120"/>
-            <w:tcMar>
-              <w:top w:type="dxa" w:w="60"/>
-              <w:left w:type="dxa" w:w="90"/>
-              <w:bottom w:type="dxa" w:w="60"/>
-              <w:right w:type="dxa" w:w="90"/>
-            </w:tcMar>
-          </w:tcPr>
-          <w:p>
-            <w:pPr>
-              <w:spacing w:after="0"/>
-            </w:pPr>
-            <w:r>
-              <w:rPr>
-                <w:rFonts w:ascii="Consolas" w:cs="Consolas" w:eastAsia="Consolas" w:hAnsi="Consolas"/>
-                <w:color w:val="9A958B"/>
-                <w:sz w:val="15"/>
-                <w:szCs w:val="15"/>
-              </w:rPr>
-              <w:t xml:space="preserve">B-682</w:t>
             </w:r>
           </w:p>
         </w:tc>
@@ -44177,58 +44126,58 @@
                 <w:sz w:val="15"/>
                 <w:szCs w:val="15"/>
               </w:rPr>
+              <w:t xml:space="preserve">B-682</w:t>
+            </w:r>
+          </w:p>
+        </w:tc>
+        <w:tc>
+          <w:tcPr>
+            <w:tcW w:type="dxa" w:w="7880"/>
+            <w:tcMar>
+              <w:top w:type="dxa" w:w="60"/>
+              <w:left w:type="dxa" w:w="90"/>
+              <w:bottom w:type="dxa" w:w="60"/>
+              <w:right w:type="dxa" w:w="90"/>
+            </w:tcMar>
+          </w:tcPr>
+          <w:p>
+            <w:pPr>
+              <w:spacing w:after="0" w:before="0"/>
+            </w:pPr>
+            <w:r>
+              <w:rPr>
+                <w:rFonts w:ascii="Calibri" w:cs="Calibri" w:eastAsia="Calibri" w:hAnsi="Calibri"/>
+                <w:sz w:val="21"/>
+                <w:szCs w:val="21"/>
+              </w:rPr>
+              <w:t xml:space="preserve">noch nicht geübt</w:t>
+            </w:r>
+          </w:p>
+        </w:tc>
+      </w:tr>
+      <w:tr>
+        <w:tc>
+          <w:tcPr>
+            <w:tcW w:type="dxa" w:w="1120"/>
+            <w:tcMar>
+              <w:top w:type="dxa" w:w="60"/>
+              <w:left w:type="dxa" w:w="90"/>
+              <w:bottom w:type="dxa" w:w="60"/>
+              <w:right w:type="dxa" w:w="90"/>
+            </w:tcMar>
+          </w:tcPr>
+          <w:p>
+            <w:pPr>
+              <w:spacing w:after="0"/>
+            </w:pPr>
+            <w:r>
+              <w:rPr>
+                <w:rFonts w:ascii="Consolas" w:cs="Consolas" w:eastAsia="Consolas" w:hAnsi="Consolas"/>
+                <w:color w:val="9A958B"/>
+                <w:sz w:val="15"/>
+                <w:szCs w:val="15"/>
+              </w:rPr>
               <w:t xml:space="preserve">B-683</w:t>
-            </w:r>
-          </w:p>
-        </w:tc>
-        <w:tc>
-          <w:tcPr>
-            <w:tcW w:type="dxa" w:w="7880"/>
-            <w:tcMar>
-              <w:top w:type="dxa" w:w="60"/>
-              <w:left w:type="dxa" w:w="90"/>
-              <w:bottom w:type="dxa" w:w="60"/>
-              <w:right w:type="dxa" w:w="90"/>
-            </w:tcMar>
-          </w:tcPr>
-          <w:p>
-            <w:pPr>
-              <w:spacing w:after="0" w:before="0"/>
-            </w:pPr>
-            <w:r>
-              <w:rPr>
-                <w:rFonts w:ascii="Calibri" w:cs="Calibri" w:eastAsia="Calibri" w:hAnsi="Calibri"/>
-                <w:sz w:val="21"/>
-                <w:szCs w:val="21"/>
-              </w:rPr>
-              <w:t xml:space="preserve">noch nicht geübt</w:t>
-            </w:r>
-          </w:p>
-        </w:tc>
-      </w:tr>
-      <w:tr>
-        <w:tc>
-          <w:tcPr>
-            <w:tcW w:type="dxa" w:w="1120"/>
-            <w:tcMar>
-              <w:top w:type="dxa" w:w="60"/>
-              <w:left w:type="dxa" w:w="90"/>
-              <w:bottom w:type="dxa" w:w="60"/>
-              <w:right w:type="dxa" w:w="90"/>
-            </w:tcMar>
-          </w:tcPr>
-          <w:p>
-            <w:pPr>
-              <w:spacing w:after="0"/>
-            </w:pPr>
-            <w:r>
-              <w:rPr>
-                <w:rFonts w:ascii="Consolas" w:cs="Consolas" w:eastAsia="Consolas" w:hAnsi="Consolas"/>
-                <w:color w:val="9A958B"/>
-                <w:sz w:val="15"/>
-                <w:szCs w:val="15"/>
-              </w:rPr>
-              <w:t xml:space="preserve">B-684</w:t>
             </w:r>
           </w:p>
         </w:tc>
@@ -44377,7 +44326,7 @@
                 <w:sz w:val="15"/>
                 <w:szCs w:val="15"/>
               </w:rPr>
-              <w:t xml:space="preserve">B-685</w:t>
+              <w:t xml:space="preserve">B-684</w:t>
             </w:r>
           </w:p>
         </w:tc>
@@ -44526,7 +44475,7 @@
                 <w:sz w:val="15"/>
                 <w:szCs w:val="15"/>
               </w:rPr>
-              <w:t xml:space="preserve">B-686</w:t>
+              <w:t xml:space="preserve">B-685</w:t>
             </w:r>
           </w:p>
         </w:tc>

</xml_diff>

<commit_message>
Passwort aendern verlangt das alte, und Abmelden sagt die Wahrheit
Wer angemeldet ist, konnte sein Passwort ohne Nachweis aendern. Ein
unbeaufsichtigtes Geraet genuegte, um jemanden aus seinem eigenen Konto
auszusperren. Jetzt zuerst das aktuelle Passwort; geprueft wird, indem wir
uns damit noch einmal anmelden. Schlaegt das fehl, passiert nichts weiter,
die bestehende Sitzung bleibt.

NICHT verlangt wird es nach dem Link aus der Zuruecksetzen-Mail -- dort ist
der ganze Sinn, dass man das alte nicht mehr weiss. Die Mail ist der
Nachweis.

Dieselben Regelzeilen wie beim Registrieren, damit beide Masken gleich
funktionieren.

"Abmelden -- Daten bleiben auf dem Server" war eine Antwort auf eine Frage,
die niemand stellt. Geprueft, was tatsaechlich passiert: Abmelden loescht
nichts, weder lokal noch auf dem Server; die Woerter bleiben auf dem Geraet
und die App laeuft ohne Konto weiter. Genau das steht jetzt da.

Beide Sprachen.

Co-Authored-By: Claude Opus 5 <noreply@anthropic.com>
</commit_message>
<xml_diff>
--- a/texte/SmartVoc-Texte-Deutsch_v3.docx
+++ b/texte/SmartVoc-Texte-Deutsch_v3.docx
@@ -31313,7 +31313,7 @@
         <w:spacing w:after="120" w:before="260"/>
       </w:pPr>
       <w:r>
-        <w:t xml:space="preserve">Konto  (43)</w:t>
+        <w:t xml:space="preserve">Konto  (45)</w:t>
       </w:r>
     </w:p>
     <w:tbl>
@@ -31488,6 +31488,57 @@
                 <w:sz w:val="21"/>
                 <w:szCs w:val="21"/>
               </w:rPr>
+              <w:t xml:space="preserve">Aktuelles Passwort</w:t>
+            </w:r>
+          </w:p>
+        </w:tc>
+      </w:tr>
+      <w:tr>
+        <w:tc>
+          <w:tcPr>
+            <w:tcW w:type="dxa" w:w="1120"/>
+            <w:tcMar>
+              <w:top w:type="dxa" w:w="60"/>
+              <w:left w:type="dxa" w:w="90"/>
+              <w:bottom w:type="dxa" w:w="60"/>
+              <w:right w:type="dxa" w:w="90"/>
+            </w:tcMar>
+          </w:tcPr>
+          <w:p>
+            <w:pPr>
+              <w:spacing w:after="0"/>
+            </w:pPr>
+            <w:r>
+              <w:rPr>
+                <w:rFonts w:ascii="Consolas" w:cs="Consolas" w:eastAsia="Consolas" w:hAnsi="Consolas"/>
+                <w:color w:val="9A958B"/>
+                <w:sz w:val="15"/>
+                <w:szCs w:val="15"/>
+              </w:rPr>
+              <w:t xml:space="preserve">B-477</w:t>
+            </w:r>
+          </w:p>
+        </w:tc>
+        <w:tc>
+          <w:tcPr>
+            <w:tcW w:type="dxa" w:w="7880"/>
+            <w:tcMar>
+              <w:top w:type="dxa" w:w="60"/>
+              <w:left w:type="dxa" w:w="90"/>
+              <w:bottom w:type="dxa" w:w="60"/>
+              <w:right w:type="dxa" w:w="90"/>
+            </w:tcMar>
+          </w:tcPr>
+          <w:p>
+            <w:pPr>
+              <w:spacing w:after="0" w:before="0"/>
+            </w:pPr>
+            <w:r>
+              <w:rPr>
+                <w:rFonts w:ascii="Calibri" w:cs="Calibri" w:eastAsia="Calibri" w:hAnsi="Calibri"/>
+                <w:sz w:val="21"/>
+                <w:szCs w:val="21"/>
+              </w:rPr>
               <w:t xml:space="preserve">Anzeigename</w:t>
             </w:r>
           </w:p>
@@ -31515,7 +31566,7 @@
                 <w:sz w:val="15"/>
                 <w:szCs w:val="15"/>
               </w:rPr>
-              <w:t xml:space="preserve">B-477</w:t>
+              <w:t xml:space="preserve">B-478</w:t>
             </w:r>
           </w:p>
         </w:tc>
@@ -31566,7 +31617,7 @@
                 <w:sz w:val="15"/>
                 <w:szCs w:val="15"/>
               </w:rPr>
-              <w:t xml:space="preserve">B-478</w:t>
+              <w:t xml:space="preserve">B-479</w:t>
             </w:r>
           </w:p>
         </w:tc>
@@ -31617,7 +31668,58 @@
                 <w:sz w:val="15"/>
                 <w:szCs w:val="15"/>
               </w:rPr>
-              <w:t xml:space="preserve">B-479</w:t>
+              <w:t xml:space="preserve">B-480</w:t>
+            </w:r>
+          </w:p>
+        </w:tc>
+        <w:tc>
+          <w:tcPr>
+            <w:tcW w:type="dxa" w:w="7880"/>
+            <w:tcMar>
+              <w:top w:type="dxa" w:w="60"/>
+              <w:left w:type="dxa" w:w="90"/>
+              <w:bottom w:type="dxa" w:w="60"/>
+              <w:right w:type="dxa" w:w="90"/>
+            </w:tcMar>
+          </w:tcPr>
+          <w:p>
+            <w:pPr>
+              <w:spacing w:after="0" w:before="0"/>
+            </w:pPr>
+            <w:r>
+              <w:rPr>
+                <w:rFonts w:ascii="Calibri" w:cs="Calibri" w:eastAsia="Calibri" w:hAnsi="Calibri"/>
+                <w:sz w:val="21"/>
+                <w:szCs w:val="21"/>
+              </w:rPr>
+              <w:t xml:space="preserve">Das aktuelle Passwort stimmt nicht.</w:t>
+            </w:r>
+          </w:p>
+        </w:tc>
+      </w:tr>
+      <w:tr>
+        <w:tc>
+          <w:tcPr>
+            <w:tcW w:type="dxa" w:w="1120"/>
+            <w:tcMar>
+              <w:top w:type="dxa" w:w="60"/>
+              <w:left w:type="dxa" w:w="90"/>
+              <w:bottom w:type="dxa" w:w="60"/>
+              <w:right w:type="dxa" w:w="90"/>
+            </w:tcMar>
+          </w:tcPr>
+          <w:p>
+            <w:pPr>
+              <w:spacing w:after="0"/>
+            </w:pPr>
+            <w:r>
+              <w:rPr>
+                <w:rFonts w:ascii="Consolas" w:cs="Consolas" w:eastAsia="Consolas" w:hAnsi="Consolas"/>
+                <w:color w:val="9A958B"/>
+                <w:sz w:val="15"/>
+                <w:szCs w:val="15"/>
+              </w:rPr>
+              <w:t xml:space="preserve">B-481</w:t>
             </w:r>
           </w:p>
         </w:tc>
@@ -31668,58 +31770,7 @@
                 <w:sz w:val="15"/>
                 <w:szCs w:val="15"/>
               </w:rPr>
-              <w:t xml:space="preserve">B-480</w:t>
-            </w:r>
-          </w:p>
-        </w:tc>
-        <w:tc>
-          <w:tcPr>
-            <w:tcW w:type="dxa" w:w="7880"/>
-            <w:tcMar>
-              <w:top w:type="dxa" w:w="60"/>
-              <w:left w:type="dxa" w:w="90"/>
-              <w:bottom w:type="dxa" w:w="60"/>
-              <w:right w:type="dxa" w:w="90"/>
-            </w:tcMar>
-          </w:tcPr>
-          <w:p>
-            <w:pPr>
-              <w:spacing w:after="0" w:before="0"/>
-            </w:pPr>
-            <w:r>
-              <w:rPr>
-                <w:rFonts w:ascii="Calibri" w:cs="Calibri" w:eastAsia="Calibri" w:hAnsi="Calibri"/>
-                <w:sz w:val="21"/>
-                <w:szCs w:val="21"/>
-              </w:rPr>
-              <w:t xml:space="preserve">Daten bleiben auf dem Server</w:t>
-            </w:r>
-          </w:p>
-        </w:tc>
-      </w:tr>
-      <w:tr>
-        <w:tc>
-          <w:tcPr>
-            <w:tcW w:type="dxa" w:w="1120"/>
-            <w:tcMar>
-              <w:top w:type="dxa" w:w="60"/>
-              <w:left w:type="dxa" w:w="90"/>
-              <w:bottom w:type="dxa" w:w="60"/>
-              <w:right w:type="dxa" w:w="90"/>
-            </w:tcMar>
-          </w:tcPr>
-          <w:p>
-            <w:pPr>
-              <w:spacing w:after="0"/>
-            </w:pPr>
-            <w:r>
-              <w:rPr>
-                <w:rFonts w:ascii="Consolas" w:cs="Consolas" w:eastAsia="Consolas" w:hAnsi="Consolas"/>
-                <w:color w:val="9A958B"/>
-                <w:sz w:val="15"/>
-                <w:szCs w:val="15"/>
-              </w:rPr>
-              <w:t xml:space="preserve">B-481</w:t>
+              <w:t xml:space="preserve">B-482</w:t>
             </w:r>
           </w:p>
         </w:tc>
@@ -31770,7 +31821,7 @@
                 <w:sz w:val="15"/>
                 <w:szCs w:val="15"/>
               </w:rPr>
-              <w:t xml:space="preserve">B-482</w:t>
+              <w:t xml:space="preserve">B-483</w:t>
             </w:r>
           </w:p>
         </w:tc>
@@ -31821,7 +31872,58 @@
                 <w:sz w:val="15"/>
                 <w:szCs w:val="15"/>
               </w:rPr>
-              <w:t xml:space="preserve">B-483</w:t>
+              <w:t xml:space="preserve">B-484</w:t>
+            </w:r>
+          </w:p>
+        </w:tc>
+        <w:tc>
+          <w:tcPr>
+            <w:tcW w:type="dxa" w:w="7880"/>
+            <w:tcMar>
+              <w:top w:type="dxa" w:w="60"/>
+              <w:left w:type="dxa" w:w="90"/>
+              <w:bottom w:type="dxa" w:w="60"/>
+              <w:right w:type="dxa" w:w="90"/>
+            </w:tcMar>
+          </w:tcPr>
+          <w:p>
+            <w:pPr>
+              <w:spacing w:after="0" w:before="0"/>
+            </w:pPr>
+            <w:r>
+              <w:rPr>
+                <w:rFonts w:ascii="Calibri" w:cs="Calibri" w:eastAsia="Calibri" w:hAnsi="Calibri"/>
+                <w:sz w:val="21"/>
+                <w:szCs w:val="21"/>
+              </w:rPr>
+              <w:t xml:space="preserve">Deine Wörter bleiben auf diesem Gerät</w:t>
+            </w:r>
+          </w:p>
+        </w:tc>
+      </w:tr>
+      <w:tr>
+        <w:tc>
+          <w:tcPr>
+            <w:tcW w:type="dxa" w:w="1120"/>
+            <w:tcMar>
+              <w:top w:type="dxa" w:w="60"/>
+              <w:left w:type="dxa" w:w="90"/>
+              <w:bottom w:type="dxa" w:w="60"/>
+              <w:right w:type="dxa" w:w="90"/>
+            </w:tcMar>
+          </w:tcPr>
+          <w:p>
+            <w:pPr>
+              <w:spacing w:after="0"/>
+            </w:pPr>
+            <w:r>
+              <w:rPr>
+                <w:rFonts w:ascii="Consolas" w:cs="Consolas" w:eastAsia="Consolas" w:hAnsi="Consolas"/>
+                <w:color w:val="9A958B"/>
+                <w:sz w:val="15"/>
+                <w:szCs w:val="15"/>
+              </w:rPr>
+              <w:t xml:space="preserve">B-485</w:t>
             </w:r>
           </w:p>
         </w:tc>
@@ -31872,7 +31974,7 @@
                 <w:sz w:val="15"/>
                 <w:szCs w:val="15"/>
               </w:rPr>
-              <w:t xml:space="preserve">B-484</w:t>
+              <w:t xml:space="preserve">B-486</w:t>
             </w:r>
           </w:p>
         </w:tc>
@@ -31923,7 +32025,7 @@
                 <w:sz w:val="15"/>
                 <w:szCs w:val="15"/>
               </w:rPr>
-              <w:t xml:space="preserve">B-485</w:t>
+              <w:t xml:space="preserve">B-487</w:t>
             </w:r>
           </w:p>
         </w:tc>
@@ -31974,7 +32076,7 @@
                 <w:sz w:val="15"/>
                 <w:szCs w:val="15"/>
               </w:rPr>
-              <w:t xml:space="preserve">B-486</w:t>
+              <w:t xml:space="preserve">B-488</w:t>
             </w:r>
           </w:p>
         </w:tc>
@@ -32025,7 +32127,7 @@
                 <w:sz w:val="15"/>
                 <w:szCs w:val="15"/>
               </w:rPr>
-              <w:t xml:space="preserve">B-487</w:t>
+              <w:t xml:space="preserve">B-489</w:t>
             </w:r>
           </w:p>
         </w:tc>
@@ -32076,7 +32178,7 @@
                 <w:sz w:val="15"/>
                 <w:szCs w:val="15"/>
               </w:rPr>
-              <w:t xml:space="preserve">B-488</w:t>
+              <w:t xml:space="preserve">B-490</w:t>
             </w:r>
           </w:p>
         </w:tc>
@@ -32127,7 +32229,7 @@
                 <w:sz w:val="15"/>
                 <w:szCs w:val="15"/>
               </w:rPr>
-              <w:t xml:space="preserve">B-489</w:t>
+              <w:t xml:space="preserve">B-491</w:t>
             </w:r>
           </w:p>
         </w:tc>
@@ -32178,7 +32280,7 @@
                 <w:sz w:val="15"/>
                 <w:szCs w:val="15"/>
               </w:rPr>
-              <w:t xml:space="preserve">B-490</w:t>
+              <w:t xml:space="preserve">B-492</w:t>
             </w:r>
           </w:p>
         </w:tc>
@@ -32229,7 +32331,7 @@
                 <w:sz w:val="15"/>
                 <w:szCs w:val="15"/>
               </w:rPr>
-              <w:t xml:space="preserve">B-491</w:t>
+              <w:t xml:space="preserve">B-493</w:t>
             </w:r>
           </w:p>
         </w:tc>
@@ -32280,7 +32382,7 @@
                 <w:sz w:val="15"/>
                 <w:szCs w:val="15"/>
               </w:rPr>
-              <w:t xml:space="preserve">B-492</w:t>
+              <w:t xml:space="preserve">B-494</w:t>
             </w:r>
           </w:p>
         </w:tc>
@@ -32331,7 +32433,7 @@
                 <w:sz w:val="15"/>
                 <w:szCs w:val="15"/>
               </w:rPr>
-              <w:t xml:space="preserve">B-493</w:t>
+              <w:t xml:space="preserve">B-495</w:t>
             </w:r>
           </w:p>
         </w:tc>
@@ -32382,7 +32484,7 @@
                 <w:sz w:val="15"/>
                 <w:szCs w:val="15"/>
               </w:rPr>
-              <w:t xml:space="preserve">B-494</w:t>
+              <w:t xml:space="preserve">B-496</w:t>
             </w:r>
           </w:p>
         </w:tc>
@@ -32433,7 +32535,7 @@
                 <w:sz w:val="15"/>
                 <w:szCs w:val="15"/>
               </w:rPr>
-              <w:t xml:space="preserve">B-495</w:t>
+              <w:t xml:space="preserve">B-497</w:t>
             </w:r>
           </w:p>
         </w:tc>
@@ -32484,7 +32586,7 @@
                 <w:sz w:val="15"/>
                 <w:szCs w:val="15"/>
               </w:rPr>
-              <w:t xml:space="preserve">B-496</w:t>
+              <w:t xml:space="preserve">B-498</w:t>
             </w:r>
           </w:p>
         </w:tc>
@@ -32535,7 +32637,7 @@
                 <w:sz w:val="15"/>
                 <w:szCs w:val="15"/>
               </w:rPr>
-              <w:t xml:space="preserve">B-497</w:t>
+              <w:t xml:space="preserve">B-499</w:t>
             </w:r>
           </w:p>
         </w:tc>
@@ -32586,7 +32688,7 @@
                 <w:sz w:val="15"/>
                 <w:szCs w:val="15"/>
               </w:rPr>
-              <w:t xml:space="preserve">B-498</w:t>
+              <w:t xml:space="preserve">B-500</w:t>
             </w:r>
           </w:p>
         </w:tc>
@@ -32637,7 +32739,7 @@
                 <w:sz w:val="15"/>
                 <w:szCs w:val="15"/>
               </w:rPr>
-              <w:t xml:space="preserve">B-499</w:t>
+              <w:t xml:space="preserve">B-501</w:t>
             </w:r>
           </w:p>
         </w:tc>
@@ -32688,7 +32790,7 @@
                 <w:sz w:val="15"/>
                 <w:szCs w:val="15"/>
               </w:rPr>
-              <w:t xml:space="preserve">B-500</w:t>
+              <w:t xml:space="preserve">B-502</w:t>
             </w:r>
           </w:p>
         </w:tc>
@@ -32739,7 +32841,7 @@
                 <w:sz w:val="15"/>
                 <w:szCs w:val="15"/>
               </w:rPr>
-              <w:t xml:space="preserve">B-501</w:t>
+              <w:t xml:space="preserve">B-503</w:t>
             </w:r>
           </w:p>
         </w:tc>
@@ -32790,7 +32892,7 @@
                 <w:sz w:val="15"/>
                 <w:szCs w:val="15"/>
               </w:rPr>
-              <w:t xml:space="preserve">B-502</w:t>
+              <w:t xml:space="preserve">B-504</w:t>
             </w:r>
           </w:p>
         </w:tc>
@@ -32841,7 +32943,7 @@
                 <w:sz w:val="15"/>
                 <w:szCs w:val="15"/>
               </w:rPr>
-              <w:t xml:space="preserve">B-503</w:t>
+              <w:t xml:space="preserve">B-505</w:t>
             </w:r>
           </w:p>
         </w:tc>
@@ -32892,7 +32994,7 @@
                 <w:sz w:val="15"/>
                 <w:szCs w:val="15"/>
               </w:rPr>
-              <w:t xml:space="preserve">B-504</w:t>
+              <w:t xml:space="preserve">B-506</w:t>
             </w:r>
           </w:p>
         </w:tc>
@@ -32943,7 +33045,7 @@
                 <w:sz w:val="15"/>
                 <w:szCs w:val="15"/>
               </w:rPr>
-              <w:t xml:space="preserve">B-505</w:t>
+              <w:t xml:space="preserve">B-507</w:t>
             </w:r>
           </w:p>
         </w:tc>
@@ -32994,7 +33096,7 @@
                 <w:sz w:val="15"/>
                 <w:szCs w:val="15"/>
               </w:rPr>
-              <w:t xml:space="preserve">B-506</w:t>
+              <w:t xml:space="preserve">B-508</w:t>
             </w:r>
           </w:p>
         </w:tc>
@@ -33045,7 +33147,7 @@
                 <w:sz w:val="15"/>
                 <w:szCs w:val="15"/>
               </w:rPr>
-              <w:t xml:space="preserve">B-507</w:t>
+              <w:t xml:space="preserve">B-509</w:t>
             </w:r>
           </w:p>
         </w:tc>
@@ -33096,7 +33198,7 @@
                 <w:sz w:val="15"/>
                 <w:szCs w:val="15"/>
               </w:rPr>
-              <w:t xml:space="preserve">B-508</w:t>
+              <w:t xml:space="preserve">B-510</w:t>
             </w:r>
           </w:p>
         </w:tc>
@@ -33147,7 +33249,7 @@
                 <w:sz w:val="15"/>
                 <w:szCs w:val="15"/>
               </w:rPr>
-              <w:t xml:space="preserve">B-509</w:t>
+              <w:t xml:space="preserve">B-511</w:t>
             </w:r>
           </w:p>
         </w:tc>
@@ -33198,7 +33300,7 @@
                 <w:sz w:val="15"/>
                 <w:szCs w:val="15"/>
               </w:rPr>
-              <w:t xml:space="preserve">B-510</w:t>
+              <w:t xml:space="preserve">B-512</w:t>
             </w:r>
           </w:p>
         </w:tc>
@@ -33249,7 +33351,7 @@
                 <w:sz w:val="15"/>
                 <w:szCs w:val="15"/>
               </w:rPr>
-              <w:t xml:space="preserve">B-511</w:t>
+              <w:t xml:space="preserve">B-513</w:t>
             </w:r>
           </w:p>
         </w:tc>
@@ -33300,7 +33402,7 @@
                 <w:sz w:val="15"/>
                 <w:szCs w:val="15"/>
               </w:rPr>
-              <w:t xml:space="preserve">B-512</w:t>
+              <w:t xml:space="preserve">B-514</w:t>
             </w:r>
           </w:p>
         </w:tc>
@@ -33351,7 +33453,7 @@
                 <w:sz w:val="15"/>
                 <w:szCs w:val="15"/>
               </w:rPr>
-              <w:t xml:space="preserve">B-513</w:t>
+              <w:t xml:space="preserve">B-515</w:t>
             </w:r>
           </w:p>
         </w:tc>
@@ -33402,7 +33504,7 @@
                 <w:sz w:val="15"/>
                 <w:szCs w:val="15"/>
               </w:rPr>
-              <w:t xml:space="preserve">B-514</w:t>
+              <w:t xml:space="preserve">B-516</w:t>
             </w:r>
           </w:p>
         </w:tc>
@@ -33453,7 +33555,7 @@
                 <w:sz w:val="15"/>
                 <w:szCs w:val="15"/>
               </w:rPr>
-              <w:t xml:space="preserve">B-515</w:t>
+              <w:t xml:space="preserve">B-517</w:t>
             </w:r>
           </w:p>
         </w:tc>
@@ -33504,7 +33606,7 @@
                 <w:sz w:val="15"/>
                 <w:szCs w:val="15"/>
               </w:rPr>
-              <w:t xml:space="preserve">B-516</w:t>
+              <w:t xml:space="preserve">B-518</w:t>
             </w:r>
           </w:p>
         </w:tc>
@@ -33555,7 +33657,7 @@
                 <w:sz w:val="15"/>
                 <w:szCs w:val="15"/>
               </w:rPr>
-              <w:t xml:space="preserve">B-517</w:t>
+              <w:t xml:space="preserve">B-519</w:t>
             </w:r>
           </w:p>
         </w:tc>
@@ -33704,7 +33806,7 @@
                 <w:sz w:val="15"/>
                 <w:szCs w:val="15"/>
               </w:rPr>
-              <w:t xml:space="preserve">B-518</w:t>
+              <w:t xml:space="preserve">B-520</w:t>
             </w:r>
           </w:p>
         </w:tc>
@@ -33755,7 +33857,7 @@
                 <w:sz w:val="15"/>
                 <w:szCs w:val="15"/>
               </w:rPr>
-              <w:t xml:space="preserve">B-519</w:t>
+              <w:t xml:space="preserve">B-521</w:t>
             </w:r>
           </w:p>
         </w:tc>
@@ -33806,7 +33908,7 @@
                 <w:sz w:val="15"/>
                 <w:szCs w:val="15"/>
               </w:rPr>
-              <w:t xml:space="preserve">B-520</w:t>
+              <w:t xml:space="preserve">B-522</w:t>
             </w:r>
           </w:p>
         </w:tc>
@@ -33857,7 +33959,7 @@
                 <w:sz w:val="15"/>
                 <w:szCs w:val="15"/>
               </w:rPr>
-              <w:t xml:space="preserve">B-521</w:t>
+              <w:t xml:space="preserve">B-523</w:t>
             </w:r>
           </w:p>
         </w:tc>
@@ -34006,7 +34108,7 @@
                 <w:sz w:val="15"/>
                 <w:szCs w:val="15"/>
               </w:rPr>
-              <w:t xml:space="preserve">B-522</w:t>
+              <w:t xml:space="preserve">B-524</w:t>
             </w:r>
           </w:p>
         </w:tc>
@@ -34057,7 +34159,7 @@
                 <w:sz w:val="15"/>
                 <w:szCs w:val="15"/>
               </w:rPr>
-              <w:t xml:space="preserve">B-523</w:t>
+              <w:t xml:space="preserve">B-525</w:t>
             </w:r>
           </w:p>
         </w:tc>
@@ -34108,7 +34210,7 @@
                 <w:sz w:val="15"/>
                 <w:szCs w:val="15"/>
               </w:rPr>
-              <w:t xml:space="preserve">B-524</w:t>
+              <w:t xml:space="preserve">B-526</w:t>
             </w:r>
           </w:p>
         </w:tc>
@@ -34257,7 +34359,7 @@
                 <w:sz w:val="15"/>
                 <w:szCs w:val="15"/>
               </w:rPr>
-              <w:t xml:space="preserve">B-525</w:t>
+              <w:t xml:space="preserve">B-527</w:t>
             </w:r>
           </w:p>
         </w:tc>
@@ -34308,7 +34410,7 @@
                 <w:sz w:val="15"/>
                 <w:szCs w:val="15"/>
               </w:rPr>
-              <w:t xml:space="preserve">B-526</w:t>
+              <w:t xml:space="preserve">B-528</w:t>
             </w:r>
           </w:p>
         </w:tc>
@@ -34359,7 +34461,7 @@
                 <w:sz w:val="15"/>
                 <w:szCs w:val="15"/>
               </w:rPr>
-              <w:t xml:space="preserve">B-527</w:t>
+              <w:t xml:space="preserve">B-529</w:t>
             </w:r>
           </w:p>
         </w:tc>
@@ -34410,7 +34512,7 @@
                 <w:sz w:val="15"/>
                 <w:szCs w:val="15"/>
               </w:rPr>
-              <w:t xml:space="preserve">B-528</w:t>
+              <w:t xml:space="preserve">B-530</w:t>
             </w:r>
           </w:p>
         </w:tc>
@@ -34461,7 +34563,7 @@
                 <w:sz w:val="15"/>
                 <w:szCs w:val="15"/>
               </w:rPr>
-              <w:t xml:space="preserve">B-529</w:t>
+              <w:t xml:space="preserve">B-531</w:t>
             </w:r>
           </w:p>
         </w:tc>
@@ -34512,7 +34614,7 @@
                 <w:sz w:val="15"/>
                 <w:szCs w:val="15"/>
               </w:rPr>
-              <w:t xml:space="preserve">B-530</w:t>
+              <w:t xml:space="preserve">B-532</w:t>
             </w:r>
           </w:p>
         </w:tc>
@@ -34563,7 +34665,7 @@
                 <w:sz w:val="15"/>
                 <w:szCs w:val="15"/>
               </w:rPr>
-              <w:t xml:space="preserve">B-531</w:t>
+              <w:t xml:space="preserve">B-533</w:t>
             </w:r>
           </w:p>
         </w:tc>
@@ -34614,7 +34716,7 @@
                 <w:sz w:val="15"/>
                 <w:szCs w:val="15"/>
               </w:rPr>
-              <w:t xml:space="preserve">B-532</w:t>
+              <w:t xml:space="preserve">B-534</w:t>
             </w:r>
           </w:p>
         </w:tc>
@@ -34665,7 +34767,7 @@
                 <w:sz w:val="15"/>
                 <w:szCs w:val="15"/>
               </w:rPr>
-              <w:t xml:space="preserve">B-533</w:t>
+              <w:t xml:space="preserve">B-535</w:t>
             </w:r>
           </w:p>
         </w:tc>
@@ -34716,7 +34818,7 @@
                 <w:sz w:val="15"/>
                 <w:szCs w:val="15"/>
               </w:rPr>
-              <w:t xml:space="preserve">B-534</w:t>
+              <w:t xml:space="preserve">B-536</w:t>
             </w:r>
           </w:p>
         </w:tc>
@@ -34767,7 +34869,7 @@
                 <w:sz w:val="15"/>
                 <w:szCs w:val="15"/>
               </w:rPr>
-              <w:t xml:space="preserve">B-535</w:t>
+              <w:t xml:space="preserve">B-537</w:t>
             </w:r>
           </w:p>
         </w:tc>
@@ -34818,7 +34920,7 @@
                 <w:sz w:val="15"/>
                 <w:szCs w:val="15"/>
               </w:rPr>
-              <w:t xml:space="preserve">B-536</w:t>
+              <w:t xml:space="preserve">B-538</w:t>
             </w:r>
           </w:p>
         </w:tc>
@@ -34869,7 +34971,7 @@
                 <w:sz w:val="15"/>
                 <w:szCs w:val="15"/>
               </w:rPr>
-              <w:t xml:space="preserve">B-537</w:t>
+              <w:t xml:space="preserve">B-539</w:t>
             </w:r>
           </w:p>
         </w:tc>
@@ -34920,7 +35022,7 @@
                 <w:sz w:val="15"/>
                 <w:szCs w:val="15"/>
               </w:rPr>
-              <w:t xml:space="preserve">B-538</w:t>
+              <w:t xml:space="preserve">B-540</w:t>
             </w:r>
           </w:p>
         </w:tc>
@@ -34971,7 +35073,7 @@
                 <w:sz w:val="15"/>
                 <w:szCs w:val="15"/>
               </w:rPr>
-              <w:t xml:space="preserve">B-539</w:t>
+              <w:t xml:space="preserve">B-541</w:t>
             </w:r>
           </w:p>
         </w:tc>
@@ -35022,7 +35124,7 @@
                 <w:sz w:val="15"/>
                 <w:szCs w:val="15"/>
               </w:rPr>
-              <w:t xml:space="preserve">B-540</w:t>
+              <w:t xml:space="preserve">B-542</w:t>
             </w:r>
           </w:p>
         </w:tc>
@@ -35073,7 +35175,7 @@
                 <w:sz w:val="15"/>
                 <w:szCs w:val="15"/>
               </w:rPr>
-              <w:t xml:space="preserve">B-541</w:t>
+              <w:t xml:space="preserve">B-543</w:t>
             </w:r>
           </w:p>
         </w:tc>
@@ -35222,7 +35324,7 @@
                 <w:sz w:val="15"/>
                 <w:szCs w:val="15"/>
               </w:rPr>
-              <w:t xml:space="preserve">B-542</w:t>
+              <w:t xml:space="preserve">B-544</w:t>
             </w:r>
           </w:p>
         </w:tc>
@@ -35273,7 +35375,7 @@
                 <w:sz w:val="15"/>
                 <w:szCs w:val="15"/>
               </w:rPr>
-              <w:t xml:space="preserve">B-543</w:t>
+              <w:t xml:space="preserve">B-545</w:t>
             </w:r>
           </w:p>
         </w:tc>
@@ -35324,7 +35426,7 @@
                 <w:sz w:val="15"/>
                 <w:szCs w:val="15"/>
               </w:rPr>
-              <w:t xml:space="preserve">B-544</w:t>
+              <w:t xml:space="preserve">B-546</w:t>
             </w:r>
           </w:p>
         </w:tc>
@@ -35375,7 +35477,7 @@
                 <w:sz w:val="15"/>
                 <w:szCs w:val="15"/>
               </w:rPr>
-              <w:t xml:space="preserve">B-545</w:t>
+              <w:t xml:space="preserve">B-547</w:t>
             </w:r>
           </w:p>
         </w:tc>
@@ -35426,7 +35528,7 @@
                 <w:sz w:val="15"/>
                 <w:szCs w:val="15"/>
               </w:rPr>
-              <w:t xml:space="preserve">B-546</w:t>
+              <w:t xml:space="preserve">B-548</w:t>
             </w:r>
           </w:p>
         </w:tc>
@@ -35477,7 +35579,7 @@
                 <w:sz w:val="15"/>
                 <w:szCs w:val="15"/>
               </w:rPr>
-              <w:t xml:space="preserve">B-547</w:t>
+              <w:t xml:space="preserve">B-549</w:t>
             </w:r>
           </w:p>
         </w:tc>
@@ -35528,7 +35630,7 @@
                 <w:sz w:val="15"/>
                 <w:szCs w:val="15"/>
               </w:rPr>
-              <w:t xml:space="preserve">B-548</w:t>
+              <w:t xml:space="preserve">B-550</w:t>
             </w:r>
           </w:p>
         </w:tc>
@@ -35579,7 +35681,7 @@
                 <w:sz w:val="15"/>
                 <w:szCs w:val="15"/>
               </w:rPr>
-              <w:t xml:space="preserve">B-549</w:t>
+              <w:t xml:space="preserve">B-551</w:t>
             </w:r>
           </w:p>
         </w:tc>
@@ -35630,7 +35732,7 @@
                 <w:sz w:val="15"/>
                 <w:szCs w:val="15"/>
               </w:rPr>
-              <w:t xml:space="preserve">B-550</w:t>
+              <w:t xml:space="preserve">B-552</w:t>
             </w:r>
           </w:p>
         </w:tc>
@@ -35681,7 +35783,7 @@
                 <w:sz w:val="15"/>
                 <w:szCs w:val="15"/>
               </w:rPr>
-              <w:t xml:space="preserve">B-551</w:t>
+              <w:t xml:space="preserve">B-553</w:t>
             </w:r>
           </w:p>
         </w:tc>
@@ -35732,7 +35834,7 @@
                 <w:sz w:val="15"/>
                 <w:szCs w:val="15"/>
               </w:rPr>
-              <w:t xml:space="preserve">B-552</w:t>
+              <w:t xml:space="preserve">B-554</w:t>
             </w:r>
           </w:p>
         </w:tc>
@@ -35783,7 +35885,7 @@
                 <w:sz w:val="15"/>
                 <w:szCs w:val="15"/>
               </w:rPr>
-              <w:t xml:space="preserve">B-553</w:t>
+              <w:t xml:space="preserve">B-555</w:t>
             </w:r>
           </w:p>
         </w:tc>
@@ -35932,7 +36034,7 @@
                 <w:sz w:val="15"/>
                 <w:szCs w:val="15"/>
               </w:rPr>
-              <w:t xml:space="preserve">B-554</w:t>
+              <w:t xml:space="preserve">B-556</w:t>
             </w:r>
           </w:p>
         </w:tc>
@@ -35983,7 +36085,7 @@
                 <w:sz w:val="15"/>
                 <w:szCs w:val="15"/>
               </w:rPr>
-              <w:t xml:space="preserve">B-555</w:t>
+              <w:t xml:space="preserve">B-557</w:t>
             </w:r>
           </w:p>
         </w:tc>
@@ -36034,7 +36136,7 @@
                 <w:sz w:val="15"/>
                 <w:szCs w:val="15"/>
               </w:rPr>
-              <w:t xml:space="preserve">B-556</w:t>
+              <w:t xml:space="preserve">B-558</w:t>
             </w:r>
           </w:p>
         </w:tc>
@@ -36085,7 +36187,7 @@
                 <w:sz w:val="15"/>
                 <w:szCs w:val="15"/>
               </w:rPr>
-              <w:t xml:space="preserve">B-557</w:t>
+              <w:t xml:space="preserve">B-559</w:t>
             </w:r>
           </w:p>
         </w:tc>
@@ -36136,7 +36238,7 @@
                 <w:sz w:val="15"/>
                 <w:szCs w:val="15"/>
               </w:rPr>
-              <w:t xml:space="preserve">B-558</w:t>
+              <w:t xml:space="preserve">B-560</w:t>
             </w:r>
           </w:p>
         </w:tc>
@@ -36187,7 +36289,7 @@
                 <w:sz w:val="15"/>
                 <w:szCs w:val="15"/>
               </w:rPr>
-              <w:t xml:space="preserve">B-559</w:t>
+              <w:t xml:space="preserve">B-561</w:t>
             </w:r>
           </w:p>
         </w:tc>
@@ -36238,7 +36340,7 @@
                 <w:sz w:val="15"/>
                 <w:szCs w:val="15"/>
               </w:rPr>
-              <w:t xml:space="preserve">B-560</w:t>
+              <w:t xml:space="preserve">B-562</w:t>
             </w:r>
           </w:p>
         </w:tc>
@@ -36289,7 +36391,7 @@
                 <w:sz w:val="15"/>
                 <w:szCs w:val="15"/>
               </w:rPr>
-              <w:t xml:space="preserve">B-561</w:t>
+              <w:t xml:space="preserve">B-563</w:t>
             </w:r>
           </w:p>
         </w:tc>
@@ -36438,7 +36540,7 @@
                 <w:sz w:val="15"/>
                 <w:szCs w:val="15"/>
               </w:rPr>
-              <w:t xml:space="preserve">B-562</w:t>
+              <w:t xml:space="preserve">B-564</w:t>
             </w:r>
           </w:p>
         </w:tc>
@@ -36489,7 +36591,7 @@
                 <w:sz w:val="15"/>
                 <w:szCs w:val="15"/>
               </w:rPr>
-              <w:t xml:space="preserve">B-563</w:t>
+              <w:t xml:space="preserve">B-565</w:t>
             </w:r>
           </w:p>
         </w:tc>
@@ -36540,7 +36642,7 @@
                 <w:sz w:val="15"/>
                 <w:szCs w:val="15"/>
               </w:rPr>
-              <w:t xml:space="preserve">B-564</w:t>
+              <w:t xml:space="preserve">B-566</w:t>
             </w:r>
           </w:p>
         </w:tc>
@@ -36591,7 +36693,7 @@
                 <w:sz w:val="15"/>
                 <w:szCs w:val="15"/>
               </w:rPr>
-              <w:t xml:space="preserve">B-565</w:t>
+              <w:t xml:space="preserve">B-567</w:t>
             </w:r>
           </w:p>
         </w:tc>
@@ -36642,7 +36744,7 @@
                 <w:sz w:val="15"/>
                 <w:szCs w:val="15"/>
               </w:rPr>
-              <w:t xml:space="preserve">B-566</w:t>
+              <w:t xml:space="preserve">B-568</w:t>
             </w:r>
           </w:p>
         </w:tc>
@@ -36693,7 +36795,7 @@
                 <w:sz w:val="15"/>
                 <w:szCs w:val="15"/>
               </w:rPr>
-              <w:t xml:space="preserve">B-567</w:t>
+              <w:t xml:space="preserve">B-569</w:t>
             </w:r>
           </w:p>
         </w:tc>
@@ -36842,7 +36944,7 @@
                 <w:sz w:val="15"/>
                 <w:szCs w:val="15"/>
               </w:rPr>
-              <w:t xml:space="preserve">B-568</w:t>
+              <w:t xml:space="preserve">B-570</w:t>
             </w:r>
           </w:p>
         </w:tc>
@@ -36893,7 +36995,7 @@
                 <w:sz w:val="15"/>
                 <w:szCs w:val="15"/>
               </w:rPr>
-              <w:t xml:space="preserve">B-569</w:t>
+              <w:t xml:space="preserve">B-571</w:t>
             </w:r>
           </w:p>
         </w:tc>
@@ -36944,7 +37046,7 @@
                 <w:sz w:val="15"/>
                 <w:szCs w:val="15"/>
               </w:rPr>
-              <w:t xml:space="preserve">B-570</w:t>
+              <w:t xml:space="preserve">B-572</w:t>
             </w:r>
           </w:p>
         </w:tc>
@@ -36995,7 +37097,7 @@
                 <w:sz w:val="15"/>
                 <w:szCs w:val="15"/>
               </w:rPr>
-              <w:t xml:space="preserve">B-571</w:t>
+              <w:t xml:space="preserve">B-573</w:t>
             </w:r>
           </w:p>
         </w:tc>
@@ -37144,7 +37246,7 @@
                 <w:sz w:val="15"/>
                 <w:szCs w:val="15"/>
               </w:rPr>
-              <w:t xml:space="preserve">B-572</w:t>
+              <w:t xml:space="preserve">B-574</w:t>
             </w:r>
           </w:p>
         </w:tc>
@@ -37195,7 +37297,7 @@
                 <w:sz w:val="15"/>
                 <w:szCs w:val="15"/>
               </w:rPr>
-              <w:t xml:space="preserve">B-573</w:t>
+              <w:t xml:space="preserve">B-575</w:t>
             </w:r>
           </w:p>
         </w:tc>
@@ -37246,7 +37348,7 @@
                 <w:sz w:val="15"/>
                 <w:szCs w:val="15"/>
               </w:rPr>
-              <w:t xml:space="preserve">B-574</w:t>
+              <w:t xml:space="preserve">B-576</w:t>
             </w:r>
           </w:p>
         </w:tc>
@@ -37297,7 +37399,7 @@
                 <w:sz w:val="15"/>
                 <w:szCs w:val="15"/>
               </w:rPr>
-              <w:t xml:space="preserve">B-575</w:t>
+              <w:t xml:space="preserve">B-577</w:t>
             </w:r>
           </w:p>
         </w:tc>
@@ -37348,7 +37450,7 @@
                 <w:sz w:val="15"/>
                 <w:szCs w:val="15"/>
               </w:rPr>
-              <w:t xml:space="preserve">B-576</w:t>
+              <w:t xml:space="preserve">B-578</w:t>
             </w:r>
           </w:p>
         </w:tc>
@@ -37399,7 +37501,7 @@
                 <w:sz w:val="15"/>
                 <w:szCs w:val="15"/>
               </w:rPr>
-              <w:t xml:space="preserve">B-577</w:t>
+              <w:t xml:space="preserve">B-579</w:t>
             </w:r>
           </w:p>
         </w:tc>
@@ -37450,7 +37552,7 @@
                 <w:sz w:val="15"/>
                 <w:szCs w:val="15"/>
               </w:rPr>
-              <w:t xml:space="preserve">B-578</w:t>
+              <w:t xml:space="preserve">B-580</w:t>
             </w:r>
           </w:p>
         </w:tc>
@@ -37599,7 +37701,7 @@
                 <w:sz w:val="15"/>
                 <w:szCs w:val="15"/>
               </w:rPr>
-              <w:t xml:space="preserve">B-579</w:t>
+              <w:t xml:space="preserve">B-581</w:t>
             </w:r>
           </w:p>
         </w:tc>
@@ -37650,7 +37752,7 @@
                 <w:sz w:val="15"/>
                 <w:szCs w:val="15"/>
               </w:rPr>
-              <w:t xml:space="preserve">B-580</w:t>
+              <w:t xml:space="preserve">B-582</w:t>
             </w:r>
           </w:p>
         </w:tc>
@@ -37701,7 +37803,7 @@
                 <w:sz w:val="15"/>
                 <w:szCs w:val="15"/>
               </w:rPr>
-              <w:t xml:space="preserve">B-581</w:t>
+              <w:t xml:space="preserve">B-583</w:t>
             </w:r>
           </w:p>
         </w:tc>
@@ -37752,7 +37854,7 @@
                 <w:sz w:val="15"/>
                 <w:szCs w:val="15"/>
               </w:rPr>
-              <w:t xml:space="preserve">B-582</w:t>
+              <w:t xml:space="preserve">B-584</w:t>
             </w:r>
           </w:p>
         </w:tc>
@@ -37803,7 +37905,7 @@
                 <w:sz w:val="15"/>
                 <w:szCs w:val="15"/>
               </w:rPr>
-              <w:t xml:space="preserve">B-583</w:t>
+              <w:t xml:space="preserve">B-585</w:t>
             </w:r>
           </w:p>
         </w:tc>
@@ -37854,7 +37956,7 @@
                 <w:sz w:val="15"/>
                 <w:szCs w:val="15"/>
               </w:rPr>
-              <w:t xml:space="preserve">B-584</w:t>
+              <w:t xml:space="preserve">B-586</w:t>
             </w:r>
           </w:p>
         </w:tc>
@@ -37905,7 +38007,7 @@
                 <w:sz w:val="15"/>
                 <w:szCs w:val="15"/>
               </w:rPr>
-              <w:t xml:space="preserve">B-585</w:t>
+              <w:t xml:space="preserve">B-587</w:t>
             </w:r>
           </w:p>
         </w:tc>
@@ -37956,7 +38058,7 @@
                 <w:sz w:val="15"/>
                 <w:szCs w:val="15"/>
               </w:rPr>
-              <w:t xml:space="preserve">B-586</w:t>
+              <w:t xml:space="preserve">B-588</w:t>
             </w:r>
           </w:p>
         </w:tc>
@@ -38105,7 +38207,7 @@
                 <w:sz w:val="15"/>
                 <w:szCs w:val="15"/>
               </w:rPr>
-              <w:t xml:space="preserve">B-587</w:t>
+              <w:t xml:space="preserve">B-589</w:t>
             </w:r>
           </w:p>
         </w:tc>
@@ -38156,7 +38258,7 @@
                 <w:sz w:val="15"/>
                 <w:szCs w:val="15"/>
               </w:rPr>
-              <w:t xml:space="preserve">B-588</w:t>
+              <w:t xml:space="preserve">B-590</w:t>
             </w:r>
           </w:p>
         </w:tc>
@@ -38207,7 +38309,7 @@
                 <w:sz w:val="15"/>
                 <w:szCs w:val="15"/>
               </w:rPr>
-              <w:t xml:space="preserve">B-589</w:t>
+              <w:t xml:space="preserve">B-591</w:t>
             </w:r>
           </w:p>
         </w:tc>
@@ -38258,7 +38360,7 @@
                 <w:sz w:val="15"/>
                 <w:szCs w:val="15"/>
               </w:rPr>
-              <w:t xml:space="preserve">B-590</w:t>
+              <w:t xml:space="preserve">B-592</w:t>
             </w:r>
           </w:p>
         </w:tc>
@@ -38309,7 +38411,7 @@
                 <w:sz w:val="15"/>
                 <w:szCs w:val="15"/>
               </w:rPr>
-              <w:t xml:space="preserve">B-591</w:t>
+              <w:t xml:space="preserve">B-593</w:t>
             </w:r>
           </w:p>
         </w:tc>
@@ -38458,7 +38560,7 @@
                 <w:sz w:val="15"/>
                 <w:szCs w:val="15"/>
               </w:rPr>
-              <w:t xml:space="preserve">B-592</w:t>
+              <w:t xml:space="preserve">B-594</w:t>
             </w:r>
           </w:p>
         </w:tc>
@@ -38509,7 +38611,7 @@
                 <w:sz w:val="15"/>
                 <w:szCs w:val="15"/>
               </w:rPr>
-              <w:t xml:space="preserve">B-593</w:t>
+              <w:t xml:space="preserve">B-595</w:t>
             </w:r>
           </w:p>
         </w:tc>
@@ -38560,7 +38662,7 @@
                 <w:sz w:val="15"/>
                 <w:szCs w:val="15"/>
               </w:rPr>
-              <w:t xml:space="preserve">B-594</w:t>
+              <w:t xml:space="preserve">B-596</w:t>
             </w:r>
           </w:p>
         </w:tc>
@@ -38611,7 +38713,7 @@
                 <w:sz w:val="15"/>
                 <w:szCs w:val="15"/>
               </w:rPr>
-              <w:t xml:space="preserve">B-595</w:t>
+              <w:t xml:space="preserve">B-597</w:t>
             </w:r>
           </w:p>
         </w:tc>
@@ -38760,7 +38862,7 @@
                 <w:sz w:val="15"/>
                 <w:szCs w:val="15"/>
               </w:rPr>
-              <w:t xml:space="preserve">B-596</w:t>
+              <w:t xml:space="preserve">B-598</w:t>
             </w:r>
           </w:p>
         </w:tc>
@@ -38811,7 +38913,7 @@
                 <w:sz w:val="15"/>
                 <w:szCs w:val="15"/>
               </w:rPr>
-              <w:t xml:space="preserve">B-597</w:t>
+              <w:t xml:space="preserve">B-599</w:t>
             </w:r>
           </w:p>
         </w:tc>
@@ -38862,7 +38964,7 @@
                 <w:sz w:val="15"/>
                 <w:szCs w:val="15"/>
               </w:rPr>
-              <w:t xml:space="preserve">B-598</w:t>
+              <w:t xml:space="preserve">B-600</w:t>
             </w:r>
           </w:p>
         </w:tc>
@@ -38913,7 +39015,7 @@
                 <w:sz w:val="15"/>
                 <w:szCs w:val="15"/>
               </w:rPr>
-              <w:t xml:space="preserve">B-599</w:t>
+              <w:t xml:space="preserve">B-601</w:t>
             </w:r>
           </w:p>
         </w:tc>
@@ -38964,7 +39066,7 @@
                 <w:sz w:val="15"/>
                 <w:szCs w:val="15"/>
               </w:rPr>
-              <w:t xml:space="preserve">B-600</w:t>
+              <w:t xml:space="preserve">B-602</w:t>
             </w:r>
           </w:p>
         </w:tc>
@@ -39015,7 +39117,7 @@
                 <w:sz w:val="15"/>
                 <w:szCs w:val="15"/>
               </w:rPr>
-              <w:t xml:space="preserve">B-601</w:t>
+              <w:t xml:space="preserve">B-603</w:t>
             </w:r>
           </w:p>
         </w:tc>
@@ -39164,7 +39266,7 @@
                 <w:sz w:val="15"/>
                 <w:szCs w:val="15"/>
               </w:rPr>
-              <w:t xml:space="preserve">B-602</w:t>
+              <w:t xml:space="preserve">B-604</w:t>
             </w:r>
           </w:p>
         </w:tc>
@@ -39215,7 +39317,7 @@
                 <w:sz w:val="15"/>
                 <w:szCs w:val="15"/>
               </w:rPr>
-              <w:t xml:space="preserve">B-603</w:t>
+              <w:t xml:space="preserve">B-605</w:t>
             </w:r>
           </w:p>
         </w:tc>
@@ -39266,7 +39368,7 @@
                 <w:sz w:val="15"/>
                 <w:szCs w:val="15"/>
               </w:rPr>
-              <w:t xml:space="preserve">B-604</w:t>
+              <w:t xml:space="preserve">B-606</w:t>
             </w:r>
           </w:p>
         </w:tc>
@@ -39415,7 +39517,7 @@
                 <w:sz w:val="15"/>
                 <w:szCs w:val="15"/>
               </w:rPr>
-              <w:t xml:space="preserve">B-605</w:t>
+              <w:t xml:space="preserve">B-607</w:t>
             </w:r>
           </w:p>
         </w:tc>
@@ -39466,7 +39568,7 @@
                 <w:sz w:val="15"/>
                 <w:szCs w:val="15"/>
               </w:rPr>
-              <w:t xml:space="preserve">B-606</w:t>
+              <w:t xml:space="preserve">B-608</w:t>
             </w:r>
           </w:p>
         </w:tc>
@@ -39517,7 +39619,7 @@
                 <w:sz w:val="15"/>
                 <w:szCs w:val="15"/>
               </w:rPr>
-              <w:t xml:space="preserve">B-607</w:t>
+              <w:t xml:space="preserve">B-609</w:t>
             </w:r>
           </w:p>
         </w:tc>
@@ -39568,7 +39670,7 @@
                 <w:sz w:val="15"/>
                 <w:szCs w:val="15"/>
               </w:rPr>
-              <w:t xml:space="preserve">B-608</w:t>
+              <w:t xml:space="preserve">B-610</w:t>
             </w:r>
           </w:p>
         </w:tc>
@@ -39619,7 +39721,7 @@
                 <w:sz w:val="15"/>
                 <w:szCs w:val="15"/>
               </w:rPr>
-              <w:t xml:space="preserve">B-609</w:t>
+              <w:t xml:space="preserve">B-611</w:t>
             </w:r>
           </w:p>
         </w:tc>
@@ -39670,7 +39772,7 @@
                 <w:sz w:val="15"/>
                 <w:szCs w:val="15"/>
               </w:rPr>
-              <w:t xml:space="preserve">B-610</w:t>
+              <w:t xml:space="preserve">B-612</w:t>
             </w:r>
           </w:p>
         </w:tc>
@@ -39721,7 +39823,7 @@
                 <w:sz w:val="15"/>
                 <w:szCs w:val="15"/>
               </w:rPr>
-              <w:t xml:space="preserve">B-611</w:t>
+              <w:t xml:space="preserve">B-613</w:t>
             </w:r>
           </w:p>
         </w:tc>
@@ -39772,7 +39874,7 @@
                 <w:sz w:val="15"/>
                 <w:szCs w:val="15"/>
               </w:rPr>
-              <w:t xml:space="preserve">B-612</w:t>
+              <w:t xml:space="preserve">B-614</w:t>
             </w:r>
           </w:p>
         </w:tc>
@@ -39823,7 +39925,7 @@
                 <w:sz w:val="15"/>
                 <w:szCs w:val="15"/>
               </w:rPr>
-              <w:t xml:space="preserve">B-613</w:t>
+              <w:t xml:space="preserve">B-615</w:t>
             </w:r>
           </w:p>
         </w:tc>
@@ -39874,7 +39976,7 @@
                 <w:sz w:val="15"/>
                 <w:szCs w:val="15"/>
               </w:rPr>
-              <w:t xml:space="preserve">B-614</w:t>
+              <w:t xml:space="preserve">B-616</w:t>
             </w:r>
           </w:p>
         </w:tc>
@@ -39925,7 +40027,7 @@
                 <w:sz w:val="15"/>
                 <w:szCs w:val="15"/>
               </w:rPr>
-              <w:t xml:space="preserve">B-615</w:t>
+              <w:t xml:space="preserve">B-617</w:t>
             </w:r>
           </w:p>
         </w:tc>
@@ -39976,7 +40078,7 @@
                 <w:sz w:val="15"/>
                 <w:szCs w:val="15"/>
               </w:rPr>
-              <w:t xml:space="preserve">B-616</w:t>
+              <w:t xml:space="preserve">B-618</w:t>
             </w:r>
           </w:p>
         </w:tc>
@@ -40027,7 +40129,7 @@
                 <w:sz w:val="15"/>
                 <w:szCs w:val="15"/>
               </w:rPr>
-              <w:t xml:space="preserve">B-617</w:t>
+              <w:t xml:space="preserve">B-619</w:t>
             </w:r>
           </w:p>
         </w:tc>
@@ -40078,7 +40180,7 @@
                 <w:sz w:val="15"/>
                 <w:szCs w:val="15"/>
               </w:rPr>
-              <w:t xml:space="preserve">B-618</w:t>
+              <w:t xml:space="preserve">B-620</w:t>
             </w:r>
           </w:p>
         </w:tc>
@@ -40129,7 +40231,7 @@
                 <w:sz w:val="15"/>
                 <w:szCs w:val="15"/>
               </w:rPr>
-              <w:t xml:space="preserve">B-619</w:t>
+              <w:t xml:space="preserve">B-621</w:t>
             </w:r>
           </w:p>
         </w:tc>
@@ -40180,7 +40282,7 @@
                 <w:sz w:val="15"/>
                 <w:szCs w:val="15"/>
               </w:rPr>
-              <w:t xml:space="preserve">B-620</w:t>
+              <w:t xml:space="preserve">B-622</w:t>
             </w:r>
           </w:p>
         </w:tc>
@@ -40231,7 +40333,7 @@
                 <w:sz w:val="15"/>
                 <w:szCs w:val="15"/>
               </w:rPr>
-              <w:t xml:space="preserve">B-621</w:t>
+              <w:t xml:space="preserve">B-623</w:t>
             </w:r>
           </w:p>
         </w:tc>
@@ -40282,7 +40384,7 @@
                 <w:sz w:val="15"/>
                 <w:szCs w:val="15"/>
               </w:rPr>
-              <w:t xml:space="preserve">B-622</w:t>
+              <w:t xml:space="preserve">B-624</w:t>
             </w:r>
           </w:p>
         </w:tc>
@@ -40333,7 +40435,7 @@
                 <w:sz w:val="15"/>
                 <w:szCs w:val="15"/>
               </w:rPr>
-              <w:t xml:space="preserve">B-623</w:t>
+              <w:t xml:space="preserve">B-625</w:t>
             </w:r>
           </w:p>
         </w:tc>
@@ -40384,7 +40486,7 @@
                 <w:sz w:val="15"/>
                 <w:szCs w:val="15"/>
               </w:rPr>
-              <w:t xml:space="preserve">B-624</w:t>
+              <w:t xml:space="preserve">B-626</w:t>
             </w:r>
           </w:p>
         </w:tc>
@@ -40435,7 +40537,7 @@
                 <w:sz w:val="15"/>
                 <w:szCs w:val="15"/>
               </w:rPr>
-              <w:t xml:space="preserve">B-625</w:t>
+              <w:t xml:space="preserve">B-627</w:t>
             </w:r>
           </w:p>
         </w:tc>
@@ -40486,7 +40588,7 @@
                 <w:sz w:val="15"/>
                 <w:szCs w:val="15"/>
               </w:rPr>
-              <w:t xml:space="preserve">B-626</w:t>
+              <w:t xml:space="preserve">B-628</w:t>
             </w:r>
           </w:p>
         </w:tc>
@@ -40635,7 +40737,7 @@
                 <w:sz w:val="15"/>
                 <w:szCs w:val="15"/>
               </w:rPr>
-              <w:t xml:space="preserve">B-627</w:t>
+              <w:t xml:space="preserve">B-629</w:t>
             </w:r>
           </w:p>
         </w:tc>
@@ -40686,7 +40788,7 @@
                 <w:sz w:val="15"/>
                 <w:szCs w:val="15"/>
               </w:rPr>
-              <w:t xml:space="preserve">B-628</w:t>
+              <w:t xml:space="preserve">B-630</w:t>
             </w:r>
           </w:p>
         </w:tc>
@@ -40737,7 +40839,7 @@
                 <w:sz w:val="15"/>
                 <w:szCs w:val="15"/>
               </w:rPr>
-              <w:t xml:space="preserve">B-629</w:t>
+              <w:t xml:space="preserve">B-631</w:t>
             </w:r>
           </w:p>
         </w:tc>
@@ -40788,7 +40890,7 @@
                 <w:sz w:val="15"/>
                 <w:szCs w:val="15"/>
               </w:rPr>
-              <w:t xml:space="preserve">B-630</w:t>
+              <w:t xml:space="preserve">B-632</w:t>
             </w:r>
           </w:p>
         </w:tc>
@@ -40839,7 +40941,7 @@
                 <w:sz w:val="15"/>
                 <w:szCs w:val="15"/>
               </w:rPr>
-              <w:t xml:space="preserve">B-631</w:t>
+              <w:t xml:space="preserve">B-633</w:t>
             </w:r>
           </w:p>
         </w:tc>
@@ -40988,7 +41090,7 @@
                 <w:sz w:val="15"/>
                 <w:szCs w:val="15"/>
               </w:rPr>
-              <w:t xml:space="preserve">B-632</w:t>
+              <w:t xml:space="preserve">B-634</w:t>
             </w:r>
           </w:p>
         </w:tc>
@@ -41039,7 +41141,7 @@
                 <w:sz w:val="15"/>
                 <w:szCs w:val="15"/>
               </w:rPr>
-              <w:t xml:space="preserve">B-633</w:t>
+              <w:t xml:space="preserve">B-635</w:t>
             </w:r>
           </w:p>
         </w:tc>
@@ -41090,7 +41192,7 @@
                 <w:sz w:val="15"/>
                 <w:szCs w:val="15"/>
               </w:rPr>
-              <w:t xml:space="preserve">B-634</w:t>
+              <w:t xml:space="preserve">B-636</w:t>
             </w:r>
           </w:p>
         </w:tc>
@@ -41141,7 +41243,7 @@
                 <w:sz w:val="15"/>
                 <w:szCs w:val="15"/>
               </w:rPr>
-              <w:t xml:space="preserve">B-635</w:t>
+              <w:t xml:space="preserve">B-637</w:t>
             </w:r>
           </w:p>
         </w:tc>
@@ -41192,7 +41294,7 @@
                 <w:sz w:val="15"/>
                 <w:szCs w:val="15"/>
               </w:rPr>
-              <w:t xml:space="preserve">B-636</w:t>
+              <w:t xml:space="preserve">B-638</w:t>
             </w:r>
           </w:p>
         </w:tc>
@@ -41243,7 +41345,7 @@
                 <w:sz w:val="15"/>
                 <w:szCs w:val="15"/>
               </w:rPr>
-              <w:t xml:space="preserve">B-637</w:t>
+              <w:t xml:space="preserve">B-639</w:t>
             </w:r>
           </w:p>
         </w:tc>
@@ -41294,7 +41396,7 @@
                 <w:sz w:val="15"/>
                 <w:szCs w:val="15"/>
               </w:rPr>
-              <w:t xml:space="preserve">B-638</w:t>
+              <w:t xml:space="preserve">B-640</w:t>
             </w:r>
           </w:p>
         </w:tc>
@@ -41345,7 +41447,7 @@
                 <w:sz w:val="15"/>
                 <w:szCs w:val="15"/>
               </w:rPr>
-              <w:t xml:space="preserve">B-639</w:t>
+              <w:t xml:space="preserve">B-641</w:t>
             </w:r>
           </w:p>
         </w:tc>
@@ -41494,7 +41596,7 @@
                 <w:sz w:val="15"/>
                 <w:szCs w:val="15"/>
               </w:rPr>
-              <w:t xml:space="preserve">B-640</w:t>
+              <w:t xml:space="preserve">B-642</w:t>
             </w:r>
           </w:p>
         </w:tc>
@@ -41545,7 +41647,7 @@
                 <w:sz w:val="15"/>
                 <w:szCs w:val="15"/>
               </w:rPr>
-              <w:t xml:space="preserve">B-641</w:t>
+              <w:t xml:space="preserve">B-643</w:t>
             </w:r>
           </w:p>
         </w:tc>
@@ -41596,7 +41698,7 @@
                 <w:sz w:val="15"/>
                 <w:szCs w:val="15"/>
               </w:rPr>
-              <w:t xml:space="preserve">B-642</w:t>
+              <w:t xml:space="preserve">B-644</w:t>
             </w:r>
           </w:p>
         </w:tc>
@@ -41647,7 +41749,7 @@
                 <w:sz w:val="15"/>
                 <w:szCs w:val="15"/>
               </w:rPr>
-              <w:t xml:space="preserve">B-643</w:t>
+              <w:t xml:space="preserve">B-645</w:t>
             </w:r>
           </w:p>
         </w:tc>
@@ -41698,7 +41800,7 @@
                 <w:sz w:val="15"/>
                 <w:szCs w:val="15"/>
               </w:rPr>
-              <w:t xml:space="preserve">B-644</w:t>
+              <w:t xml:space="preserve">B-646</w:t>
             </w:r>
           </w:p>
         </w:tc>
@@ -41749,7 +41851,7 @@
                 <w:sz w:val="15"/>
                 <w:szCs w:val="15"/>
               </w:rPr>
-              <w:t xml:space="preserve">B-645</w:t>
+              <w:t xml:space="preserve">B-647</w:t>
             </w:r>
           </w:p>
         </w:tc>
@@ -41800,7 +41902,7 @@
                 <w:sz w:val="15"/>
                 <w:szCs w:val="15"/>
               </w:rPr>
-              <w:t xml:space="preserve">B-646</w:t>
+              <w:t xml:space="preserve">B-648</w:t>
             </w:r>
           </w:p>
         </w:tc>
@@ -41851,7 +41953,7 @@
                 <w:sz w:val="15"/>
                 <w:szCs w:val="15"/>
               </w:rPr>
-              <w:t xml:space="preserve">B-647</w:t>
+              <w:t xml:space="preserve">B-649</w:t>
             </w:r>
           </w:p>
         </w:tc>
@@ -41902,7 +42004,7 @@
                 <w:sz w:val="15"/>
                 <w:szCs w:val="15"/>
               </w:rPr>
-              <w:t xml:space="preserve">B-648</w:t>
+              <w:t xml:space="preserve">B-650</w:t>
             </w:r>
           </w:p>
         </w:tc>
@@ -41953,7 +42055,7 @@
                 <w:sz w:val="15"/>
                 <w:szCs w:val="15"/>
               </w:rPr>
-              <w:t xml:space="preserve">B-649</w:t>
+              <w:t xml:space="preserve">B-651</w:t>
             </w:r>
           </w:p>
         </w:tc>
@@ -42004,7 +42106,7 @@
                 <w:sz w:val="15"/>
                 <w:szCs w:val="15"/>
               </w:rPr>
-              <w:t xml:space="preserve">B-650</w:t>
+              <w:t xml:space="preserve">B-652</w:t>
             </w:r>
           </w:p>
         </w:tc>
@@ -42055,7 +42157,7 @@
                 <w:sz w:val="15"/>
                 <w:szCs w:val="15"/>
               </w:rPr>
-              <w:t xml:space="preserve">B-651</w:t>
+              <w:t xml:space="preserve">B-653</w:t>
             </w:r>
           </w:p>
         </w:tc>
@@ -42106,7 +42208,7 @@
                 <w:sz w:val="15"/>
                 <w:szCs w:val="15"/>
               </w:rPr>
-              <w:t xml:space="preserve">B-652</w:t>
+              <w:t xml:space="preserve">B-654</w:t>
             </w:r>
           </w:p>
         </w:tc>
@@ -42157,7 +42259,7 @@
                 <w:sz w:val="15"/>
                 <w:szCs w:val="15"/>
               </w:rPr>
-              <w:t xml:space="preserve">B-653</w:t>
+              <w:t xml:space="preserve">B-655</w:t>
             </w:r>
           </w:p>
         </w:tc>
@@ -42208,7 +42310,7 @@
                 <w:sz w:val="15"/>
                 <w:szCs w:val="15"/>
               </w:rPr>
-              <w:t xml:space="preserve">B-654</w:t>
+              <w:t xml:space="preserve">B-656</w:t>
             </w:r>
           </w:p>
         </w:tc>
@@ -42259,7 +42361,7 @@
                 <w:sz w:val="15"/>
                 <w:szCs w:val="15"/>
               </w:rPr>
-              <w:t xml:space="preserve">B-655</w:t>
+              <w:t xml:space="preserve">B-657</w:t>
             </w:r>
           </w:p>
         </w:tc>
@@ -42310,7 +42412,7 @@
                 <w:sz w:val="15"/>
                 <w:szCs w:val="15"/>
               </w:rPr>
-              <w:t xml:space="preserve">B-656</w:t>
+              <w:t xml:space="preserve">B-658</w:t>
             </w:r>
           </w:p>
         </w:tc>
@@ -42361,7 +42463,7 @@
                 <w:sz w:val="15"/>
                 <w:szCs w:val="15"/>
               </w:rPr>
-              <w:t xml:space="preserve">B-657</w:t>
+              <w:t xml:space="preserve">B-659</w:t>
             </w:r>
           </w:p>
         </w:tc>
@@ -42412,7 +42514,7 @@
                 <w:sz w:val="15"/>
                 <w:szCs w:val="15"/>
               </w:rPr>
-              <w:t xml:space="preserve">B-658</w:t>
+              <w:t xml:space="preserve">B-660</w:t>
             </w:r>
           </w:p>
         </w:tc>
@@ -42463,7 +42565,7 @@
                 <w:sz w:val="15"/>
                 <w:szCs w:val="15"/>
               </w:rPr>
-              <w:t xml:space="preserve">B-659</w:t>
+              <w:t xml:space="preserve">B-661</w:t>
             </w:r>
           </w:p>
         </w:tc>
@@ -42514,7 +42616,7 @@
                 <w:sz w:val="15"/>
                 <w:szCs w:val="15"/>
               </w:rPr>
-              <w:t xml:space="preserve">B-660</w:t>
+              <w:t xml:space="preserve">B-662</w:t>
             </w:r>
           </w:p>
         </w:tc>
@@ -42565,7 +42667,7 @@
                 <w:sz w:val="15"/>
                 <w:szCs w:val="15"/>
               </w:rPr>
-              <w:t xml:space="preserve">B-661</w:t>
+              <w:t xml:space="preserve">B-663</w:t>
             </w:r>
           </w:p>
         </w:tc>
@@ -42616,7 +42718,7 @@
                 <w:sz w:val="15"/>
                 <w:szCs w:val="15"/>
               </w:rPr>
-              <w:t xml:space="preserve">B-662</w:t>
+              <w:t xml:space="preserve">B-664</w:t>
             </w:r>
           </w:p>
         </w:tc>
@@ -42667,7 +42769,7 @@
                 <w:sz w:val="15"/>
                 <w:szCs w:val="15"/>
               </w:rPr>
-              <w:t xml:space="preserve">B-663</w:t>
+              <w:t xml:space="preserve">B-665</w:t>
             </w:r>
           </w:p>
         </w:tc>
@@ -42718,7 +42820,7 @@
                 <w:sz w:val="15"/>
                 <w:szCs w:val="15"/>
               </w:rPr>
-              <w:t xml:space="preserve">B-664</w:t>
+              <w:t xml:space="preserve">B-666</w:t>
             </w:r>
           </w:p>
         </w:tc>
@@ -42769,7 +42871,7 @@
                 <w:sz w:val="15"/>
                 <w:szCs w:val="15"/>
               </w:rPr>
-              <w:t xml:space="preserve">B-665</w:t>
+              <w:t xml:space="preserve">B-667</w:t>
             </w:r>
           </w:p>
         </w:tc>
@@ -42820,7 +42922,7 @@
                 <w:sz w:val="15"/>
                 <w:szCs w:val="15"/>
               </w:rPr>
-              <w:t xml:space="preserve">B-666</w:t>
+              <w:t xml:space="preserve">B-668</w:t>
             </w:r>
           </w:p>
         </w:tc>
@@ -42871,7 +42973,7 @@
                 <w:sz w:val="15"/>
                 <w:szCs w:val="15"/>
               </w:rPr>
-              <w:t xml:space="preserve">B-667</w:t>
+              <w:t xml:space="preserve">B-669</w:t>
             </w:r>
           </w:p>
         </w:tc>
@@ -42922,7 +43024,7 @@
                 <w:sz w:val="15"/>
                 <w:szCs w:val="15"/>
               </w:rPr>
-              <w:t xml:space="preserve">B-668</w:t>
+              <w:t xml:space="preserve">B-670</w:t>
             </w:r>
           </w:p>
         </w:tc>
@@ -42973,7 +43075,7 @@
                 <w:sz w:val="15"/>
                 <w:szCs w:val="15"/>
               </w:rPr>
-              <w:t xml:space="preserve">B-669</w:t>
+              <w:t xml:space="preserve">B-671</w:t>
             </w:r>
           </w:p>
         </w:tc>
@@ -43024,7 +43126,7 @@
                 <w:sz w:val="15"/>
                 <w:szCs w:val="15"/>
               </w:rPr>
-              <w:t xml:space="preserve">B-670</w:t>
+              <w:t xml:space="preserve">B-672</w:t>
             </w:r>
           </w:p>
         </w:tc>
@@ -43075,7 +43177,7 @@
                 <w:sz w:val="15"/>
                 <w:szCs w:val="15"/>
               </w:rPr>
-              <w:t xml:space="preserve">B-671</w:t>
+              <w:t xml:space="preserve">B-673</w:t>
             </w:r>
           </w:p>
         </w:tc>
@@ -43126,7 +43228,7 @@
                 <w:sz w:val="15"/>
                 <w:szCs w:val="15"/>
               </w:rPr>
-              <w:t xml:space="preserve">B-672</w:t>
+              <w:t xml:space="preserve">B-674</w:t>
             </w:r>
           </w:p>
         </w:tc>
@@ -43177,7 +43279,7 @@
                 <w:sz w:val="15"/>
                 <w:szCs w:val="15"/>
               </w:rPr>
-              <w:t xml:space="preserve">B-673</w:t>
+              <w:t xml:space="preserve">B-675</w:t>
             </w:r>
           </w:p>
         </w:tc>
@@ -43228,7 +43330,7 @@
                 <w:sz w:val="15"/>
                 <w:szCs w:val="15"/>
               </w:rPr>
-              <w:t xml:space="preserve">B-674</w:t>
+              <w:t xml:space="preserve">B-676</w:t>
             </w:r>
           </w:p>
         </w:tc>
@@ -43377,7 +43479,7 @@
                 <w:sz w:val="15"/>
                 <w:szCs w:val="15"/>
               </w:rPr>
-              <w:t xml:space="preserve">B-675</w:t>
+              <w:t xml:space="preserve">B-677</w:t>
             </w:r>
           </w:p>
         </w:tc>
@@ -43428,7 +43530,7 @@
                 <w:sz w:val="15"/>
                 <w:szCs w:val="15"/>
               </w:rPr>
-              <w:t xml:space="preserve">B-676</w:t>
+              <w:t xml:space="preserve">B-678</w:t>
             </w:r>
           </w:p>
         </w:tc>
@@ -43479,7 +43581,7 @@
                 <w:sz w:val="15"/>
                 <w:szCs w:val="15"/>
               </w:rPr>
-              <w:t xml:space="preserve">B-677</w:t>
+              <w:t xml:space="preserve">B-679</w:t>
             </w:r>
           </w:p>
         </w:tc>
@@ -43530,7 +43632,7 @@
                 <w:sz w:val="15"/>
                 <w:szCs w:val="15"/>
               </w:rPr>
-              <w:t xml:space="preserve">B-678</w:t>
+              <w:t xml:space="preserve">B-680</w:t>
             </w:r>
           </w:p>
         </w:tc>
@@ -43581,7 +43683,7 @@
                 <w:sz w:val="15"/>
                 <w:szCs w:val="15"/>
               </w:rPr>
-              <w:t xml:space="preserve">B-679</w:t>
+              <w:t xml:space="preserve">B-681</w:t>
             </w:r>
           </w:p>
         </w:tc>
@@ -43730,7 +43832,7 @@
                 <w:sz w:val="15"/>
                 <w:szCs w:val="15"/>
               </w:rPr>
-              <w:t xml:space="preserve">B-680</w:t>
+              <w:t xml:space="preserve">B-682</w:t>
             </w:r>
           </w:p>
         </w:tc>
@@ -43781,7 +43883,7 @@
                 <w:sz w:val="15"/>
                 <w:szCs w:val="15"/>
               </w:rPr>
-              <w:t xml:space="preserve">B-681</w:t>
+              <w:t xml:space="preserve">B-683</w:t>
             </w:r>
           </w:p>
         </w:tc>
@@ -43832,7 +43934,7 @@
                 <w:sz w:val="15"/>
                 <w:szCs w:val="15"/>
               </w:rPr>
-              <w:t xml:space="preserve">B-682</w:t>
+              <w:t xml:space="preserve">B-684</w:t>
             </w:r>
           </w:p>
         </w:tc>
@@ -43883,7 +43985,7 @@
                 <w:sz w:val="15"/>
                 <w:szCs w:val="15"/>
               </w:rPr>
-              <w:t xml:space="preserve">B-683</w:t>
+              <w:t xml:space="preserve">B-685</w:t>
             </w:r>
           </w:p>
         </w:tc>
@@ -43934,7 +44036,7 @@
                 <w:sz w:val="15"/>
                 <w:szCs w:val="15"/>
               </w:rPr>
-              <w:t xml:space="preserve">B-684</w:t>
+              <w:t xml:space="preserve">B-686</w:t>
             </w:r>
           </w:p>
         </w:tc>
@@ -44083,7 +44185,7 @@
                 <w:sz w:val="15"/>
                 <w:szCs w:val="15"/>
               </w:rPr>
-              <w:t xml:space="preserve">B-685</w:t>
+              <w:t xml:space="preserve">B-687</w:t>
             </w:r>
           </w:p>
         </w:tc>
@@ -44134,7 +44236,7 @@
                 <w:sz w:val="15"/>
                 <w:szCs w:val="15"/>
               </w:rPr>
-              <w:t xml:space="preserve">B-686</w:t>
+              <w:t xml:space="preserve">B-688</w:t>
             </w:r>
           </w:p>
         </w:tc>
@@ -44283,7 +44385,7 @@
                 <w:sz w:val="15"/>
                 <w:szCs w:val="15"/>
               </w:rPr>
-              <w:t xml:space="preserve">B-687</w:t>
+              <w:t xml:space="preserve">B-689</w:t>
             </w:r>
           </w:p>
         </w:tc>
@@ -44334,7 +44436,7 @@
                 <w:sz w:val="15"/>
                 <w:szCs w:val="15"/>
               </w:rPr>
-              <w:t xml:space="preserve">B-688</w:t>
+              <w:t xml:space="preserve">B-690</w:t>
             </w:r>
           </w:p>
         </w:tc>
@@ -44483,7 +44585,7 @@
                 <w:sz w:val="15"/>
                 <w:szCs w:val="15"/>
               </w:rPr>
-              <w:t xml:space="preserve">B-689</w:t>
+              <w:t xml:space="preserve">B-691</w:t>
             </w:r>
           </w:p>
         </w:tc>
@@ -44632,7 +44734,7 @@
                 <w:sz w:val="15"/>
                 <w:szCs w:val="15"/>
               </w:rPr>
-              <w:t xml:space="preserve">B-690</w:t>
+              <w:t xml:space="preserve">B-692</w:t>
             </w:r>
           </w:p>
         </w:tc>

</xml_diff>

<commit_message>
Impressum und Datenschutz mit vollstaendigen Angaben
Vorher ein Ringschluss: Die Datenschutzerklaerung verwies aufs Impressum,
das Impressum auf "die im App Store hinterlegte Adresse" -- und nirgends
stand eine. Wer schreiben wollte, fand keinen Weg.

Jetzt vollstaendige Postanschrift, E-Mail und Telefon, an beiden Orten und
in beiden Sprachen. Das ist nicht Kuer: Deutschland verlangt nach § 5 DDG
Anschrift, E-Mail und einen zweiten schnellen Kontaktweg, und Apple
verlangt fuer den Vertrieb in der EU seit 2025 die Trader-Angaben nach dem
Digital Services Act -- Name, Adresse, Telefon, E-Mail, oeffentlich auf der
App-Store-Seite.

Der Verantwortliche im Datenschutz steht jetzt fuer sich und verweist
nicht mehr weiter.

Co-Authored-By: Claude Opus 5 <noreply@anthropic.com>
</commit_message>
<xml_diff>
--- a/texte/SmartVoc-Texte-Deutsch_v3.docx
+++ b/texte/SmartVoc-Texte-Deutsch_v3.docx
@@ -6005,7 +6005,7 @@
           <w:sz w:val="21"/>
           <w:szCs w:val="21"/>
         </w:rPr>
-        <w:t xml:space="preserve">Du kannst Auskunft darüber verlangen, was über dich gespeichert ist, kannst es berichtigen lassen, und du kannst alles jederzeit selbst als Datei exportieren oder dein Konto vollständig löschen. Den Export findest du in den Einstellungen, das Löschen des Kontos im Kontofenster oben rechts. Beim Löschen verschwinden auch die Daten auf dem Server, und das lässt sich nicht rückgängig machen. Für alles andere genügt eine Nachricht an die im Impressum genannte Adresse.</w:t>
+        <w:t xml:space="preserve">Du kannst Auskunft darüber verlangen, was über dich gespeichert ist, kannst es berichtigen lassen, und du kannst alles jederzeit selbst als Datei exportieren oder dein Konto vollständig löschen. Den Export findest du in den Einstellungen, das Löschen des Kontos im Kontofenster oben rechts. Beim Löschen verschwinden auch die Daten auf dem Server, und das lässt sich nicht rückgängig machen. Für alles andere genügt eine Nachricht an support@smartvoc.app.</w:t>
       </w:r>
     </w:p>
     <w:p>
@@ -6160,16 +6160,7 @@
           <w:sz w:val="21"/>
           <w:szCs w:val="21"/>
         </w:rPr>
-        <w:t xml:space="preserve">Martin Keller, Schweiz. Fragen zum Datenschutz gehen an die im Impressum genannte Adresse.</w:t>
-      </w:r>
-    </w:p>
-    <w:p>
-      <w:pPr>
-        <w:pStyle w:val="Heading3"/>
-        <w:spacing w:after="120" w:before="260"/>
-      </w:pPr>
-      <w:r>
-        <w:t xml:space="preserve">Impressum</w:t>
+        <w:t xml:space="preserve">Martin Keller, Rebbergstrasse 7a, 8953 Dietikon, Schweiz.</w:t>
       </w:r>
     </w:p>
     <w:p>
@@ -6184,6 +6175,46 @@
           <w:szCs w:val="15"/>
         </w:rPr>
         <w:t xml:space="preserve">A-201</w:t>
+      </w:r>
+    </w:p>
+    <w:p>
+      <w:pPr>
+        <w:spacing w:after="60"/>
+      </w:pPr>
+      <w:r>
+        <w:rPr>
+          <w:rFonts w:ascii="Calibri" w:cs="Calibri" w:eastAsia="Calibri" w:hAnsi="Calibri"/>
+          <w:b w:val="false"/>
+          <w:bCs w:val="false"/>
+          <w:i w:val="false"/>
+          <w:iCs w:val="false"/>
+          <w:sz w:val="21"/>
+          <w:szCs w:val="21"/>
+        </w:rPr>
+        <w:t xml:space="preserve">Fragen zum Datenschutz: support@smartvoc.app, Telefon +41 79 822 36 75.</w:t>
+      </w:r>
+    </w:p>
+    <w:p>
+      <w:pPr>
+        <w:pStyle w:val="Heading3"/>
+        <w:spacing w:after="120" w:before="260"/>
+      </w:pPr>
+      <w:r>
+        <w:t xml:space="preserve">Impressum</w:t>
+      </w:r>
+    </w:p>
+    <w:p>
+      <w:pPr>
+        <w:spacing w:after="20" w:before="140"/>
+      </w:pPr>
+      <w:r>
+        <w:rPr>
+          <w:rFonts w:ascii="Consolas" w:cs="Consolas" w:eastAsia="Consolas" w:hAnsi="Consolas"/>
+          <w:color w:val="9A958B"/>
+          <w:sz w:val="15"/>
+          <w:szCs w:val="15"/>
+        </w:rPr>
+        <w:t xml:space="preserve">A-202</w:t>
       </w:r>
     </w:p>
     <w:p>
@@ -6214,7 +6245,7 @@
           <w:sz w:val="15"/>
           <w:szCs w:val="15"/>
         </w:rPr>
-        <w:t xml:space="preserve">A-202</w:t>
+        <w:t xml:space="preserve">A-203</w:t>
       </w:r>
     </w:p>
     <w:p>
@@ -6231,7 +6262,7 @@
           <w:sz w:val="21"/>
           <w:szCs w:val="21"/>
         </w:rPr>
-        <w:t xml:space="preserve">Martin Keller, Schweiz</w:t>
+        <w:t xml:space="preserve">Martin Keller</w:t>
       </w:r>
     </w:p>
     <w:p>
@@ -6245,7 +6276,100 @@
           <w:sz w:val="15"/>
           <w:szCs w:val="15"/>
         </w:rPr>
-        <w:t xml:space="preserve">A-203</w:t>
+        <w:t xml:space="preserve">A-204</w:t>
+      </w:r>
+    </w:p>
+    <w:p>
+      <w:pPr>
+        <w:spacing w:after="60"/>
+      </w:pPr>
+      <w:r>
+        <w:rPr>
+          <w:rFonts w:ascii="Calibri" w:cs="Calibri" w:eastAsia="Calibri" w:hAnsi="Calibri"/>
+          <w:b w:val="false"/>
+          <w:bCs w:val="false"/>
+          <w:i w:val="false"/>
+          <w:iCs w:val="false"/>
+          <w:sz w:val="21"/>
+          <w:szCs w:val="21"/>
+        </w:rPr>
+        <w:t xml:space="preserve">Rebbergstrasse 7a</w:t>
+      </w:r>
+    </w:p>
+    <w:p>
+      <w:pPr>
+        <w:spacing w:after="20" w:before="140"/>
+      </w:pPr>
+      <w:r>
+        <w:rPr>
+          <w:rFonts w:ascii="Consolas" w:cs="Consolas" w:eastAsia="Consolas" w:hAnsi="Consolas"/>
+          <w:color w:val="9A958B"/>
+          <w:sz w:val="15"/>
+          <w:szCs w:val="15"/>
+        </w:rPr>
+        <w:t xml:space="preserve">A-205</w:t>
+      </w:r>
+    </w:p>
+    <w:p>
+      <w:pPr>
+        <w:spacing w:after="60"/>
+      </w:pPr>
+      <w:r>
+        <w:rPr>
+          <w:rFonts w:ascii="Calibri" w:cs="Calibri" w:eastAsia="Calibri" w:hAnsi="Calibri"/>
+          <w:b w:val="false"/>
+          <w:bCs w:val="false"/>
+          <w:i w:val="false"/>
+          <w:iCs w:val="false"/>
+          <w:sz w:val="21"/>
+          <w:szCs w:val="21"/>
+        </w:rPr>
+        <w:t xml:space="preserve">8953 Dietikon</w:t>
+      </w:r>
+    </w:p>
+    <w:p>
+      <w:pPr>
+        <w:spacing w:after="20" w:before="140"/>
+      </w:pPr>
+      <w:r>
+        <w:rPr>
+          <w:rFonts w:ascii="Consolas" w:cs="Consolas" w:eastAsia="Consolas" w:hAnsi="Consolas"/>
+          <w:color w:val="9A958B"/>
+          <w:sz w:val="15"/>
+          <w:szCs w:val="15"/>
+        </w:rPr>
+        <w:t xml:space="preserve">A-206</w:t>
+      </w:r>
+    </w:p>
+    <w:p>
+      <w:pPr>
+        <w:spacing w:after="60"/>
+      </w:pPr>
+      <w:r>
+        <w:rPr>
+          <w:rFonts w:ascii="Calibri" w:cs="Calibri" w:eastAsia="Calibri" w:hAnsi="Calibri"/>
+          <w:b w:val="false"/>
+          <w:bCs w:val="false"/>
+          <w:i w:val="false"/>
+          <w:iCs w:val="false"/>
+          <w:sz w:val="21"/>
+          <w:szCs w:val="21"/>
+        </w:rPr>
+        <w:t xml:space="preserve">Schweiz</w:t>
+      </w:r>
+    </w:p>
+    <w:p>
+      <w:pPr>
+        <w:spacing w:after="20" w:before="140"/>
+      </w:pPr>
+      <w:r>
+        <w:rPr>
+          <w:rFonts w:ascii="Consolas" w:cs="Consolas" w:eastAsia="Consolas" w:hAnsi="Consolas"/>
+          <w:color w:val="9A958B"/>
+          <w:sz w:val="15"/>
+          <w:szCs w:val="15"/>
+        </w:rPr>
+        <w:t xml:space="preserve">A-207</w:t>
       </w:r>
     </w:p>
     <w:p>
@@ -6276,7 +6400,7 @@
           <w:sz w:val="15"/>
           <w:szCs w:val="15"/>
         </w:rPr>
-        <w:t xml:space="preserve">A-204</w:t>
+        <w:t xml:space="preserve">A-208</w:t>
       </w:r>
     </w:p>
     <w:p>
@@ -6293,7 +6417,7 @@
           <w:sz w:val="21"/>
           <w:szCs w:val="21"/>
         </w:rPr>
-        <w:t xml:space="preserve">Fragen, Fehler und Rückmeldungen gehen an die im App Store hinterlegte Adresse.</w:t>
+        <w:t xml:space="preserve">E-Mail: support@smartvoc.app</w:t>
       </w:r>
     </w:p>
     <w:p>
@@ -6307,7 +6431,69 @@
           <w:sz w:val="15"/>
           <w:szCs w:val="15"/>
         </w:rPr>
-        <w:t xml:space="preserve">A-205</w:t>
+        <w:t xml:space="preserve">A-209</w:t>
+      </w:r>
+    </w:p>
+    <w:p>
+      <w:pPr>
+        <w:spacing w:after="60"/>
+      </w:pPr>
+      <w:r>
+        <w:rPr>
+          <w:rFonts w:ascii="Calibri" w:cs="Calibri" w:eastAsia="Calibri" w:hAnsi="Calibri"/>
+          <w:b w:val="false"/>
+          <w:bCs w:val="false"/>
+          <w:i w:val="false"/>
+          <w:iCs w:val="false"/>
+          <w:sz w:val="21"/>
+          <w:szCs w:val="21"/>
+        </w:rPr>
+        <w:t xml:space="preserve">Telefon: +41 79 822 36 75</w:t>
+      </w:r>
+    </w:p>
+    <w:p>
+      <w:pPr>
+        <w:spacing w:after="20" w:before="140"/>
+      </w:pPr>
+      <w:r>
+        <w:rPr>
+          <w:rFonts w:ascii="Consolas" w:cs="Consolas" w:eastAsia="Consolas" w:hAnsi="Consolas"/>
+          <w:color w:val="9A958B"/>
+          <w:sz w:val="15"/>
+          <w:szCs w:val="15"/>
+        </w:rPr>
+        <w:t xml:space="preserve">A-210</w:t>
+      </w:r>
+    </w:p>
+    <w:p>
+      <w:pPr>
+        <w:spacing w:after="60"/>
+      </w:pPr>
+      <w:r>
+        <w:rPr>
+          <w:rFonts w:ascii="Calibri" w:cs="Calibri" w:eastAsia="Calibri" w:hAnsi="Calibri"/>
+          <w:b w:val="false"/>
+          <w:bCs w:val="false"/>
+          <w:i w:val="false"/>
+          <w:iCs w:val="false"/>
+          <w:sz w:val="21"/>
+          <w:szCs w:val="21"/>
+        </w:rPr>
+        <w:t xml:space="preserve">Fragen, Fehler und Rückmeldungen gehen an dieselbe Adresse.</w:t>
+      </w:r>
+    </w:p>
+    <w:p>
+      <w:pPr>
+        <w:spacing w:after="20" w:before="140"/>
+      </w:pPr>
+      <w:r>
+        <w:rPr>
+          <w:rFonts w:ascii="Consolas" w:cs="Consolas" w:eastAsia="Consolas" w:hAnsi="Consolas"/>
+          <w:color w:val="9A958B"/>
+          <w:sz w:val="15"/>
+          <w:szCs w:val="15"/>
+        </w:rPr>
+        <w:t xml:space="preserve">A-211</w:t>
       </w:r>
     </w:p>
     <w:p>
@@ -6338,7 +6524,7 @@
           <w:sz w:val="15"/>
           <w:szCs w:val="15"/>
         </w:rPr>
-        <w:t xml:space="preserve">A-206</w:t>
+        <w:t xml:space="preserve">A-212</w:t>
       </w:r>
     </w:p>
     <w:p>
@@ -6369,7 +6555,7 @@
           <w:sz w:val="15"/>
           <w:szCs w:val="15"/>
         </w:rPr>
-        <w:t xml:space="preserve">A-207</w:t>
+        <w:t xml:space="preserve">A-213</w:t>
       </w:r>
     </w:p>
     <w:p>
@@ -6400,7 +6586,7 @@
           <w:sz w:val="15"/>
           <w:szCs w:val="15"/>
         </w:rPr>
-        <w:t xml:space="preserve">A-208</w:t>
+        <w:t xml:space="preserve">A-214</w:t>
       </w:r>
     </w:p>
     <w:p>

</xml_diff>